<commit_message>
gozaresh az 1 added
</commit_message>
<xml_diff>
--- a/Az2/GozAz2.docx
+++ b/Az2/GozAz2.docx
@@ -250,7 +250,6 @@
           <w:rFonts w:cs="B Yekan"/>
           <w:sz w:val="20"/>
           <w:szCs w:val="20"/>
-          <w:rtl/>
           <w:lang w:bidi="fa-IR"/>
         </w:rPr>
       </w:pPr>
@@ -382,16 +381,61 @@
     </w:tbl>
     <w:p>
       <w:pPr>
+        <w:tabs>
+          <w:tab w:val="left" w:pos="2096"/>
+        </w:tabs>
+        <w:jc w:val="right"/>
+        <w:rPr>
+          <w:rFonts w:cs="B Yekan"/>
+          <w:b/>
+          <w:bCs/>
+          <w:rtl/>
+          <w:lang w:bidi="fa-IR"/>
+        </w:rPr>
+      </w:pPr>
+      <w:r>
+        <w:rPr>
+          <w:rFonts w:cs="B Yekan" w:hint="cs"/>
+          <w:b/>
+          <w:bCs/>
+          <w:rtl/>
+          <w:lang w:bidi="fa-IR"/>
+        </w:rPr>
+        <w:t>آزمایش اول:</w:t>
+      </w:r>
+    </w:p>
+    <w:p>
+      <w:pPr>
         <w:bidi/>
         <w:rPr>
           <w:rFonts w:cs="B Nazanin"/>
-          <w:rtl/>
-          <w:lang w:bidi="fa-IR"/>
-        </w:rPr>
-      </w:pPr>
-    </w:p>
-    <w:p>
-      <w:pPr>
+          <w:lang w:bidi="fa-IR"/>
+        </w:rPr>
+      </w:pPr>
+    </w:p>
+    <w:p>
+      <w:pPr>
+        <w:bidi/>
+        <w:rPr>
+          <w:rFonts w:cs="B Yekan"/>
+          <w:rtl/>
+          <w:lang w:bidi="fa-IR"/>
+        </w:rPr>
+      </w:pPr>
+      <w:r>
+        <w:rPr>
+          <w:rFonts w:cs="B Yekan" w:hint="cs"/>
+          <w:sz w:val="28"/>
+          <w:szCs w:val="28"/>
+          <w:rtl/>
+          <w:lang w:bidi="fa-IR"/>
+        </w:rPr>
+        <w:t>مقدمه و هدف آزمایش:</w:t>
+      </w:r>
+    </w:p>
+    <w:p>
+      <w:pPr>
+        <w:bidi/>
         <w:rPr>
           <w:rFonts w:cs="B Nazanin"/>
           <w:rtl/>
@@ -400,10 +444,483 @@
       </w:pPr>
       <w:r>
         <w:rPr>
+          <w:rFonts w:cs="B Nazanin" w:hint="cs"/>
+          <w:rtl/>
+          <w:lang w:bidi="fa-IR"/>
+        </w:rPr>
+        <w:t>هدف از انجام این آزمایش آشنایی با نحوه کارکرد شیفت رجیستر ها است.</w:t>
+      </w:r>
+    </w:p>
+    <w:p>
+      <w:pPr>
+        <w:bidi/>
+        <w:rPr>
           <w:rFonts w:cs="B Nazanin"/>
           <w:rtl/>
           <w:lang w:bidi="fa-IR"/>
         </w:rPr>
+      </w:pPr>
+    </w:p>
+    <w:p>
+      <w:pPr>
+        <w:bidi/>
+        <w:rPr>
+          <w:rFonts w:cs="B Yekan"/>
+          <w:sz w:val="28"/>
+          <w:szCs w:val="28"/>
+          <w:rtl/>
+          <w:lang w:bidi="fa-IR"/>
+        </w:rPr>
+      </w:pPr>
+      <w:r>
+        <w:rPr>
+          <w:rFonts w:cs="B Yekan" w:hint="cs"/>
+          <w:sz w:val="28"/>
+          <w:szCs w:val="28"/>
+          <w:rtl/>
+          <w:lang w:bidi="fa-IR"/>
+        </w:rPr>
+        <w:t>بخش اول:</w:t>
+      </w:r>
+    </w:p>
+    <w:p>
+      <w:pPr>
+        <w:bidi/>
+        <w:rPr>
+          <w:rFonts w:cs="B Yekan"/>
+          <w:sz w:val="28"/>
+          <w:szCs w:val="28"/>
+          <w:rtl/>
+          <w:lang w:bidi="fa-IR"/>
+        </w:rPr>
+      </w:pPr>
+      <w:r>
+        <w:rPr>
+          <w:rFonts w:cs="B Yekan" w:hint="cs"/>
+          <w:sz w:val="28"/>
+          <w:szCs w:val="28"/>
+          <w:rtl/>
+          <w:lang w:bidi="fa-IR"/>
+        </w:rPr>
+        <w:t>ساخت شیفت رجیستر چهار بیتی با قابلیت بارگذاری موازی</w:t>
+      </w:r>
+      <w:r>
+        <w:rPr>
+          <w:rFonts w:cs="B Yekan" w:hint="cs"/>
+          <w:sz w:val="28"/>
+          <w:szCs w:val="28"/>
+          <w:rtl/>
+          <w:lang w:bidi="fa-IR"/>
+        </w:rPr>
+        <w:t>:</w:t>
+      </w:r>
+    </w:p>
+    <w:p>
+      <w:pPr>
+        <w:bidi/>
+        <w:rPr>
+          <w:rFonts w:cs="B Yekan"/>
+          <w:sz w:val="28"/>
+          <w:szCs w:val="28"/>
+          <w:rtl/>
+          <w:lang w:bidi="fa-IR"/>
+        </w:rPr>
+      </w:pPr>
+    </w:p>
+    <w:p>
+      <w:pPr>
+        <w:bidi/>
+        <w:rPr>
+          <w:rFonts w:cs="B Yekan"/>
+          <w:b/>
+          <w:bCs/>
+          <w:rtl/>
+          <w:lang w:bidi="fa-IR"/>
+        </w:rPr>
+      </w:pPr>
+      <w:r>
+        <w:rPr>
+          <w:rFonts w:cs="B Yekan" w:hint="cs"/>
+          <w:b/>
+          <w:bCs/>
+          <w:rtl/>
+          <w:lang w:bidi="fa-IR"/>
+        </w:rPr>
+        <w:t>قطعات استفاده‌شده:</w:t>
+      </w:r>
+    </w:p>
+    <w:p>
+      <w:pPr>
+        <w:pStyle w:val="ListParagraph"/>
+        <w:numPr>
+          <w:ilvl w:val="0"/>
+          <w:numId w:val="4"/>
+        </w:numPr>
+        <w:bidi/>
+        <w:rPr>
+          <w:rFonts w:cs="B Nazanin"/>
+          <w:lang w:bidi="fa-IR"/>
+        </w:rPr>
+      </w:pPr>
+      <w:r>
+        <w:rPr>
+          <w:rFonts w:cs="B Nazanin" w:hint="cs"/>
+          <w:rtl/>
+          <w:lang w:bidi="fa-IR"/>
+        </w:rPr>
+        <w:t xml:space="preserve">هشت گیت </w:t>
+      </w:r>
+      <w:r>
+        <w:rPr>
+          <w:rFonts w:cs="B Nazanin"/>
+          <w:lang w:bidi="fa-IR"/>
+        </w:rPr>
+        <w:t>AND</w:t>
+      </w:r>
+    </w:p>
+    <w:p>
+      <w:pPr>
+        <w:pStyle w:val="ListParagraph"/>
+        <w:numPr>
+          <w:ilvl w:val="0"/>
+          <w:numId w:val="4"/>
+        </w:numPr>
+        <w:bidi/>
+        <w:rPr>
+          <w:rFonts w:cs="B Nazanin"/>
+          <w:lang w:bidi="fa-IR"/>
+        </w:rPr>
+      </w:pPr>
+      <w:r>
+        <w:rPr>
+          <w:rFonts w:cs="B Nazanin" w:hint="cs"/>
+          <w:rtl/>
+          <w:lang w:bidi="fa-IR"/>
+        </w:rPr>
+        <w:t xml:space="preserve">چهار گیت </w:t>
+      </w:r>
+      <w:r>
+        <w:rPr>
+          <w:rFonts w:cs="B Nazanin"/>
+          <w:lang w:bidi="fa-IR"/>
+        </w:rPr>
+        <w:t>OR</w:t>
+      </w:r>
+    </w:p>
+    <w:p>
+      <w:pPr>
+        <w:pStyle w:val="ListParagraph"/>
+        <w:numPr>
+          <w:ilvl w:val="0"/>
+          <w:numId w:val="4"/>
+        </w:numPr>
+        <w:bidi/>
+        <w:rPr>
+          <w:rFonts w:cs="B Nazanin"/>
+          <w:lang w:bidi="fa-IR"/>
+        </w:rPr>
+      </w:pPr>
+      <w:r>
+        <w:rPr>
+          <w:rFonts w:cs="B Nazanin" w:hint="cs"/>
+          <w:rtl/>
+          <w:lang w:bidi="fa-IR"/>
+        </w:rPr>
+        <w:t xml:space="preserve">چهار فلیپ فلاپ نوع </w:t>
+      </w:r>
+      <w:r>
+        <w:rPr>
+          <w:rFonts w:cs="B Nazanin"/>
+          <w:lang w:bidi="fa-IR"/>
+        </w:rPr>
+        <w:t>D</w:t>
+      </w:r>
+    </w:p>
+    <w:p>
+      <w:pPr>
+        <w:bidi/>
+        <w:ind w:left="360"/>
+        <w:rPr>
+          <w:rFonts w:cs="B Nazanin"/>
+          <w:rtl/>
+          <w:lang w:bidi="fa-IR"/>
+        </w:rPr>
+      </w:pPr>
+    </w:p>
+    <w:p>
+      <w:pPr>
+        <w:bidi/>
+        <w:rPr>
+          <w:rFonts w:cs="B Yekan"/>
+          <w:sz w:val="28"/>
+          <w:szCs w:val="28"/>
+          <w:rtl/>
+          <w:lang w:bidi="fa-IR"/>
+        </w:rPr>
+      </w:pPr>
+      <w:r>
+        <w:rPr>
+          <w:rFonts w:cs="B Yekan" w:hint="cs"/>
+          <w:sz w:val="28"/>
+          <w:szCs w:val="28"/>
+          <w:rtl/>
+          <w:lang w:bidi="fa-IR"/>
+        </w:rPr>
+        <w:t>شرح آزمایش:</w:t>
+      </w:r>
+    </w:p>
+    <w:p>
+      <w:pPr>
+        <w:bidi/>
+        <w:rPr>
+          <w:rFonts w:cs="B Nazanin"/>
+          <w:rtl/>
+          <w:lang w:bidi="fa-IR"/>
+        </w:rPr>
+      </w:pPr>
+      <w:r>
+        <w:rPr>
+          <w:rFonts w:cs="B Nazanin" w:hint="cs"/>
+          <w:rtl/>
+          <w:lang w:bidi="fa-IR"/>
+        </w:rPr>
+        <w:t>هدف طراحی شیفت رجیستری ب</w:t>
+      </w:r>
+      <w:r>
+        <w:rPr>
+          <w:rFonts w:cs="B Nazanin" w:hint="cs"/>
+          <w:rtl/>
+          <w:lang w:bidi="fa-IR"/>
+        </w:rPr>
+        <w:t xml:space="preserve">ا بارگذاری موازی و با قابلیت کنترل با بیت کنترلی است. بیت کنترلی را با استفاده از یک گیت </w:t>
+      </w:r>
+      <w:r>
+        <w:rPr>
+          <w:rFonts w:cs="B Nazanin"/>
+          <w:lang w:bidi="fa-IR"/>
+        </w:rPr>
+        <w:t>AND</w:t>
+      </w:r>
+      <w:r>
+        <w:rPr>
+          <w:rFonts w:cs="B Nazanin" w:hint="cs"/>
+          <w:rtl/>
+          <w:lang w:bidi="fa-IR"/>
+        </w:rPr>
+        <w:t xml:space="preserve"> به ورودی های </w:t>
+      </w:r>
+      <w:r>
+        <w:rPr>
+          <w:rFonts w:cs="B Nazanin"/>
+          <w:lang w:bidi="fa-IR"/>
+        </w:rPr>
+        <w:t>A</w:t>
+      </w:r>
+      <w:r>
+        <w:rPr>
+          <w:rFonts w:cs="B Nazanin" w:hint="cs"/>
+          <w:rtl/>
+          <w:lang w:bidi="fa-IR"/>
+        </w:rPr>
+        <w:t xml:space="preserve"> تا </w:t>
+      </w:r>
+      <w:r>
+        <w:rPr>
+          <w:rFonts w:cs="B Nazanin"/>
+          <w:lang w:bidi="fa-IR"/>
+        </w:rPr>
+        <w:t>D</w:t>
+      </w:r>
+      <w:r>
+        <w:rPr>
+          <w:rFonts w:cs="B Nazanin" w:hint="cs"/>
+          <w:rtl/>
+          <w:lang w:bidi="fa-IR"/>
+        </w:rPr>
+        <w:t xml:space="preserve"> و متمم این بیت را به گیت </w:t>
+      </w:r>
+      <w:r>
+        <w:rPr>
+          <w:rFonts w:cs="B Nazanin"/>
+          <w:lang w:bidi="fa-IR"/>
+        </w:rPr>
+        <w:t>AND</w:t>
+      </w:r>
+      <w:r>
+        <w:rPr>
+          <w:rFonts w:cs="B Nazanin" w:hint="cs"/>
+          <w:rtl/>
+          <w:lang w:bidi="fa-IR"/>
+        </w:rPr>
+        <w:t xml:space="preserve"> دیگری متصل می کنیم</w:t>
+      </w:r>
+      <w:r>
+        <w:rPr>
+          <w:rFonts w:cs="B Nazanin" w:hint="cs"/>
+          <w:rtl/>
+          <w:lang w:bidi="fa-IR"/>
+        </w:rPr>
+        <w:t xml:space="preserve"> ،</w:t>
+      </w:r>
+      <w:r>
+        <w:rPr>
+          <w:rFonts w:cs="B Nazanin" w:hint="cs"/>
+          <w:rtl/>
+          <w:lang w:bidi="fa-IR"/>
+        </w:rPr>
+        <w:t xml:space="preserve">  دلیل این کار این است که در هر لحظه فقط یکی از گیت های </w:t>
+      </w:r>
+      <w:r>
+        <w:rPr>
+          <w:rFonts w:cs="B Nazanin"/>
+          <w:lang w:bidi="fa-IR"/>
+        </w:rPr>
+        <w:t>AND</w:t>
+      </w:r>
+      <w:r>
+        <w:rPr>
+          <w:rFonts w:cs="B Nazanin" w:hint="cs"/>
+          <w:rtl/>
+          <w:lang w:bidi="fa-IR"/>
+        </w:rPr>
+        <w:t xml:space="preserve"> متصل به یک گیت </w:t>
+      </w:r>
+      <w:r>
+        <w:rPr>
+          <w:rFonts w:cs="B Nazanin"/>
+          <w:lang w:bidi="fa-IR"/>
+        </w:rPr>
+        <w:t>OR</w:t>
+      </w:r>
+      <w:r>
+        <w:rPr>
+          <w:rFonts w:cs="B Nazanin" w:hint="cs"/>
+          <w:rtl/>
+          <w:lang w:bidi="fa-IR"/>
+        </w:rPr>
+        <w:t xml:space="preserve"> بتوانند یک باشند و هر دو با هم مقدار یک نگیرند ، این موضوع سبب می</w:t>
+      </w:r>
+      <w:r>
+        <w:rPr>
+          <w:rFonts w:cs="B Nazanin" w:hint="cs"/>
+          <w:rtl/>
+          <w:lang w:bidi="fa-IR"/>
+        </w:rPr>
+        <w:t xml:space="preserve"> </w:t>
+      </w:r>
+      <w:r>
+        <w:rPr>
+          <w:rFonts w:cs="B Nazanin" w:hint="cs"/>
+          <w:rtl/>
+          <w:lang w:bidi="fa-IR"/>
+        </w:rPr>
+        <w:t xml:space="preserve">شود که در هر لحظه فقط یکی از کار های </w:t>
+      </w:r>
+      <w:r>
+        <w:rPr>
+          <w:rFonts w:cs="B Nazanin" w:hint="cs"/>
+          <w:rtl/>
+          <w:lang w:bidi="fa-IR"/>
+        </w:rPr>
+        <w:t>بارگذاری و یا شیفت اتفاق بیوفتند و مدار بدین گونه کنترل خواهد شد.</w:t>
+      </w:r>
+    </w:p>
+    <w:p>
+      <w:pPr>
+        <w:bidi/>
+        <w:rPr>
+          <w:rFonts w:cs="B Nazanin" w:hint="cs"/>
+          <w:rtl/>
+          <w:lang w:bidi="fa-IR"/>
+        </w:rPr>
+      </w:pPr>
+      <w:r>
+        <w:rPr>
+          <w:rFonts w:cs="B Nazanin" w:hint="cs"/>
+          <w:rtl/>
+          <w:lang w:bidi="fa-IR"/>
+        </w:rPr>
+        <w:t xml:space="preserve">پس هرگاه بیت کنترلی یک باشد ، گیت های </w:t>
+      </w:r>
+      <w:r>
+        <w:rPr>
+          <w:rFonts w:cs="B Nazanin"/>
+          <w:lang w:bidi="fa-IR"/>
+        </w:rPr>
+        <w:t>AND</w:t>
+      </w:r>
+      <w:r>
+        <w:rPr>
+          <w:rFonts w:cs="B Nazanin" w:hint="cs"/>
+          <w:rtl/>
+          <w:lang w:bidi="fa-IR"/>
+        </w:rPr>
+        <w:t xml:space="preserve"> بالایی فعال می شوند و بارگذاری انجام می شود و هرگاه بیت کنترلی صفر باشد گیت های </w:t>
+      </w:r>
+      <w:r>
+        <w:rPr>
+          <w:rFonts w:cs="B Nazanin"/>
+          <w:lang w:bidi="fa-IR"/>
+        </w:rPr>
+        <w:t>AND</w:t>
+      </w:r>
+      <w:r>
+        <w:rPr>
+          <w:rFonts w:cs="B Nazanin" w:hint="cs"/>
+          <w:rtl/>
+          <w:lang w:bidi="fa-IR"/>
+        </w:rPr>
+        <w:t xml:space="preserve"> پایین فعال شده و ورودی های فلیپ فلاپ های قبلی وارد </w:t>
+      </w:r>
+      <w:r>
+        <w:rPr>
+          <w:rFonts w:cs="B Nazanin" w:hint="cs"/>
+          <w:rtl/>
+          <w:lang w:bidi="fa-IR"/>
+        </w:rPr>
+        <w:t xml:space="preserve">فلیپ فلاپ بعدی می شوند و ورودی </w:t>
+      </w:r>
+      <w:proofErr w:type="spellStart"/>
+      <w:r>
+        <w:rPr>
+          <w:rFonts w:cs="B Nazanin"/>
+          <w:lang w:bidi="fa-IR"/>
+        </w:rPr>
+        <w:t>S_in</w:t>
+      </w:r>
+      <w:proofErr w:type="spellEnd"/>
+      <w:r>
+        <w:rPr>
+          <w:rFonts w:cs="B Nazanin" w:hint="cs"/>
+          <w:rtl/>
+          <w:lang w:bidi="fa-IR"/>
+        </w:rPr>
+        <w:t xml:space="preserve"> </w:t>
+      </w:r>
+      <w:r>
+        <w:rPr>
+          <w:rFonts w:cs="B Nazanin" w:hint="cs"/>
+          <w:rtl/>
+          <w:lang w:bidi="fa-IR"/>
+        </w:rPr>
+        <w:t>نیز وارد فلیپ فلاپ اول می شود و شیفت اتفاق می افتد. (شکل 1-1)</w:t>
+      </w:r>
+    </w:p>
+    <w:p>
+      <w:pPr>
+        <w:jc w:val="right"/>
+        <w:rPr>
+          <w:rFonts w:cs="B Nazanin"/>
+          <w:rtl/>
+          <w:lang w:bidi="fa-IR"/>
+        </w:rPr>
+      </w:pPr>
+      <w:r>
+        <w:rPr>
+          <w:rFonts w:cs="B Nazanin"/>
+          <w:rtl/>
+          <w:lang w:bidi="fa-IR"/>
+        </w:rPr>
         <w:br w:type="page"/>
       </w:r>
     </w:p>
@@ -411,28 +928,900 @@
       <w:pPr>
         <w:bidi/>
         <w:rPr>
+          <w:rFonts w:cs="B Nazanin" w:hint="cs"/>
+          <w:rtl/>
+          <w:lang w:bidi="fa-IR"/>
+        </w:rPr>
+      </w:pPr>
+      <w:r>
+        <w:rPr>
+          <w:noProof/>
+        </w:rPr>
+        <w:lastRenderedPageBreak/>
+        <mc:AlternateContent>
+          <mc:Choice Requires="wps">
+            <w:drawing>
+              <wp:anchor distT="0" distB="0" distL="114300" distR="114300" simplePos="0" relativeHeight="251660288" behindDoc="0" locked="0" layoutInCell="1" allowOverlap="1" wp14:anchorId="5C73F68E" wp14:editId="4E0413CF">
+                <wp:simplePos x="0" y="0"/>
+                <wp:positionH relativeFrom="column">
+                  <wp:posOffset>828675</wp:posOffset>
+                </wp:positionH>
+                <wp:positionV relativeFrom="paragraph">
+                  <wp:posOffset>3267075</wp:posOffset>
+                </wp:positionV>
+                <wp:extent cx="4279900" cy="635"/>
+                <wp:effectExtent l="0" t="0" r="0" b="0"/>
+                <wp:wrapSquare wrapText="bothSides"/>
+                <wp:docPr id="354656472" name="Text Box 1"/>
+                <wp:cNvGraphicFramePr/>
+                <a:graphic xmlns:a="http://schemas.openxmlformats.org/drawingml/2006/main">
+                  <a:graphicData uri="http://schemas.microsoft.com/office/word/2010/wordprocessingShape">
+                    <wps:wsp>
+                      <wps:cNvSpPr txBox="1"/>
+                      <wps:spPr>
+                        <a:xfrm>
+                          <a:off x="0" y="0"/>
+                          <a:ext cx="4279900" cy="635"/>
+                        </a:xfrm>
+                        <a:prstGeom prst="rect">
+                          <a:avLst/>
+                        </a:prstGeom>
+                        <a:solidFill>
+                          <a:prstClr val="white"/>
+                        </a:solidFill>
+                        <a:ln>
+                          <a:noFill/>
+                        </a:ln>
+                      </wps:spPr>
+                      <wps:txbx>
+                        <w:txbxContent>
+                          <w:p>
+                            <w:pPr>
+                              <w:pStyle w:val="Caption"/>
+                              <w:bidi/>
+                              <w:jc w:val="center"/>
+                              <w:rPr>
+                                <w:noProof/>
+                              </w:rPr>
+                            </w:pPr>
+                            <w:r>
+                              <w:rPr>
+                                <w:rFonts w:hint="cs"/>
+                                <w:rtl/>
+                              </w:rPr>
+                              <w:t>شکل</w:t>
+                            </w:r>
+                            <w:r>
+                              <w:rPr>
+                                <w:rtl/>
+                              </w:rPr>
+                              <w:t xml:space="preserve"> 1-</w:t>
+                            </w:r>
+                            <w:r>
+                              <w:rPr>
+                                <w:rFonts w:hint="cs"/>
+                                <w:rtl/>
+                                <w:lang w:bidi="fa-IR"/>
+                              </w:rPr>
+                              <w:t xml:space="preserve">1 </w:t>
+                            </w:r>
+                            <w:r>
+                              <w:rPr>
+                                <w:rFonts w:hint="cs"/>
+                                <w:rtl/>
+                              </w:rPr>
+                              <w:t xml:space="preserve"> ساخت مدار شیفت رجیستر با نرم افزار </w:t>
+                            </w:r>
+                            <w:r>
+                              <w:t>Logisim</w:t>
+                            </w:r>
+                          </w:p>
+                        </w:txbxContent>
+                      </wps:txbx>
+                      <wps:bodyPr rot="0" spcFirstLastPara="0" vertOverflow="overflow" horzOverflow="overflow" vert="horz" wrap="square" lIns="0" tIns="0" rIns="0" bIns="0" numCol="1" spcCol="0" rtlCol="0" fromWordArt="0" anchor="t" anchorCtr="0" forceAA="0" compatLnSpc="1">
+                        <a:prstTxWarp prst="textNoShape">
+                          <a:avLst/>
+                        </a:prstTxWarp>
+                        <a:spAutoFit/>
+                      </wps:bodyPr>
+                    </wps:wsp>
+                  </a:graphicData>
+                </a:graphic>
+              </wp:anchor>
+            </w:drawing>
+          </mc:Choice>
+          <mc:Fallback>
+            <w:pict>
+              <v:shapetype w14:anchorId="5C73F68E" id="_x0000_t202" coordsize="21600,21600" o:spt="202" path="m,l,21600r21600,l21600,xe">
+                <v:stroke joinstyle="miter"/>
+                <v:path gradientshapeok="t" o:connecttype="rect"/>
+              </v:shapetype>
+              <v:shape id="Text Box 1" o:spid="_x0000_s1026" type="#_x0000_t202" style="position:absolute;left:0;text-align:left;margin-left:65.25pt;margin-top:257.25pt;width:337pt;height:.05pt;z-index:251660288;visibility:visible;mso-wrap-style:square;mso-wrap-distance-left:9pt;mso-wrap-distance-top:0;mso-wrap-distance-right:9pt;mso-wrap-distance-bottom:0;mso-position-horizontal:absolute;mso-position-horizontal-relative:text;mso-position-vertical:absolute;mso-position-vertical-relative:text;v-text-anchor:top" o:gfxdata="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" stroked="f">
+                <v:textbox style="mso-fit-shape-to-text:t" inset="0,0,0,0">
+                  <w:txbxContent>
+                    <w:p>
+                      <w:pPr>
+                        <w:pStyle w:val="Caption"/>
+                        <w:bidi/>
+                        <w:jc w:val="center"/>
+                        <w:rPr>
+                          <w:noProof/>
+                        </w:rPr>
+                      </w:pPr>
+                      <w:r>
+                        <w:rPr>
+                          <w:rFonts w:hint="cs"/>
+                          <w:rtl/>
+                        </w:rPr>
+                        <w:t>شکل</w:t>
+                      </w:r>
+                      <w:r>
+                        <w:rPr>
+                          <w:rtl/>
+                        </w:rPr>
+                        <w:t xml:space="preserve"> 1-</w:t>
+                      </w:r>
+                      <w:r>
+                        <w:rPr>
+                          <w:rFonts w:hint="cs"/>
+                          <w:rtl/>
+                          <w:lang w:bidi="fa-IR"/>
+                        </w:rPr>
+                        <w:t xml:space="preserve">1 </w:t>
+                      </w:r>
+                      <w:r>
+                        <w:rPr>
+                          <w:rFonts w:hint="cs"/>
+                          <w:rtl/>
+                        </w:rPr>
+                        <w:t xml:space="preserve"> ساخت مدار شیفت رجیستر با نرم افزار </w:t>
+                      </w:r>
+                      <w:r>
+                        <w:t>Logisim</w:t>
+                      </w:r>
+                    </w:p>
+                  </w:txbxContent>
+                </v:textbox>
+                <w10:wrap type="square"/>
+              </v:shape>
+            </w:pict>
+          </mc:Fallback>
+        </mc:AlternateContent>
+      </w:r>
+      <w:r>
+        <w:rPr>
+          <w:noProof/>
+        </w:rPr>
+        <w:drawing>
+          <wp:anchor distT="0" distB="0" distL="114300" distR="114300" simplePos="0" relativeHeight="251658240" behindDoc="0" locked="0" layoutInCell="1" allowOverlap="1" wp14:anchorId="6AFAD642" wp14:editId="6BA29886">
+            <wp:simplePos x="0" y="0"/>
+            <wp:positionH relativeFrom="margin">
+              <wp:align>center</wp:align>
+            </wp:positionH>
+            <wp:positionV relativeFrom="paragraph">
+              <wp:posOffset>0</wp:posOffset>
+            </wp:positionV>
+            <wp:extent cx="4279900" cy="3209925"/>
+            <wp:effectExtent l="0" t="0" r="6350" b="9525"/>
+            <wp:wrapSquare wrapText="bothSides"/>
+            <wp:docPr id="1578674269" name="Picture 1"/>
+            <wp:cNvGraphicFramePr>
+              <a:graphicFrameLocks xmlns:a="http://schemas.openxmlformats.org/drawingml/2006/main" noChangeAspect="1"/>
+            </wp:cNvGraphicFramePr>
+            <a:graphic xmlns:a="http://schemas.openxmlformats.org/drawingml/2006/main">
+              <a:graphicData uri="http://schemas.openxmlformats.org/drawingml/2006/picture">
+                <pic:pic xmlns:pic="http://schemas.openxmlformats.org/drawingml/2006/picture">
+                  <pic:nvPicPr>
+                    <pic:cNvPr id="1578674269" name="Picture 1578674269"/>
+                    <pic:cNvPicPr/>
+                  </pic:nvPicPr>
+                  <pic:blipFill>
+                    <a:blip r:embed="rId8" cstate="print">
+                      <a:extLst>
+                        <a:ext uri="{28A0092B-C50C-407E-A947-70E740481C1C}">
+                          <a14:useLocalDpi xmlns:a14="http://schemas.microsoft.com/office/drawing/2010/main" val="0"/>
+                        </a:ext>
+                      </a:extLst>
+                    </a:blip>
+                    <a:stretch>
+                      <a:fillRect/>
+                    </a:stretch>
+                  </pic:blipFill>
+                  <pic:spPr>
+                    <a:xfrm>
+                      <a:off x="0" y="0"/>
+                      <a:ext cx="4279900" cy="3209925"/>
+                    </a:xfrm>
+                    <a:prstGeom prst="rect">
+                      <a:avLst/>
+                    </a:prstGeom>
+                  </pic:spPr>
+                </pic:pic>
+              </a:graphicData>
+            </a:graphic>
+            <wp14:sizeRelH relativeFrom="margin">
+              <wp14:pctWidth>0</wp14:pctWidth>
+            </wp14:sizeRelH>
+            <wp14:sizeRelV relativeFrom="margin">
+              <wp14:pctHeight>0</wp14:pctHeight>
+            </wp14:sizeRelV>
+          </wp:anchor>
+        </w:drawing>
+      </w:r>
+    </w:p>
+    <w:p>
+      <w:pPr>
+        <w:rPr>
+          <w:lang w:bidi="fa-IR"/>
+        </w:rPr>
+      </w:pPr>
+    </w:p>
+    <w:p>
+      <w:pPr>
+        <w:rPr>
+          <w:lang w:bidi="fa-IR"/>
+        </w:rPr>
+      </w:pPr>
+    </w:p>
+    <w:p>
+      <w:pPr>
+        <w:rPr>
+          <w:lang w:bidi="fa-IR"/>
+        </w:rPr>
+      </w:pPr>
+    </w:p>
+    <w:p>
+      <w:pPr>
+        <w:rPr>
+          <w:lang w:bidi="fa-IR"/>
+        </w:rPr>
+      </w:pPr>
+    </w:p>
+    <w:p>
+      <w:pPr>
+        <w:rPr>
+          <w:lang w:bidi="fa-IR"/>
+        </w:rPr>
+      </w:pPr>
+    </w:p>
+    <w:p>
+      <w:pPr>
+        <w:rPr>
+          <w:lang w:bidi="fa-IR"/>
+        </w:rPr>
+      </w:pPr>
+    </w:p>
+    <w:p>
+      <w:pPr>
+        <w:rPr>
+          <w:lang w:bidi="fa-IR"/>
+        </w:rPr>
+      </w:pPr>
+    </w:p>
+    <w:p>
+      <w:pPr>
+        <w:rPr>
+          <w:lang w:bidi="fa-IR"/>
+        </w:rPr>
+      </w:pPr>
+    </w:p>
+    <w:p>
+      <w:pPr>
+        <w:rPr>
+          <w:lang w:bidi="fa-IR"/>
+        </w:rPr>
+      </w:pPr>
+    </w:p>
+    <w:p>
+      <w:pPr>
+        <w:rPr>
+          <w:lang w:bidi="fa-IR"/>
+        </w:rPr>
+      </w:pPr>
+    </w:p>
+    <w:p>
+      <w:pPr>
+        <w:rPr>
+          <w:lang w:bidi="fa-IR"/>
+        </w:rPr>
+      </w:pPr>
+    </w:p>
+    <w:p>
+      <w:pPr>
+        <w:bidi/>
+        <w:rPr>
+          <w:rFonts w:cs="B Yekan"/>
+          <w:sz w:val="28"/>
+          <w:szCs w:val="28"/>
+          <w:rtl/>
+          <w:lang w:bidi="fa-IR"/>
+        </w:rPr>
+      </w:pPr>
+      <w:r>
+        <w:rPr>
+          <w:rFonts w:cs="B Yekan" w:hint="cs"/>
+          <w:sz w:val="28"/>
+          <w:szCs w:val="28"/>
+          <w:rtl/>
+          <w:lang w:bidi="fa-IR"/>
+        </w:rPr>
+        <w:t xml:space="preserve">بخش </w:t>
+      </w:r>
+      <w:r>
+        <w:rPr>
+          <w:rFonts w:cs="B Yekan" w:hint="cs"/>
+          <w:sz w:val="28"/>
+          <w:szCs w:val="28"/>
+          <w:rtl/>
+          <w:lang w:bidi="fa-IR"/>
+        </w:rPr>
+        <w:t>دوم</w:t>
+      </w:r>
+      <w:r>
+        <w:rPr>
+          <w:rFonts w:cs="B Yekan" w:hint="cs"/>
+          <w:sz w:val="28"/>
+          <w:szCs w:val="28"/>
+          <w:rtl/>
+          <w:lang w:bidi="fa-IR"/>
+        </w:rPr>
+        <w:t>:</w:t>
+      </w:r>
+    </w:p>
+    <w:p>
+      <w:pPr>
+        <w:bidi/>
+        <w:rPr>
+          <w:rFonts w:cs="B Yekan"/>
+          <w:sz w:val="28"/>
+          <w:szCs w:val="28"/>
+          <w:rtl/>
+          <w:lang w:bidi="fa-IR"/>
+        </w:rPr>
+      </w:pPr>
+      <w:r>
+        <w:rPr>
+          <w:rFonts w:cs="B Yekan" w:hint="cs"/>
+          <w:sz w:val="28"/>
+          <w:szCs w:val="28"/>
+          <w:rtl/>
+          <w:lang w:bidi="fa-IR"/>
+        </w:rPr>
+        <w:t>ذخیره مقدار 1010 در شیفت رجیستر با ورودی های مناسب</w:t>
+      </w:r>
+      <w:r>
+        <w:rPr>
+          <w:rFonts w:cs="B Yekan" w:hint="cs"/>
+          <w:sz w:val="28"/>
+          <w:szCs w:val="28"/>
+          <w:rtl/>
+          <w:lang w:bidi="fa-IR"/>
+        </w:rPr>
+        <w:t>:</w:t>
+      </w:r>
+    </w:p>
+    <w:p>
+      <w:pPr>
+        <w:bidi/>
+        <w:rPr>
+          <w:rFonts w:cs="B Nazanin" w:hint="cs"/>
+          <w:rtl/>
+          <w:lang w:bidi="fa-IR"/>
+        </w:rPr>
+      </w:pPr>
+      <w:r>
+        <w:rPr>
+          <w:rFonts w:cs="B Nazanin" w:hint="cs"/>
+          <w:rtl/>
+          <w:lang w:bidi="fa-IR"/>
+        </w:rPr>
+        <w:t xml:space="preserve">برای ذخیره داده ها در شیفت رجیستر باید بیت کنترلی یک باشد و </w:t>
+      </w:r>
+      <w:r>
+        <w:rPr>
           <w:rFonts w:cs="B Nazanin"/>
-          <w:rtl/>
-          <w:lang w:bidi="fa-IR"/>
-        </w:rPr>
-      </w:pPr>
-    </w:p>
-    <w:p>
-      <w:pPr>
-        <w:rPr>
-          <w:lang w:bidi="fa-IR"/>
-        </w:rPr>
-      </w:pPr>
-    </w:p>
-    <w:p>
+          <w:lang w:bidi="fa-IR"/>
+        </w:rPr>
+        <w:t>ABCD</w:t>
+      </w:r>
+      <w:r>
+        <w:rPr>
+          <w:rFonts w:cs="B Nazanin" w:hint="cs"/>
+          <w:rtl/>
+          <w:lang w:bidi="fa-IR"/>
+        </w:rPr>
+        <w:t xml:space="preserve"> را به ترتیب برابر </w:t>
+      </w:r>
+      <w:r>
+        <w:rPr>
+          <w:rFonts w:cs="B Nazanin"/>
+          <w:lang w:bidi="fa-IR"/>
+        </w:rPr>
+        <w:t>1010</w:t>
+      </w:r>
+      <w:r>
+        <w:rPr>
+          <w:rFonts w:cs="B Nazanin" w:hint="cs"/>
+          <w:rtl/>
+          <w:lang w:bidi="fa-IR"/>
+        </w:rPr>
+        <w:t xml:space="preserve"> قرار می دهیم.</w:t>
+      </w:r>
+      <w:r>
+        <w:rPr>
+          <w:rFonts w:cs="B Nazanin" w:hint="cs"/>
+          <w:rtl/>
+          <w:lang w:bidi="fa-IR"/>
+        </w:rPr>
+        <w:t xml:space="preserve"> سپس با یکبار فشردن دکمه ساعت ، مقادیر در فلیپ فلاپ ها ذخیره می شوند.</w:t>
+      </w:r>
+      <w:r>
+        <w:rPr>
+          <w:rFonts w:cs="B Nazanin" w:hint="cs"/>
+          <w:rtl/>
+          <w:lang w:bidi="fa-IR"/>
+        </w:rPr>
+        <w:t>(شکل 2-1)</w:t>
+      </w:r>
+    </w:p>
+    <w:p>
+      <w:pPr>
+        <w:keepNext/>
+        <w:jc w:val="center"/>
+      </w:pPr>
+      <w:r>
+        <w:rPr>
+          <w:noProof/>
+          <w:lang w:bidi="fa-IR"/>
+        </w:rPr>
+        <w:drawing>
+          <wp:inline distT="0" distB="0" distL="0" distR="0" wp14:anchorId="086FC0CE" wp14:editId="71FEEA9E">
+            <wp:extent cx="2952750" cy="2349581"/>
+            <wp:effectExtent l="0" t="0" r="0" b="0"/>
+            <wp:docPr id="1815617865" name="Picture 2"/>
+            <wp:cNvGraphicFramePr>
+              <a:graphicFrameLocks xmlns:a="http://schemas.openxmlformats.org/drawingml/2006/main" noChangeAspect="1"/>
+            </wp:cNvGraphicFramePr>
+            <a:graphic xmlns:a="http://schemas.openxmlformats.org/drawingml/2006/main">
+              <a:graphicData uri="http://schemas.openxmlformats.org/drawingml/2006/picture">
+                <pic:pic xmlns:pic="http://schemas.openxmlformats.org/drawingml/2006/picture">
+                  <pic:nvPicPr>
+                    <pic:cNvPr id="1815617865" name="Picture 1815617865"/>
+                    <pic:cNvPicPr/>
+                  </pic:nvPicPr>
+                  <pic:blipFill>
+                    <a:blip r:embed="rId9" cstate="print">
+                      <a:extLst>
+                        <a:ext uri="{28A0092B-C50C-407E-A947-70E740481C1C}">
+                          <a14:useLocalDpi xmlns:a14="http://schemas.microsoft.com/office/drawing/2010/main" val="0"/>
+                        </a:ext>
+                      </a:extLst>
+                    </a:blip>
+                    <a:stretch>
+                      <a:fillRect/>
+                    </a:stretch>
+                  </pic:blipFill>
+                  <pic:spPr>
+                    <a:xfrm>
+                      <a:off x="0" y="0"/>
+                      <a:ext cx="2959022" cy="2354572"/>
+                    </a:xfrm>
+                    <a:prstGeom prst="rect">
+                      <a:avLst/>
+                    </a:prstGeom>
+                  </pic:spPr>
+                </pic:pic>
+              </a:graphicData>
+            </a:graphic>
+          </wp:inline>
+        </w:drawing>
+      </w:r>
+    </w:p>
+    <w:p>
+      <w:pPr>
+        <w:pStyle w:val="Caption"/>
+        <w:jc w:val="center"/>
+        <w:rPr>
+          <w:lang w:bidi="fa-IR"/>
+        </w:rPr>
+      </w:pPr>
+      <w:r>
+        <w:rPr>
+          <w:rFonts w:hint="cs"/>
+          <w:rtl/>
+        </w:rPr>
+        <w:t>شکل</w:t>
+      </w:r>
+      <w:r>
+        <w:rPr>
+          <w:rtl/>
+        </w:rPr>
+        <w:t xml:space="preserve"> 1-2</w:t>
+      </w:r>
+      <w:r>
+        <w:t xml:space="preserve"> </w:t>
+      </w:r>
+      <w:r>
+        <w:rPr>
+          <w:rFonts w:hint="cs"/>
+          <w:rtl/>
+        </w:rPr>
+        <w:t>--</w:t>
+      </w:r>
+      <w:r>
+        <w:t xml:space="preserve"> </w:t>
+      </w:r>
+      <w:r>
+        <w:rPr>
+          <w:rFonts w:hint="cs"/>
+          <w:rtl/>
+          <w:lang w:bidi="fa-IR"/>
+        </w:rPr>
+        <w:t>قرار دادن 1010 در مدار</w:t>
+      </w:r>
+    </w:p>
+    <w:p>
+      <w:pPr>
+        <w:rPr>
+          <w:lang w:bidi="fa-IR"/>
+        </w:rPr>
+      </w:pPr>
+    </w:p>
+    <w:p>
+      <w:pPr>
+        <w:bidi/>
+        <w:rPr>
+          <w:rFonts w:cs="B Yekan"/>
+          <w:sz w:val="28"/>
+          <w:szCs w:val="28"/>
+          <w:rtl/>
+          <w:lang w:bidi="fa-IR"/>
+        </w:rPr>
+      </w:pPr>
+      <w:r>
+        <w:rPr>
+          <w:rFonts w:cs="B Yekan" w:hint="cs"/>
+          <w:sz w:val="28"/>
+          <w:szCs w:val="28"/>
+          <w:rtl/>
+          <w:lang w:bidi="fa-IR"/>
+        </w:rPr>
+        <w:lastRenderedPageBreak/>
+        <w:t xml:space="preserve">بخش </w:t>
+      </w:r>
+      <w:r>
+        <w:rPr>
+          <w:rFonts w:cs="B Yekan" w:hint="cs"/>
+          <w:sz w:val="28"/>
+          <w:szCs w:val="28"/>
+          <w:rtl/>
+          <w:lang w:bidi="fa-IR"/>
+        </w:rPr>
+        <w:t>سوم</w:t>
+      </w:r>
+      <w:r>
+        <w:rPr>
+          <w:rFonts w:cs="B Yekan" w:hint="cs"/>
+          <w:sz w:val="28"/>
+          <w:szCs w:val="28"/>
+          <w:rtl/>
+          <w:lang w:bidi="fa-IR"/>
+        </w:rPr>
+        <w:t>:</w:t>
+      </w:r>
+    </w:p>
+    <w:p>
+      <w:pPr>
+        <w:bidi/>
+        <w:rPr>
+          <w:rFonts w:cs="B Yekan"/>
+          <w:sz w:val="28"/>
+          <w:szCs w:val="28"/>
+          <w:rtl/>
+          <w:lang w:bidi="fa-IR"/>
+        </w:rPr>
+      </w:pPr>
+      <w:r>
+        <w:rPr>
+          <w:rFonts w:cs="B Yekan" w:hint="cs"/>
+          <w:sz w:val="28"/>
+          <w:szCs w:val="28"/>
+          <w:rtl/>
+          <w:lang w:bidi="fa-IR"/>
+        </w:rPr>
+        <w:t>ساخت مداری با قابلیت شیفت به راست</w:t>
+      </w:r>
+      <w:r>
+        <w:rPr>
+          <w:rFonts w:cs="B Yekan" w:hint="cs"/>
+          <w:sz w:val="28"/>
+          <w:szCs w:val="28"/>
+          <w:rtl/>
+          <w:lang w:bidi="fa-IR"/>
+        </w:rPr>
+        <w:t>:</w:t>
+      </w:r>
+    </w:p>
+    <w:p>
+      <w:pPr>
+        <w:jc w:val="right"/>
+        <w:rPr>
+          <w:rFonts w:cs="B Nazanin"/>
+          <w:rtl/>
+          <w:lang w:bidi="fa-IR"/>
+        </w:rPr>
+      </w:pPr>
+      <w:r>
+        <w:rPr>
+          <w:rFonts w:cs="B Nazanin" w:hint="cs"/>
+          <w:rtl/>
+          <w:lang w:bidi="fa-IR"/>
+        </w:rPr>
+        <w:t xml:space="preserve">با برابر قرار دادن بیت مود با صفر مدار به مداری با قابلیت شیفت به سمت راست تبدیل می شود و با هر بار فشردن دکمه ساعت ورودی وارد بیت پر ارزش شده و بیت کم ارزش خارج می شود. برای امتحان کردن این موضوع ورودی </w:t>
+      </w:r>
+      <w:r>
+        <w:rPr>
+          <w:rFonts w:cs="B Nazanin" w:hint="cs"/>
+          <w:rtl/>
+          <w:lang w:bidi="fa-IR"/>
+        </w:rPr>
+        <w:t>1010 بخش قبل را با قرار دادن ورودی مدار با صفر یکی به راست شیفت می دهیم.(شکل 3-1)</w:t>
+      </w:r>
+    </w:p>
+    <w:p>
+      <w:pPr>
+        <w:jc w:val="right"/>
+        <w:rPr>
+          <w:rFonts w:cs="B Nazanin"/>
+          <w:rtl/>
+          <w:lang w:bidi="fa-IR"/>
+        </w:rPr>
+      </w:pPr>
+    </w:p>
+    <w:p>
+      <w:pPr>
+        <w:keepNext/>
+        <w:jc w:val="right"/>
+      </w:pPr>
+      <w:r>
+        <w:drawing>
+          <wp:inline distT="0" distB="0" distL="0" distR="0" wp14:anchorId="52DC3494" wp14:editId="64DA02FB">
+            <wp:extent cx="5943600" cy="4984750"/>
+            <wp:effectExtent l="0" t="0" r="0" b="6350"/>
+            <wp:docPr id="1700406640" name="Picture 1"/>
+            <wp:cNvGraphicFramePr>
+              <a:graphicFrameLocks xmlns:a="http://schemas.openxmlformats.org/drawingml/2006/main" noChangeAspect="1"/>
+            </wp:cNvGraphicFramePr>
+            <a:graphic xmlns:a="http://schemas.openxmlformats.org/drawingml/2006/main">
+              <a:graphicData uri="http://schemas.openxmlformats.org/drawingml/2006/picture">
+                <pic:pic xmlns:pic="http://schemas.openxmlformats.org/drawingml/2006/picture">
+                  <pic:nvPicPr>
+                    <pic:cNvPr id="1700406640" name=""/>
+                    <pic:cNvPicPr/>
+                  </pic:nvPicPr>
+                  <pic:blipFill>
+                    <a:blip r:embed="rId10"/>
+                    <a:stretch>
+                      <a:fillRect/>
+                    </a:stretch>
+                  </pic:blipFill>
+                  <pic:spPr>
+                    <a:xfrm>
+                      <a:off x="0" y="0"/>
+                      <a:ext cx="5943600" cy="4984750"/>
+                    </a:xfrm>
+                    <a:prstGeom prst="rect">
+                      <a:avLst/>
+                    </a:prstGeom>
+                  </pic:spPr>
+                </pic:pic>
+              </a:graphicData>
+            </a:graphic>
+          </wp:inline>
+        </w:drawing>
+      </w:r>
+    </w:p>
+    <w:p>
+      <w:pPr>
+        <w:pStyle w:val="Caption"/>
+        <w:jc w:val="center"/>
+      </w:pPr>
+      <w:r>
+        <w:rPr>
+          <w:rFonts w:hint="cs"/>
+          <w:rtl/>
+          <w:lang w:bidi="fa-IR"/>
+        </w:rPr>
+        <w:t>شکل 3-1 شیفت دادن مدار به راست</w:t>
+      </w:r>
+    </w:p>
+    <w:p>
+      <w:pPr>
+        <w:jc w:val="right"/>
+      </w:pPr>
+      <w:r>
+        <w:t xml:space="preserve"> </w:t>
+      </w:r>
       <w:r>
         <w:br w:type="page"/>
       </w:r>
     </w:p>
     <w:p>
-      <w:r>
+      <w:pPr>
+        <w:bidi/>
+        <w:rPr>
+          <w:rFonts w:cs="B Yekan"/>
+          <w:sz w:val="28"/>
+          <w:szCs w:val="28"/>
+          <w:rtl/>
+          <w:lang w:bidi="fa-IR"/>
+        </w:rPr>
+      </w:pPr>
+      <w:r>
+        <w:rPr>
+          <w:rFonts w:cs="B Yekan" w:hint="cs"/>
+          <w:sz w:val="28"/>
+          <w:szCs w:val="28"/>
+          <w:rtl/>
+          <w:lang w:bidi="fa-IR"/>
+        </w:rPr>
         <w:lastRenderedPageBreak/>
-        <w:br w:type="page"/>
+        <w:t xml:space="preserve">بخش </w:t>
+      </w:r>
+      <w:r>
+        <w:rPr>
+          <w:rFonts w:cs="B Yekan" w:hint="cs"/>
+          <w:sz w:val="28"/>
+          <w:szCs w:val="28"/>
+          <w:rtl/>
+          <w:lang w:bidi="fa-IR"/>
+        </w:rPr>
+        <w:t>چهارم</w:t>
+      </w:r>
+      <w:r>
+        <w:rPr>
+          <w:rFonts w:cs="B Yekan" w:hint="cs"/>
+          <w:sz w:val="28"/>
+          <w:szCs w:val="28"/>
+          <w:rtl/>
+          <w:lang w:bidi="fa-IR"/>
+        </w:rPr>
+        <w:t>:</w:t>
+      </w:r>
+    </w:p>
+    <w:p>
+      <w:pPr>
+        <w:bidi/>
+        <w:rPr>
+          <w:rFonts w:cs="B Yekan"/>
+          <w:sz w:val="28"/>
+          <w:szCs w:val="28"/>
+          <w:rtl/>
+          <w:lang w:bidi="fa-IR"/>
+        </w:rPr>
+      </w:pPr>
+      <w:r>
+        <w:rPr>
+          <w:rFonts w:cs="B Yekan" w:hint="cs"/>
+          <w:sz w:val="28"/>
+          <w:szCs w:val="28"/>
+          <w:rtl/>
+          <w:lang w:bidi="fa-IR"/>
+        </w:rPr>
+        <w:t>تبدیل مدار به شیفت رجیستر دو طرفه</w:t>
+      </w:r>
+      <w:r>
+        <w:rPr>
+          <w:rFonts w:cs="B Yekan" w:hint="cs"/>
+          <w:sz w:val="28"/>
+          <w:szCs w:val="28"/>
+          <w:rtl/>
+          <w:lang w:bidi="fa-IR"/>
+        </w:rPr>
+        <w:t>:</w:t>
+      </w:r>
+    </w:p>
+    <w:p>
+      <w:pPr>
+        <w:bidi/>
+        <w:rPr>
+          <w:rtl/>
+          <w:lang w:bidi="fa-IR"/>
+        </w:rPr>
+      </w:pPr>
+      <w:r>
+        <w:rPr>
+          <w:rFonts w:cs="B Nazanin" w:hint="cs"/>
+          <w:rtl/>
+          <w:lang w:bidi="fa-IR"/>
+        </w:rPr>
+        <w:t xml:space="preserve">به دلیل اینکه دیگر مدار قابلیت بارگذاری موازی را ندارد پس ورودی های </w:t>
+      </w:r>
+      <w:r>
+        <w:rPr>
+          <w:rFonts w:cs="B Nazanin"/>
+          <w:lang w:bidi="fa-IR"/>
+        </w:rPr>
+        <w:t>A</w:t>
+      </w:r>
+      <w:r>
+        <w:rPr>
+          <w:rFonts w:cs="B Nazanin" w:hint="cs"/>
+          <w:rtl/>
+          <w:lang w:bidi="fa-IR"/>
+        </w:rPr>
+        <w:t xml:space="preserve"> تا</w:t>
+      </w:r>
+      <w:r>
+        <w:rPr>
+          <w:rFonts w:cs="B Nazanin"/>
+          <w:lang w:bidi="fa-IR"/>
+        </w:rPr>
+        <w:t xml:space="preserve">D </w:t>
+      </w:r>
+      <w:r>
+        <w:rPr>
+          <w:rFonts w:hint="cs"/>
+          <w:rtl/>
+          <w:lang w:bidi="fa-IR"/>
+        </w:rPr>
+        <w:t xml:space="preserve"> را از مدار جدا می کنیم.</w:t>
+      </w:r>
+      <w:r>
+        <w:rPr>
+          <w:rFonts w:hint="cs"/>
+          <w:rtl/>
+          <w:lang w:bidi="fa-IR"/>
+        </w:rPr>
+        <w:t xml:space="preserve"> می دانیم وقتی بیت مود برابر صفر باشد گیت های </w:t>
+      </w:r>
+      <w:r>
+        <w:rPr>
+          <w:lang w:bidi="fa-IR"/>
+        </w:rPr>
+        <w:t xml:space="preserve">AND </w:t>
+      </w:r>
+      <w:r>
+        <w:rPr>
+          <w:rFonts w:hint="cs"/>
+          <w:rtl/>
+          <w:lang w:bidi="fa-IR"/>
+        </w:rPr>
+        <w:t xml:space="preserve"> پایین فعال هستند پس به هر کدام از این گیت ها خروجی فلیپ فلاپ بالایی را متصل می کنیم ،چون بیت کم ارزش فلیپ فلاپی قبل از خود ندارد ، در این مورد از ورودی </w:t>
+      </w:r>
+      <w:proofErr w:type="spellStart"/>
+      <w:r>
+        <w:rPr>
+          <w:lang w:bidi="fa-IR"/>
+        </w:rPr>
+        <w:t>s_in</w:t>
+      </w:r>
+      <w:proofErr w:type="spellEnd"/>
+      <w:r>
+        <w:rPr>
+          <w:rFonts w:hint="cs"/>
+          <w:rtl/>
+          <w:lang w:bidi="fa-IR"/>
+        </w:rPr>
+        <w:t xml:space="preserve"> استفاده می کنیم.</w:t>
+      </w:r>
+    </w:p>
+    <w:p>
+      <w:pPr>
+        <w:bidi/>
+        <w:rPr>
+          <w:rFonts w:hint="cs"/>
+          <w:rtl/>
+          <w:lang w:bidi="fa-IR"/>
+        </w:rPr>
+      </w:pPr>
+      <w:r>
+        <w:rPr>
+          <w:rFonts w:hint="cs"/>
+          <w:rtl/>
+          <w:lang w:bidi="fa-IR"/>
+        </w:rPr>
+        <w:t xml:space="preserve"> در این حالت هنگامی که بیت مود برابر صفر است ، شیفت به چپ اتفاق می افتد که شکل کلی مدار در شکل 4-1 مشخص است .</w:t>
       </w:r>
     </w:p>
     <w:p/>
@@ -588,9 +1977,9 @@
       </w:pPr>
     </w:p>
     <w:sectPr>
-      <w:headerReference w:type="even" r:id="rId8"/>
-      <w:headerReference w:type="default" r:id="rId9"/>
-      <w:headerReference w:type="first" r:id="rId10"/>
+      <w:headerReference w:type="even" r:id="rId11"/>
+      <w:headerReference w:type="default" r:id="rId12"/>
+      <w:headerReference w:type="first" r:id="rId13"/>
       <w:pgSz w:w="12240" w:h="15840"/>
       <w:pgMar w:top="1440" w:right="1440" w:bottom="1440" w:left="1440" w:header="720" w:footer="720" w:gutter="0"/>
       <w:pgBorders w:offsetFrom="page">

</xml_diff>

<commit_message>
Az2 proteus and sequence
</commit_message>
<xml_diff>
--- a/Az2/GozAz2.docx
+++ b/Az2/GozAz2.docx
@@ -18,7 +18,7 @@
           <w:szCs w:val="48"/>
         </w:rPr>
         <w:drawing>
-          <wp:inline distT="0" distB="0" distL="0" distR="0" wp14:anchorId="55C0CFEE" wp14:editId="066BCFBF">
+          <wp:inline distT="0" distB="0" distL="0" distR="0" wp14:anchorId="55C0CFEE" wp14:editId="33BFF2B9">
             <wp:extent cx="1045634" cy="1045634"/>
             <wp:effectExtent l="0" t="0" r="2540" b="2540"/>
             <wp:docPr id="1059743664" name="Picture 2"/>
@@ -33,7 +33,7 @@
                     <pic:cNvPicPr/>
                   </pic:nvPicPr>
                   <pic:blipFill>
-                    <a:blip r:embed="rId7" cstate="print">
+                    <a:blip r:embed="rId8" cstate="print">
                       <a:extLst>
                         <a:ext uri="{28A0092B-C50C-407E-A947-70E740481C1C}">
                           <a14:useLocalDpi xmlns:a14="http://schemas.microsoft.com/office/drawing/2010/main" val="0"/>
@@ -502,17 +502,7 @@
           <w:rtl/>
           <w:lang w:bidi="fa-IR"/>
         </w:rPr>
-        <w:t>ساخت شیفت رجیستر چهار بیتی با قابلیت بارگذاری موازی</w:t>
-      </w:r>
-      <w:r>
-        <w:rPr>
-          <w:rFonts w:cs="B Yekan" w:hint="cs"/>
-          <w:sz w:val="28"/>
-          <w:szCs w:val="28"/>
-          <w:rtl/>
-          <w:lang w:bidi="fa-IR"/>
-        </w:rPr>
-        <w:t>:</w:t>
+        <w:t>ساخت شیفت رجیستر چهار بیتی با قابلیت بارگذاری موازی:</w:t>
       </w:r>
     </w:p>
     <w:p>
@@ -829,18 +819,33 @@
       <w:pPr>
         <w:bidi/>
         <w:rPr>
+          <w:rFonts w:cs="B Nazanin"/>
+          <w:rtl/>
+          <w:lang w:bidi="fa-IR"/>
+        </w:rPr>
+      </w:pPr>
+      <w:r>
+        <w:rPr>
           <w:rFonts w:cs="B Nazanin" w:hint="cs"/>
           <w:rtl/>
           <w:lang w:bidi="fa-IR"/>
         </w:rPr>
-      </w:pPr>
+        <w:t xml:space="preserve">پس هرگاه بیت کنترلی یک باشد ، گیت های </w:t>
+      </w:r>
+      <w:r>
+        <w:rPr>
+          <w:rFonts w:cs="B Nazanin"/>
+          <w:lang w:bidi="fa-IR"/>
+        </w:rPr>
+        <w:t>AND</w:t>
+      </w:r>
       <w:r>
         <w:rPr>
           <w:rFonts w:cs="B Nazanin" w:hint="cs"/>
           <w:rtl/>
           <w:lang w:bidi="fa-IR"/>
         </w:rPr>
-        <w:t xml:space="preserve">پس هرگاه بیت کنترلی یک باشد ، گیت های </w:t>
+        <w:t xml:space="preserve"> بالایی فعال می شوند و بارگذاری انجام می شود و هرگاه بیت کنترلی صفر باشد گیت های </w:t>
       </w:r>
       <w:r>
         <w:rPr>
@@ -855,256 +860,2102 @@
           <w:rtl/>
           <w:lang w:bidi="fa-IR"/>
         </w:rPr>
-        <w:t xml:space="preserve"> بالایی فعال می شوند و بارگذاری انجام می شود و هرگاه بیت کنترلی صفر باشد گیت های </w:t>
+        <w:t xml:space="preserve"> پایین فعال شده و ورودی های فلیپ فلاپ های قبلی وارد </w:t>
+      </w:r>
+      <w:r>
+        <w:rPr>
+          <w:rFonts w:cs="B Nazanin" w:hint="cs"/>
+          <w:rtl/>
+          <w:lang w:bidi="fa-IR"/>
+        </w:rPr>
+        <w:t xml:space="preserve">فلیپ فلاپ بعدی می شوند و ورودی </w:t>
       </w:r>
       <w:r>
         <w:rPr>
           <w:rFonts w:cs="B Nazanin"/>
           <w:lang w:bidi="fa-IR"/>
         </w:rPr>
+        <w:t>S_in</w:t>
+      </w:r>
+      <w:r>
+        <w:rPr>
+          <w:rFonts w:cs="B Nazanin" w:hint="cs"/>
+          <w:rtl/>
+          <w:lang w:bidi="fa-IR"/>
+        </w:rPr>
+        <w:t xml:space="preserve"> </w:t>
+      </w:r>
+      <w:r>
+        <w:rPr>
+          <w:rFonts w:cs="B Nazanin" w:hint="cs"/>
+          <w:rtl/>
+          <w:lang w:bidi="fa-IR"/>
+        </w:rPr>
+        <w:t>نیز وارد فلیپ فلاپ اول می شود و شیفت اتفاق می افتد. (شکل 1-1)</w:t>
+      </w:r>
+    </w:p>
+    <w:p>
+      <w:pPr>
+        <w:spacing w:after="40"/>
+      </w:pPr>
+    </w:p>
+    <w:tbl>
+      <w:tblPr>
+        <w:tblW w:w="0" w:type="auto"/>
+        <w:jc w:val="center"/>
+        <w:tblBorders>
+          <w:top w:val="nil"/>
+          <w:left w:val="nil"/>
+          <w:bottom w:val="nil"/>
+          <w:right w:val="nil"/>
+          <w:insideH w:val="nil"/>
+          <w:insideV w:val="nil"/>
+        </w:tblBorders>
+        <w:tblLayout w:type="fixed"/>
+        <w:tblLook w:val="04A0" w:firstRow="1" w:lastRow="0" w:firstColumn="1" w:lastColumn="0" w:noHBand="0" w:noVBand="1"/>
+      </w:tblPr>
+      <w:tblGrid>
+        <w:gridCol w:w="9000"/>
+      </w:tblGrid>
+      <w:tr>
+        <w:trPr>
+          <w:cantSplit/>
+          <w:jc w:val="center"/>
+        </w:trPr>
+        <w:tc>
+          <w:tcPr>
+            <w:tcW w:w="9000" w:type="dxa"/>
+            <w:tcMar>
+              <w:top w:w="50" w:type="dxa"/>
+              <w:left w:w="60" w:type="dxa"/>
+              <w:bottom w:w="50" w:type="dxa"/>
+              <w:right w:w="60" w:type="dxa"/>
+            </w:tcMar>
+            <w:vAlign w:val="center"/>
+          </w:tcPr>
+          <w:p>
+            <w:pPr>
+              <w:spacing w:after="20"/>
+              <w:jc w:val="center"/>
+            </w:pPr>
+            <w:r>
+              <w:rPr>
+                <w:noProof/>
+              </w:rPr>
+              <w:lastRenderedPageBreak/>
+              <w:drawing>
+                <wp:inline distT="0" distB="0" distL="0" distR="0" wp14:anchorId="2714BBBF" wp14:editId="08B9C1F0">
+                  <wp:extent cx="2957411" cy="2218057"/>
+                  <wp:effectExtent l="0" t="0" r="0" b="0"/>
+                  <wp:docPr id="1059743665" name="Picture 1059743665"/>
+                  <wp:cNvGraphicFramePr>
+                    <a:graphicFrameLocks xmlns:a="http://schemas.openxmlformats.org/drawingml/2006/main" noChangeAspect="1"/>
+                  </wp:cNvGraphicFramePr>
+                  <a:graphic xmlns:a="http://schemas.openxmlformats.org/drawingml/2006/main">
+                    <a:graphicData uri="http://schemas.openxmlformats.org/drawingml/2006/picture">
+                      <pic:pic xmlns:pic="http://schemas.openxmlformats.org/drawingml/2006/picture">
+                        <pic:nvPicPr>
+                          <pic:cNvPr id="0" name="p38_0_rId8_1160x870.png"/>
+                          <pic:cNvPicPr/>
+                        </pic:nvPicPr>
+                        <pic:blipFill>
+                          <a:blip r:embed="rId9"/>
+                          <a:stretch>
+                            <a:fillRect/>
+                          </a:stretch>
+                        </pic:blipFill>
+                        <pic:spPr>
+                          <a:xfrm>
+                            <a:off x="0" y="0"/>
+                            <a:ext cx="3003699" cy="2252773"/>
+                          </a:xfrm>
+                          <a:prstGeom prst="rect">
+                            <a:avLst/>
+                          </a:prstGeom>
+                        </pic:spPr>
+                      </pic:pic>
+                    </a:graphicData>
+                  </a:graphic>
+                </wp:inline>
+              </w:drawing>
+            </w:r>
+            <w:r>
+              <w:rPr>
+                <w:noProof/>
+              </w:rPr>
+              <w:drawing>
+                <wp:inline distT="0" distB="0" distL="0" distR="0" wp14:anchorId="6F26C00B" wp14:editId="07DBDA30">
+                  <wp:extent cx="2341857" cy="2219128"/>
+                  <wp:effectExtent l="0" t="0" r="1905" b="0"/>
+                  <wp:docPr id="1059743666" name="Picture 1059743666"/>
+                  <wp:cNvGraphicFramePr>
+                    <a:graphicFrameLocks xmlns:a="http://schemas.openxmlformats.org/drawingml/2006/main" noChangeAspect="1"/>
+                  </wp:cNvGraphicFramePr>
+                  <a:graphic xmlns:a="http://schemas.openxmlformats.org/drawingml/2006/main">
+                    <a:graphicData uri="http://schemas.openxmlformats.org/drawingml/2006/picture">
+                      <pic:pic xmlns:pic="http://schemas.openxmlformats.org/drawingml/2006/picture">
+                        <pic:nvPicPr>
+                          <pic:cNvPr id="0" name="p49_0_rId9_935x886.png"/>
+                          <pic:cNvPicPr/>
+                        </pic:nvPicPr>
+                        <pic:blipFill>
+                          <a:blip r:embed="rId10"/>
+                          <a:stretch>
+                            <a:fillRect/>
+                          </a:stretch>
+                        </pic:blipFill>
+                        <pic:spPr>
+                          <a:xfrm>
+                            <a:off x="0" y="0"/>
+                            <a:ext cx="2362106" cy="2238316"/>
+                          </a:xfrm>
+                          <a:prstGeom prst="rect">
+                            <a:avLst/>
+                          </a:prstGeom>
+                        </pic:spPr>
+                      </pic:pic>
+                    </a:graphicData>
+                  </a:graphic>
+                </wp:inline>
+              </w:drawing>
+            </w:r>
+          </w:p>
+          <w:p>
+            <w:pPr>
+              <w:pStyle w:val="Caption"/>
+              <w:bidi/>
+              <w:jc w:val="center"/>
+              <w:rPr>
+                <w:noProof/>
+                <w:rtl/>
+                <w:lang w:bidi="fa-IR"/>
+              </w:rPr>
+            </w:pPr>
+            <w:r>
+              <w:rPr>
+                <w:rFonts w:hint="cs"/>
+                <w:rtl/>
+              </w:rPr>
+              <w:t>شکل</w:t>
+            </w:r>
+            <w:r>
+              <w:rPr>
+                <w:rtl/>
+              </w:rPr>
+              <w:t xml:space="preserve"> 1-</w:t>
+            </w:r>
+            <w:r>
+              <w:rPr>
+                <w:rFonts w:hint="cs"/>
+                <w:rtl/>
+                <w:lang w:bidi="fa-IR"/>
+              </w:rPr>
+              <w:t xml:space="preserve">1 </w:t>
+            </w:r>
+            <w:r>
+              <w:rPr>
+                <w:rFonts w:hint="cs"/>
+                <w:rtl/>
+              </w:rPr>
+              <w:t xml:space="preserve"> ساخت مدار شیفت رجیستر</w:t>
+            </w:r>
+            <w:r>
+              <w:rPr>
+                <w:rFonts w:hint="cs"/>
+                <w:rtl/>
+                <w:lang w:bidi="fa-IR"/>
+              </w:rPr>
+              <w:t xml:space="preserve"> در دو نرم افزار</w:t>
+            </w:r>
+          </w:p>
+        </w:tc>
+      </w:tr>
+      <w:tr>
+        <w:trPr>
+          <w:cantSplit/>
+          <w:jc w:val="center"/>
+        </w:trPr>
+        <w:tc>
+          <w:tcPr>
+            <w:tcW w:w="9000" w:type="dxa"/>
+            <w:tcMar>
+              <w:top w:w="50" w:type="dxa"/>
+              <w:left w:w="60" w:type="dxa"/>
+              <w:bottom w:w="50" w:type="dxa"/>
+              <w:right w:w="60" w:type="dxa"/>
+            </w:tcMar>
+            <w:vAlign w:val="center"/>
+          </w:tcPr>
+          <w:p>
+            <w:pPr>
+              <w:spacing w:after="20"/>
+              <w:jc w:val="center"/>
+            </w:pPr>
+          </w:p>
+          <w:p>
+            <w:pPr>
+              <w:pStyle w:val="Caption"/>
+              <w:keepLines/>
+              <w:bidi/>
+              <w:spacing w:before="40" w:after="60"/>
+              <w:jc w:val="center"/>
+            </w:pPr>
+          </w:p>
+        </w:tc>
+      </w:tr>
+    </w:tbl>
+    <w:p>
+      <w:pPr>
+        <w:bidi/>
+        <w:rPr>
+          <w:rFonts w:cs="B Yekan"/>
+          <w:sz w:val="28"/>
+          <w:szCs w:val="28"/>
+          <w:rtl/>
+          <w:lang w:bidi="fa-IR"/>
+        </w:rPr>
+      </w:pPr>
+      <w:r>
+        <w:rPr>
+          <w:rFonts w:cs="B Yekan" w:hint="cs"/>
+          <w:sz w:val="28"/>
+          <w:szCs w:val="28"/>
+          <w:rtl/>
+          <w:lang w:bidi="fa-IR"/>
+        </w:rPr>
+        <w:t>بخش دوم:</w:t>
+      </w:r>
+    </w:p>
+    <w:p>
+      <w:pPr>
+        <w:bidi/>
+        <w:rPr>
+          <w:rFonts w:cs="B Yekan"/>
+          <w:sz w:val="28"/>
+          <w:szCs w:val="28"/>
+          <w:rtl/>
+          <w:lang w:bidi="fa-IR"/>
+        </w:rPr>
+      </w:pPr>
+      <w:r>
+        <w:rPr>
+          <w:rFonts w:cs="B Yekan" w:hint="cs"/>
+          <w:sz w:val="28"/>
+          <w:szCs w:val="28"/>
+          <w:rtl/>
+          <w:lang w:bidi="fa-IR"/>
+        </w:rPr>
+        <w:t>ذخیره مقدار 1010 در شیفت رجیستر با ورودی های مناسب:</w:t>
+      </w:r>
+    </w:p>
+    <w:p>
+      <w:pPr>
+        <w:bidi/>
+        <w:rPr>
+          <w:rFonts w:cs="B Nazanin"/>
+          <w:lang w:bidi="fa-IR"/>
+        </w:rPr>
+      </w:pPr>
+      <w:r>
+        <w:rPr>
+          <w:rFonts w:cs="B Nazanin" w:hint="cs"/>
+          <w:rtl/>
+          <w:lang w:bidi="fa-IR"/>
+        </w:rPr>
+        <w:t xml:space="preserve">برای ذخیره داده ها در شیفت رجیستر باید بیت کنترلی یک باشد و </w:t>
+      </w:r>
+      <w:r>
+        <w:rPr>
+          <w:rFonts w:cs="B Nazanin"/>
+          <w:lang w:bidi="fa-IR"/>
+        </w:rPr>
+        <w:t>ABCD</w:t>
+      </w:r>
+      <w:r>
+        <w:rPr>
+          <w:rFonts w:cs="B Nazanin" w:hint="cs"/>
+          <w:rtl/>
+          <w:lang w:bidi="fa-IR"/>
+        </w:rPr>
+        <w:t xml:space="preserve"> را به ترتیب برابر </w:t>
+      </w:r>
+      <w:r>
+        <w:rPr>
+          <w:rFonts w:cs="B Nazanin"/>
+          <w:lang w:bidi="fa-IR"/>
+        </w:rPr>
+        <w:t>1010</w:t>
+      </w:r>
+      <w:r>
+        <w:rPr>
+          <w:rFonts w:cs="B Nazanin" w:hint="cs"/>
+          <w:rtl/>
+          <w:lang w:bidi="fa-IR"/>
+        </w:rPr>
+        <w:t xml:space="preserve"> قرار می دهیم.</w:t>
+      </w:r>
+      <w:r>
+        <w:rPr>
+          <w:rFonts w:cs="B Nazanin" w:hint="cs"/>
+          <w:rtl/>
+          <w:lang w:bidi="fa-IR"/>
+        </w:rPr>
+        <w:t xml:space="preserve"> سپس با یکبار فشردن دکمه ساعت ، مقادیر در فلیپ فلاپ ها ذخیره می شوند.</w:t>
+      </w:r>
+      <w:r>
+        <w:rPr>
+          <w:rFonts w:cs="B Nazanin" w:hint="cs"/>
+          <w:rtl/>
+          <w:lang w:bidi="fa-IR"/>
+        </w:rPr>
+        <w:t>(شکل 2-1)</w:t>
+      </w:r>
+    </w:p>
+    <w:p>
+      <w:pPr>
+        <w:spacing w:after="40"/>
+      </w:pPr>
+    </w:p>
+    <w:tbl>
+      <w:tblPr>
+        <w:tblW w:w="0" w:type="auto"/>
+        <w:jc w:val="center"/>
+        <w:tblBorders>
+          <w:top w:val="nil"/>
+          <w:left w:val="nil"/>
+          <w:bottom w:val="nil"/>
+          <w:right w:val="nil"/>
+          <w:insideH w:val="nil"/>
+          <w:insideV w:val="nil"/>
+        </w:tblBorders>
+        <w:tblLayout w:type="fixed"/>
+        <w:tblLook w:val="04A0" w:firstRow="1" w:lastRow="0" w:firstColumn="1" w:lastColumn="0" w:noHBand="0" w:noVBand="1"/>
+      </w:tblPr>
+      <w:tblGrid>
+        <w:gridCol w:w="4464"/>
+        <w:gridCol w:w="4536"/>
+      </w:tblGrid>
+      <w:tr>
+        <w:trPr>
+          <w:cantSplit/>
+          <w:jc w:val="center"/>
+        </w:trPr>
+        <w:tc>
+          <w:tcPr>
+            <w:tcW w:w="4464" w:type="dxa"/>
+            <w:tcMar>
+              <w:top w:w="50" w:type="dxa"/>
+              <w:left w:w="60" w:type="dxa"/>
+              <w:bottom w:w="50" w:type="dxa"/>
+              <w:right w:w="60" w:type="dxa"/>
+            </w:tcMar>
+            <w:vAlign w:val="center"/>
+          </w:tcPr>
+          <w:p>
+            <w:pPr>
+              <w:spacing w:after="20"/>
+              <w:jc w:val="center"/>
+            </w:pPr>
+            <w:r>
+              <w:rPr>
+                <w:noProof/>
+              </w:rPr>
+              <w:drawing>
+                <wp:inline distT="0" distB="0" distL="0" distR="0" wp14:anchorId="13DAD58C" wp14:editId="4D3F1986">
+                  <wp:extent cx="2514600" cy="2594176"/>
+                  <wp:effectExtent l="0" t="0" r="0" b="0"/>
+                  <wp:docPr id="1059743668" name="Picture 1059743668"/>
+                  <wp:cNvGraphicFramePr>
+                    <a:graphicFrameLocks xmlns:a="http://schemas.openxmlformats.org/drawingml/2006/main" noChangeAspect="1"/>
+                  </wp:cNvGraphicFramePr>
+                  <a:graphic xmlns:a="http://schemas.openxmlformats.org/drawingml/2006/main">
+                    <a:graphicData uri="http://schemas.openxmlformats.org/drawingml/2006/picture">
+                      <pic:pic xmlns:pic="http://schemas.openxmlformats.org/drawingml/2006/picture">
+                        <pic:nvPicPr>
+                          <pic:cNvPr id="0" name="p53_1_rId11_632x652.png"/>
+                          <pic:cNvPicPr/>
+                        </pic:nvPicPr>
+                        <pic:blipFill>
+                          <a:blip r:embed="rId11"/>
+                          <a:stretch>
+                            <a:fillRect/>
+                          </a:stretch>
+                        </pic:blipFill>
+                        <pic:spPr>
+                          <a:xfrm>
+                            <a:off x="0" y="0"/>
+                            <a:ext cx="2514600" cy="2594176"/>
+                          </a:xfrm>
+                          <a:prstGeom prst="rect">
+                            <a:avLst/>
+                          </a:prstGeom>
+                        </pic:spPr>
+                      </pic:pic>
+                    </a:graphicData>
+                  </a:graphic>
+                </wp:inline>
+              </w:drawing>
+            </w:r>
+          </w:p>
+          <w:p>
+            <w:pPr>
+              <w:pStyle w:val="Caption"/>
+              <w:keepLines/>
+              <w:bidi/>
+              <w:spacing w:before="40" w:after="60"/>
+              <w:jc w:val="center"/>
+              <w:rPr>
+                <w:rFonts w:cs="B Nazanin"/>
+                <w:i w:val="0"/>
+                <w:iCs w:val="0"/>
+              </w:rPr>
+            </w:pPr>
+            <w:r>
+              <w:rPr>
+                <w:rFonts w:ascii="Noto Naskh Arabic" w:hAnsi="Noto Naskh Arabic" w:cs="B Nazanin" w:hint="cs"/>
+                <w:i w:val="0"/>
+                <w:iCs w:val="0"/>
+                <w:sz w:val="16"/>
+                <w:rtl/>
+              </w:rPr>
+              <w:t>شکل مدار بعد از فشردن دکمه کلاک و لود همزمان</w:t>
+            </w:r>
+          </w:p>
+        </w:tc>
+        <w:tc>
+          <w:tcPr>
+            <w:tcW w:w="4464" w:type="dxa"/>
+            <w:tcMar>
+              <w:top w:w="50" w:type="dxa"/>
+              <w:left w:w="60" w:type="dxa"/>
+              <w:bottom w:w="50" w:type="dxa"/>
+              <w:right w:w="60" w:type="dxa"/>
+            </w:tcMar>
+            <w:vAlign w:val="center"/>
+          </w:tcPr>
+          <w:p>
+            <w:pPr>
+              <w:spacing w:after="20"/>
+              <w:jc w:val="center"/>
+            </w:pPr>
+            <w:r>
+              <w:rPr>
+                <w:noProof/>
+              </w:rPr>
+              <w:drawing>
+                <wp:inline distT="0" distB="0" distL="0" distR="0" wp14:anchorId="08C31654" wp14:editId="3F3C5687">
+                  <wp:extent cx="2514600" cy="2569436"/>
+                  <wp:effectExtent l="0" t="0" r="0" b="0"/>
+                  <wp:docPr id="1059743667" name="Picture 1059743667"/>
+                  <wp:cNvGraphicFramePr>
+                    <a:graphicFrameLocks xmlns:a="http://schemas.openxmlformats.org/drawingml/2006/main" noChangeAspect="1"/>
+                  </wp:cNvGraphicFramePr>
+                  <a:graphic xmlns:a="http://schemas.openxmlformats.org/drawingml/2006/main">
+                    <a:graphicData uri="http://schemas.openxmlformats.org/drawingml/2006/picture">
+                      <pic:pic xmlns:pic="http://schemas.openxmlformats.org/drawingml/2006/picture">
+                        <pic:nvPicPr>
+                          <pic:cNvPr id="0" name="p53_0_rId10_642x656.png"/>
+                          <pic:cNvPicPr/>
+                        </pic:nvPicPr>
+                        <pic:blipFill>
+                          <a:blip r:embed="rId12"/>
+                          <a:stretch>
+                            <a:fillRect/>
+                          </a:stretch>
+                        </pic:blipFill>
+                        <pic:spPr>
+                          <a:xfrm>
+                            <a:off x="0" y="0"/>
+                            <a:ext cx="2514600" cy="2569436"/>
+                          </a:xfrm>
+                          <a:prstGeom prst="rect">
+                            <a:avLst/>
+                          </a:prstGeom>
+                        </pic:spPr>
+                      </pic:pic>
+                    </a:graphicData>
+                  </a:graphic>
+                </wp:inline>
+              </w:drawing>
+            </w:r>
+          </w:p>
+          <w:p>
+            <w:pPr>
+              <w:pStyle w:val="Caption"/>
+              <w:keepLines/>
+              <w:bidi/>
+              <w:spacing w:before="40" w:after="60"/>
+              <w:jc w:val="center"/>
+              <w:rPr>
+                <w:rFonts w:cs="B Nazanin"/>
+                <w:i w:val="0"/>
+                <w:iCs w:val="0"/>
+              </w:rPr>
+            </w:pPr>
+            <w:r>
+              <w:rPr>
+                <w:rFonts w:ascii="Noto Naskh Arabic" w:hAnsi="Noto Naskh Arabic" w:cs="B Nazanin" w:hint="cs"/>
+                <w:i w:val="0"/>
+                <w:iCs w:val="0"/>
+                <w:sz w:val="16"/>
+                <w:rtl/>
+              </w:rPr>
+              <w:t>شکل مدار قبل از فشردن دکمه کلاک</w:t>
+            </w:r>
+          </w:p>
+        </w:tc>
+      </w:tr>
+      <w:tr>
+        <w:trPr>
+          <w:cantSplit/>
+          <w:jc w:val="center"/>
+        </w:trPr>
+        <w:tc>
+          <w:tcPr>
+            <w:tcW w:w="9000" w:type="dxa"/>
+            <w:gridSpan w:val="2"/>
+            <w:tcMar>
+              <w:top w:w="50" w:type="dxa"/>
+              <w:left w:w="60" w:type="dxa"/>
+              <w:bottom w:w="50" w:type="dxa"/>
+              <w:right w:w="60" w:type="dxa"/>
+            </w:tcMar>
+            <w:vAlign w:val="center"/>
+          </w:tcPr>
+          <w:p>
+            <w:pPr>
+              <w:spacing w:after="20"/>
+              <w:jc w:val="center"/>
+            </w:pPr>
+            <w:r>
+              <w:rPr>
+                <w:noProof/>
+              </w:rPr>
+              <w:lastRenderedPageBreak/>
+              <w:drawing>
+                <wp:inline distT="0" distB="0" distL="0" distR="0" wp14:anchorId="08D053DC" wp14:editId="3B2DD818">
+                  <wp:extent cx="4297680" cy="3421219"/>
+                  <wp:effectExtent l="0" t="0" r="0" b="0"/>
+                  <wp:docPr id="1059743669" name="Picture 1059743669"/>
+                  <wp:cNvGraphicFramePr>
+                    <a:graphicFrameLocks xmlns:a="http://schemas.openxmlformats.org/drawingml/2006/main" noChangeAspect="1"/>
+                  </wp:cNvGraphicFramePr>
+                  <a:graphic xmlns:a="http://schemas.openxmlformats.org/drawingml/2006/main">
+                    <a:graphicData uri="http://schemas.openxmlformats.org/drawingml/2006/picture">
+                      <pic:pic xmlns:pic="http://schemas.openxmlformats.org/drawingml/2006/picture">
+                        <pic:nvPicPr>
+                          <pic:cNvPr id="0" name="p54_0_rId12_711x566.png"/>
+                          <pic:cNvPicPr/>
+                        </pic:nvPicPr>
+                        <pic:blipFill>
+                          <a:blip r:embed="rId13"/>
+                          <a:stretch>
+                            <a:fillRect/>
+                          </a:stretch>
+                        </pic:blipFill>
+                        <pic:spPr>
+                          <a:xfrm>
+                            <a:off x="0" y="0"/>
+                            <a:ext cx="4297680" cy="3421219"/>
+                          </a:xfrm>
+                          <a:prstGeom prst="rect">
+                            <a:avLst/>
+                          </a:prstGeom>
+                        </pic:spPr>
+                      </pic:pic>
+                    </a:graphicData>
+                  </a:graphic>
+                </wp:inline>
+              </w:drawing>
+            </w:r>
+          </w:p>
+          <w:p>
+            <w:pPr>
+              <w:pStyle w:val="Caption"/>
+              <w:keepLines/>
+              <w:bidi/>
+              <w:spacing w:before="40" w:after="60"/>
+              <w:jc w:val="center"/>
+            </w:pPr>
+            <w:r>
+              <w:rPr>
+                <w:rFonts w:ascii="Noto Naskh Arabic" w:hAnsi="Noto Naskh Arabic" w:cs="Noto Naskh Arabic"/>
+              </w:rPr>
+              <w:t>شکل 2-1 (ج): نتیجه ذخیره مقدار 1010 پس از اعمال کلاک در Logisim</w:t>
+            </w:r>
+          </w:p>
+        </w:tc>
+      </w:tr>
+    </w:tbl>
+    <w:p>
+      <w:pPr>
+        <w:bidi/>
+        <w:rPr>
+          <w:rFonts w:cs="B Yekan"/>
+          <w:sz w:val="28"/>
+          <w:szCs w:val="28"/>
+          <w:rtl/>
+          <w:lang w:bidi="fa-IR"/>
+        </w:rPr>
+      </w:pPr>
+      <w:r>
+        <w:rPr>
+          <w:rFonts w:cs="B Yekan" w:hint="cs"/>
+          <w:sz w:val="28"/>
+          <w:szCs w:val="28"/>
+          <w:rtl/>
+          <w:lang w:bidi="fa-IR"/>
+        </w:rPr>
+        <w:t xml:space="preserve">بخش </w:t>
+      </w:r>
+      <w:r>
+        <w:rPr>
+          <w:rFonts w:cs="B Yekan" w:hint="cs"/>
+          <w:sz w:val="28"/>
+          <w:szCs w:val="28"/>
+          <w:rtl/>
+          <w:lang w:bidi="fa-IR"/>
+        </w:rPr>
+        <w:t>سوم</w:t>
+      </w:r>
+      <w:r>
+        <w:rPr>
+          <w:rFonts w:cs="B Yekan" w:hint="cs"/>
+          <w:sz w:val="28"/>
+          <w:szCs w:val="28"/>
+          <w:rtl/>
+          <w:lang w:bidi="fa-IR"/>
+        </w:rPr>
+        <w:t>:</w:t>
+      </w:r>
+    </w:p>
+    <w:p>
+      <w:pPr>
+        <w:bidi/>
+        <w:rPr>
+          <w:rFonts w:cs="B Yekan"/>
+          <w:sz w:val="28"/>
+          <w:szCs w:val="28"/>
+          <w:rtl/>
+          <w:lang w:bidi="fa-IR"/>
+        </w:rPr>
+      </w:pPr>
+      <w:r>
+        <w:rPr>
+          <w:rFonts w:cs="B Yekan" w:hint="cs"/>
+          <w:sz w:val="28"/>
+          <w:szCs w:val="28"/>
+          <w:rtl/>
+          <w:lang w:bidi="fa-IR"/>
+        </w:rPr>
+        <w:t>ساخت مداری با قابلیت شیفت به راست</w:t>
+      </w:r>
+      <w:r>
+        <w:rPr>
+          <w:rFonts w:cs="B Yekan" w:hint="cs"/>
+          <w:sz w:val="28"/>
+          <w:szCs w:val="28"/>
+          <w:rtl/>
+          <w:lang w:bidi="fa-IR"/>
+        </w:rPr>
+        <w:t>:</w:t>
+      </w:r>
+    </w:p>
+    <w:p>
+      <w:pPr>
+        <w:jc w:val="right"/>
+        <w:rPr>
+          <w:rFonts w:cs="B Nazanin"/>
+          <w:rtl/>
+          <w:lang w:bidi="fa-IR"/>
+        </w:rPr>
+      </w:pPr>
+      <w:r>
+        <w:rPr>
+          <w:rFonts w:cs="B Nazanin" w:hint="cs"/>
+          <w:rtl/>
+          <w:lang w:bidi="fa-IR"/>
+        </w:rPr>
+        <w:t xml:space="preserve">با برابر قرار دادن بیت مود با صفر مدار به مداری با قابلیت شیفت به سمت راست تبدیل می شود و با هر بار فشردن دکمه ساعت ورودی وارد بیت پر ارزش شده و بیت کم ارزش خارج می شود. برای امتحان کردن این موضوع ورودی </w:t>
+      </w:r>
+      <w:r>
+        <w:rPr>
+          <w:rFonts w:cs="B Nazanin" w:hint="cs"/>
+          <w:rtl/>
+          <w:lang w:bidi="fa-IR"/>
+        </w:rPr>
+        <w:t>1010 بخش قبل را با قرار دادن ورودی مدار با صفر یکی به راست شیفت می دهیم.(شکل 3-1)</w:t>
+      </w:r>
+    </w:p>
+    <w:p>
+      <w:pPr>
+        <w:spacing w:after="40"/>
+      </w:pPr>
+    </w:p>
+    <w:tbl>
+      <w:tblPr>
+        <w:tblW w:w="0" w:type="auto"/>
+        <w:jc w:val="center"/>
+        <w:tblBorders>
+          <w:top w:val="nil"/>
+          <w:left w:val="nil"/>
+          <w:bottom w:val="nil"/>
+          <w:right w:val="nil"/>
+          <w:insideH w:val="nil"/>
+          <w:insideV w:val="nil"/>
+        </w:tblBorders>
+        <w:tblLayout w:type="fixed"/>
+        <w:tblLook w:val="04A0" w:firstRow="1" w:lastRow="0" w:firstColumn="1" w:lastColumn="0" w:noHBand="0" w:noVBand="1"/>
+      </w:tblPr>
+      <w:tblGrid>
+        <w:gridCol w:w="4464"/>
+        <w:gridCol w:w="4536"/>
+      </w:tblGrid>
+      <w:tr>
+        <w:trPr>
+          <w:cantSplit/>
+          <w:jc w:val="center"/>
+        </w:trPr>
+        <w:tc>
+          <w:tcPr>
+            <w:tcW w:w="4464" w:type="dxa"/>
+            <w:tcMar>
+              <w:top w:w="50" w:type="dxa"/>
+              <w:left w:w="60" w:type="dxa"/>
+              <w:bottom w:w="50" w:type="dxa"/>
+              <w:right w:w="60" w:type="dxa"/>
+            </w:tcMar>
+            <w:vAlign w:val="center"/>
+          </w:tcPr>
+          <w:p>
+            <w:pPr>
+              <w:spacing w:after="20"/>
+              <w:jc w:val="center"/>
+            </w:pPr>
+            <w:r>
+              <w:rPr>
+                <w:noProof/>
+              </w:rPr>
+              <w:lastRenderedPageBreak/>
+              <w:drawing>
+                <wp:inline distT="0" distB="0" distL="0" distR="0" wp14:anchorId="68C7DAE5" wp14:editId="56257CA6">
+                  <wp:extent cx="2514600" cy="2530146"/>
+                  <wp:effectExtent l="0" t="0" r="0" b="0"/>
+                  <wp:docPr id="1059743671" name="Picture 1059743671"/>
+                  <wp:cNvGraphicFramePr>
+                    <a:graphicFrameLocks xmlns:a="http://schemas.openxmlformats.org/drawingml/2006/main" noChangeAspect="1"/>
+                  </wp:cNvGraphicFramePr>
+                  <a:graphic xmlns:a="http://schemas.openxmlformats.org/drawingml/2006/main">
+                    <a:graphicData uri="http://schemas.openxmlformats.org/drawingml/2006/picture">
+                      <pic:pic xmlns:pic="http://schemas.openxmlformats.org/drawingml/2006/picture">
+                        <pic:nvPicPr>
+                          <pic:cNvPr id="0" name="p60_0_rId13_647x651.png"/>
+                          <pic:cNvPicPr/>
+                        </pic:nvPicPr>
+                        <pic:blipFill>
+                          <a:blip r:embed="rId14"/>
+                          <a:stretch>
+                            <a:fillRect/>
+                          </a:stretch>
+                        </pic:blipFill>
+                        <pic:spPr>
+                          <a:xfrm>
+                            <a:off x="0" y="0"/>
+                            <a:ext cx="2514600" cy="2530146"/>
+                          </a:xfrm>
+                          <a:prstGeom prst="rect">
+                            <a:avLst/>
+                          </a:prstGeom>
+                        </pic:spPr>
+                      </pic:pic>
+                    </a:graphicData>
+                  </a:graphic>
+                </wp:inline>
+              </w:drawing>
+            </w:r>
+          </w:p>
+          <w:p>
+            <w:pPr>
+              <w:pStyle w:val="Caption"/>
+              <w:keepLines/>
+              <w:bidi/>
+              <w:spacing w:before="40" w:after="60"/>
+              <w:jc w:val="center"/>
+              <w:rPr>
+                <w:rFonts w:cs="B Nazanin"/>
+                <w:i w:val="0"/>
+                <w:iCs w:val="0"/>
+              </w:rPr>
+            </w:pPr>
+            <w:r>
+              <w:rPr>
+                <w:rFonts w:ascii="Noto Naskh Arabic" w:hAnsi="Noto Naskh Arabic" w:cs="B Nazanin" w:hint="cs"/>
+                <w:i w:val="0"/>
+                <w:iCs w:val="0"/>
+                <w:sz w:val="16"/>
+                <w:rtl/>
+              </w:rPr>
+              <w:t>شکل مدار بعد از فشردن دکمه کلاک و شیفت به راست ب</w:t>
+            </w:r>
+            <w:r>
+              <w:rPr>
+                <w:rFonts w:ascii="Noto Naskh Arabic" w:hAnsi="Noto Naskh Arabic" w:cs="B Nazanin" w:hint="cs"/>
+                <w:i w:val="0"/>
+                <w:iCs w:val="0"/>
+                <w:sz w:val="16"/>
+                <w:rtl/>
+                <w:lang w:bidi="fa-IR"/>
+              </w:rPr>
+              <w:t xml:space="preserve">ا </w:t>
+            </w:r>
+            <m:oMath>
+              <m:sSub>
+                <m:sSubPr>
+                  <m:ctrlPr>
+                    <w:rPr>
+                      <w:rFonts w:ascii="Cambria Math" w:hAnsi="Cambria Math" w:cs="B Nazanin"/>
+                      <w:iCs w:val="0"/>
+                      <w:sz w:val="16"/>
+                      <w:lang w:bidi="fa-IR"/>
+                    </w:rPr>
+                  </m:ctrlPr>
+                </m:sSubPr>
+                <m:e>
+                  <m:r>
+                    <w:rPr>
+                      <w:rFonts w:ascii="Cambria Math" w:hAnsi="Cambria Math" w:cs="B Nazanin"/>
+                      <w:sz w:val="16"/>
+                      <w:lang w:bidi="fa-IR"/>
+                    </w:rPr>
+                    <m:t>S</m:t>
+                  </m:r>
+                </m:e>
+                <m:sub>
+                  <m:r>
+                    <w:rPr>
+                      <w:rFonts w:ascii="Cambria Math" w:hAnsi="Cambria Math" w:cs="B Nazanin"/>
+                      <w:sz w:val="16"/>
+                      <w:lang w:bidi="fa-IR"/>
+                    </w:rPr>
+                    <m:t>in</m:t>
+                  </m:r>
+                </m:sub>
+              </m:sSub>
+              <m:r>
+                <w:rPr>
+                  <w:rFonts w:ascii="Cambria Math" w:hAnsi="Cambria Math" w:cs="B Nazanin"/>
+                  <w:sz w:val="16"/>
+                  <w:lang w:bidi="fa-IR"/>
+                </w:rPr>
+                <m:t>=0</m:t>
+              </m:r>
+            </m:oMath>
+            <w:r>
+              <w:rPr>
+                <w:rFonts w:ascii="Noto Naskh Arabic" w:hAnsi="Noto Naskh Arabic" w:cs="B Nazanin" w:hint="cs"/>
+                <w:i w:val="0"/>
+                <w:iCs w:val="0"/>
+                <w:sz w:val="16"/>
+                <w:rtl/>
+              </w:rPr>
+              <w:t xml:space="preserve"> </w:t>
+            </w:r>
+          </w:p>
+        </w:tc>
+        <w:tc>
+          <w:tcPr>
+            <w:tcW w:w="4464" w:type="dxa"/>
+            <w:tcMar>
+              <w:top w:w="50" w:type="dxa"/>
+              <w:left w:w="60" w:type="dxa"/>
+              <w:bottom w:w="50" w:type="dxa"/>
+              <w:right w:w="60" w:type="dxa"/>
+            </w:tcMar>
+            <w:vAlign w:val="center"/>
+          </w:tcPr>
+          <w:p>
+            <w:pPr>
+              <w:spacing w:after="20"/>
+              <w:jc w:val="center"/>
+            </w:pPr>
+            <w:r>
+              <w:rPr>
+                <w:noProof/>
+              </w:rPr>
+              <w:drawing>
+                <wp:inline distT="0" distB="0" distL="0" distR="0" wp14:anchorId="772BD700" wp14:editId="67E40E03">
+                  <wp:extent cx="2514600" cy="2594176"/>
+                  <wp:effectExtent l="0" t="0" r="0" b="0"/>
+                  <wp:docPr id="1059743670" name="Picture 1059743670"/>
+                  <wp:cNvGraphicFramePr>
+                    <a:graphicFrameLocks xmlns:a="http://schemas.openxmlformats.org/drawingml/2006/main" noChangeAspect="1"/>
+                  </wp:cNvGraphicFramePr>
+                  <a:graphic xmlns:a="http://schemas.openxmlformats.org/drawingml/2006/main">
+                    <a:graphicData uri="http://schemas.openxmlformats.org/drawingml/2006/picture">
+                      <pic:pic xmlns:pic="http://schemas.openxmlformats.org/drawingml/2006/picture">
+                        <pic:nvPicPr>
+                          <pic:cNvPr id="0" name="p60_1_rId14_632x652.png"/>
+                          <pic:cNvPicPr/>
+                        </pic:nvPicPr>
+                        <pic:blipFill>
+                          <a:blip r:embed="rId15"/>
+                          <a:stretch>
+                            <a:fillRect/>
+                          </a:stretch>
+                        </pic:blipFill>
+                        <pic:spPr>
+                          <a:xfrm>
+                            <a:off x="0" y="0"/>
+                            <a:ext cx="2514600" cy="2594176"/>
+                          </a:xfrm>
+                          <a:prstGeom prst="rect">
+                            <a:avLst/>
+                          </a:prstGeom>
+                        </pic:spPr>
+                      </pic:pic>
+                    </a:graphicData>
+                  </a:graphic>
+                </wp:inline>
+              </w:drawing>
+            </w:r>
+          </w:p>
+          <w:p>
+            <w:pPr>
+              <w:pStyle w:val="Caption"/>
+              <w:keepLines/>
+              <w:bidi/>
+              <w:spacing w:before="40" w:after="60"/>
+              <w:jc w:val="center"/>
+              <w:rPr>
+                <w:rFonts w:cs="B Nazanin"/>
+                <w:i w:val="0"/>
+                <w:iCs w:val="0"/>
+              </w:rPr>
+            </w:pPr>
+            <w:r>
+              <w:rPr>
+                <w:rFonts w:cs="B Nazanin" w:hint="cs"/>
+                <w:i w:val="0"/>
+                <w:iCs w:val="0"/>
+                <w:rtl/>
+              </w:rPr>
+              <w:t>شکل مدار قبل از فشردن دکمه کلاک</w:t>
+            </w:r>
+          </w:p>
+        </w:tc>
+      </w:tr>
+      <w:tr>
+        <w:trPr>
+          <w:cantSplit/>
+          <w:jc w:val="center"/>
+        </w:trPr>
+        <w:tc>
+          <w:tcPr>
+            <w:tcW w:w="9000" w:type="dxa"/>
+            <w:gridSpan w:val="2"/>
+            <w:tcMar>
+              <w:top w:w="50" w:type="dxa"/>
+              <w:left w:w="60" w:type="dxa"/>
+              <w:bottom w:w="50" w:type="dxa"/>
+              <w:right w:w="60" w:type="dxa"/>
+            </w:tcMar>
+            <w:vAlign w:val="center"/>
+          </w:tcPr>
+          <w:p>
+            <w:pPr>
+              <w:spacing w:after="20"/>
+              <w:jc w:val="center"/>
+            </w:pPr>
+            <w:r>
+              <w:rPr>
+                <w:noProof/>
+              </w:rPr>
+              <w:drawing>
+                <wp:inline distT="0" distB="0" distL="0" distR="0" wp14:anchorId="32FA8266" wp14:editId="4F695FD1">
+                  <wp:extent cx="4709160" cy="3949759"/>
+                  <wp:effectExtent l="0" t="0" r="0" b="0"/>
+                  <wp:docPr id="1059743672" name="Picture 1059743672"/>
+                  <wp:cNvGraphicFramePr>
+                    <a:graphicFrameLocks xmlns:a="http://schemas.openxmlformats.org/drawingml/2006/main" noChangeAspect="1"/>
+                  </wp:cNvGraphicFramePr>
+                  <a:graphic xmlns:a="http://schemas.openxmlformats.org/drawingml/2006/main">
+                    <a:graphicData uri="http://schemas.openxmlformats.org/drawingml/2006/picture">
+                      <pic:pic xmlns:pic="http://schemas.openxmlformats.org/drawingml/2006/picture">
+                        <pic:nvPicPr>
+                          <pic:cNvPr id="0" name="p61_0_rId15_1079x905.png"/>
+                          <pic:cNvPicPr/>
+                        </pic:nvPicPr>
+                        <pic:blipFill>
+                          <a:blip r:embed="rId16"/>
+                          <a:stretch>
+                            <a:fillRect/>
+                          </a:stretch>
+                        </pic:blipFill>
+                        <pic:spPr>
+                          <a:xfrm>
+                            <a:off x="0" y="0"/>
+                            <a:ext cx="4709160" cy="3949759"/>
+                          </a:xfrm>
+                          <a:prstGeom prst="rect">
+                            <a:avLst/>
+                          </a:prstGeom>
+                        </pic:spPr>
+                      </pic:pic>
+                    </a:graphicData>
+                  </a:graphic>
+                </wp:inline>
+              </w:drawing>
+            </w:r>
+          </w:p>
+          <w:p>
+            <w:pPr>
+              <w:pStyle w:val="Caption"/>
+              <w:keepLines/>
+              <w:bidi/>
+              <w:spacing w:before="40" w:after="60"/>
+              <w:jc w:val="center"/>
+            </w:pPr>
+            <w:r>
+              <w:rPr>
+                <w:rFonts w:ascii="Noto Naskh Arabic" w:hAnsi="Noto Naskh Arabic" w:cs="Noto Naskh Arabic"/>
+              </w:rPr>
+              <w:t>شکل 3-1 (ج): نتیجه متناظر شیفت راست در Logisim؛ مقدار رجیستر پس از کلاک 0101 است.</w:t>
+            </w:r>
+          </w:p>
+        </w:tc>
+      </w:tr>
+    </w:tbl>
+    <w:p>
+      <w:pPr>
+        <w:keepNext/>
+        <w:pageBreakBefore/>
+        <w:bidi/>
+        <w:rPr>
+          <w:rFonts w:cs="B Yekan"/>
+          <w:sz w:val="28"/>
+          <w:szCs w:val="28"/>
+          <w:rtl/>
+          <w:lang w:bidi="fa-IR"/>
+        </w:rPr>
+      </w:pPr>
+      <w:r>
+        <w:rPr>
+          <w:rFonts w:cs="B Yekan" w:hint="cs"/>
+          <w:sz w:val="28"/>
+          <w:szCs w:val="28"/>
+          <w:rtl/>
+          <w:lang w:bidi="fa-IR"/>
+        </w:rPr>
+        <w:lastRenderedPageBreak/>
+        <w:t>بخش چهارم:</w:t>
+      </w:r>
+    </w:p>
+    <w:p>
+      <w:pPr>
+        <w:bidi/>
+        <w:rPr>
+          <w:rFonts w:cs="B Yekan"/>
+          <w:sz w:val="28"/>
+          <w:szCs w:val="28"/>
+          <w:lang w:bidi="fa-IR"/>
+        </w:rPr>
+      </w:pPr>
+      <w:r>
+        <w:rPr>
+          <w:rFonts w:cs="B Yekan" w:hint="cs"/>
+          <w:sz w:val="28"/>
+          <w:szCs w:val="28"/>
+          <w:rtl/>
+          <w:lang w:bidi="fa-IR"/>
+        </w:rPr>
+        <w:t>تبدیل مدار به شیفت رجیستر دو طرفه:</w:t>
+      </w:r>
+    </w:p>
+    <w:p>
+      <w:pPr>
+        <w:bidi/>
+        <w:rPr>
+          <w:rFonts w:cs="B Nazanin"/>
+          <w:sz w:val="22"/>
+          <w:szCs w:val="22"/>
+          <w:rtl/>
+          <w:lang w:bidi="fa-IR"/>
+        </w:rPr>
+      </w:pPr>
+      <w:r>
+        <w:rPr>
+          <w:rFonts w:cs="B Nazanin" w:hint="cs"/>
+          <w:sz w:val="22"/>
+          <w:szCs w:val="22"/>
+          <w:rtl/>
+          <w:lang w:bidi="fa-IR"/>
+        </w:rPr>
+        <w:t xml:space="preserve">به دلیل اینکه دیگر مدار قابلیت بارگذاری موازی را ندارد پس ورودی های </w:t>
+      </w:r>
+      <w:r>
+        <w:rPr>
+          <w:rFonts w:cs="B Nazanin"/>
+          <w:sz w:val="22"/>
+          <w:szCs w:val="22"/>
+          <w:lang w:bidi="fa-IR"/>
+        </w:rPr>
+        <w:t>A</w:t>
+      </w:r>
+      <w:r>
+        <w:rPr>
+          <w:rFonts w:cs="B Nazanin" w:hint="cs"/>
+          <w:sz w:val="22"/>
+          <w:szCs w:val="22"/>
+          <w:rtl/>
+          <w:lang w:bidi="fa-IR"/>
+        </w:rPr>
+        <w:t xml:space="preserve"> تا</w:t>
+      </w:r>
+      <w:r>
+        <w:rPr>
+          <w:rFonts w:cs="B Nazanin"/>
+          <w:sz w:val="22"/>
+          <w:szCs w:val="22"/>
+          <w:lang w:bidi="fa-IR"/>
+        </w:rPr>
+        <w:t xml:space="preserve">D </w:t>
+      </w:r>
+      <w:r>
+        <w:rPr>
+          <w:rFonts w:cs="B Nazanin" w:hint="cs"/>
+          <w:sz w:val="22"/>
+          <w:szCs w:val="22"/>
+          <w:rtl/>
+          <w:lang w:bidi="fa-IR"/>
+        </w:rPr>
+        <w:t xml:space="preserve"> را از مدار جدا می کنیم.</w:t>
+      </w:r>
+      <w:r>
+        <w:rPr>
+          <w:rFonts w:cs="B Nazanin" w:hint="cs"/>
+          <w:sz w:val="22"/>
+          <w:szCs w:val="22"/>
+          <w:rtl/>
+          <w:lang w:bidi="fa-IR"/>
+        </w:rPr>
+        <w:t xml:space="preserve"> می دانیم وقتی بیت مود برابر صفر باشد گیت های </w:t>
+      </w:r>
+      <w:r>
+        <w:rPr>
+          <w:rFonts w:cs="B Nazanin"/>
+          <w:sz w:val="22"/>
+          <w:szCs w:val="22"/>
+          <w:lang w:bidi="fa-IR"/>
+        </w:rPr>
+        <w:t xml:space="preserve">AND </w:t>
+      </w:r>
+      <w:r>
+        <w:rPr>
+          <w:rFonts w:cs="B Nazanin" w:hint="cs"/>
+          <w:sz w:val="22"/>
+          <w:szCs w:val="22"/>
+          <w:rtl/>
+          <w:lang w:bidi="fa-IR"/>
+        </w:rPr>
+        <w:t xml:space="preserve"> پایین فعال هستند پس به هر کدام از این گیت ها خروجی فلیپ فلاپ </w:t>
+      </w:r>
+      <w:r>
+        <w:rPr>
+          <w:rFonts w:cs="B Nazanin" w:hint="cs"/>
+          <w:sz w:val="22"/>
+          <w:szCs w:val="22"/>
+          <w:rtl/>
+          <w:lang w:bidi="fa-IR"/>
+        </w:rPr>
+        <w:t>پایینی</w:t>
+      </w:r>
+      <w:r>
+        <w:rPr>
+          <w:rFonts w:cs="B Nazanin" w:hint="cs"/>
+          <w:sz w:val="22"/>
+          <w:szCs w:val="22"/>
+          <w:rtl/>
+          <w:lang w:bidi="fa-IR"/>
+        </w:rPr>
+        <w:t xml:space="preserve"> را متصل می کنیم ،چون بیت کم ارزش فلیپ فلاپی قبل از خود ندارد ، در این مورد از ورودی </w:t>
+      </w:r>
+      <w:r>
+        <w:rPr>
+          <w:rFonts w:cs="B Nazanin"/>
+          <w:sz w:val="22"/>
+          <w:szCs w:val="22"/>
+          <w:lang w:bidi="fa-IR"/>
+        </w:rPr>
+        <w:t>s_in</w:t>
+      </w:r>
+      <w:r>
+        <w:rPr>
+          <w:rFonts w:cs="B Nazanin" w:hint="cs"/>
+          <w:sz w:val="22"/>
+          <w:szCs w:val="22"/>
+          <w:rtl/>
+          <w:lang w:bidi="fa-IR"/>
+        </w:rPr>
+        <w:t xml:space="preserve"> استفاده می کنیم.</w:t>
+      </w:r>
+      <w:r>
+        <w:rPr>
+          <w:rFonts w:cs="B Nazanin" w:hint="cs"/>
+          <w:sz w:val="22"/>
+          <w:szCs w:val="22"/>
+          <w:rtl/>
+          <w:lang w:bidi="fa-IR"/>
+        </w:rPr>
+        <w:t xml:space="preserve"> از طرفی اگر بیت مود برابر یک باشد گیت‌های </w:t>
+      </w:r>
+      <w:r>
+        <w:rPr>
+          <w:rFonts w:cs="B Nazanin"/>
+          <w:sz w:val="22"/>
+          <w:szCs w:val="22"/>
+          <w:lang w:bidi="fa-IR"/>
+        </w:rPr>
         <w:t>AND</w:t>
       </w:r>
       <w:r>
         <w:rPr>
           <w:rFonts w:cs="B Nazanin" w:hint="cs"/>
-          <w:rtl/>
-          <w:lang w:bidi="fa-IR"/>
-        </w:rPr>
-        <w:t xml:space="preserve"> پایین فعال شده و ورودی های فلیپ فلاپ های قبلی وارد </w:t>
-      </w:r>
+          <w:sz w:val="22"/>
+          <w:szCs w:val="22"/>
+          <w:rtl/>
+          <w:lang w:bidi="fa-IR"/>
+        </w:rPr>
+        <w:t xml:space="preserve"> بالایی فعالند پس خروجی فلیپ فلاپ بالایی را به آنها وصل می‌کنیم.</w:t>
+      </w:r>
+    </w:p>
+    <w:p>
+      <w:pPr>
+        <w:bidi/>
+        <w:rPr>
+          <w:rFonts w:cs="B Nazanin"/>
+          <w:sz w:val="22"/>
+          <w:szCs w:val="22"/>
+          <w:rtl/>
+          <w:lang w:bidi="fa-IR"/>
+        </w:rPr>
+      </w:pPr>
       <w:r>
         <w:rPr>
           <w:rFonts w:cs="B Nazanin" w:hint="cs"/>
-          <w:rtl/>
-          <w:lang w:bidi="fa-IR"/>
-        </w:rPr>
-        <w:t xml:space="preserve">فلیپ فلاپ بعدی می شوند و ورودی </w:t>
-      </w:r>
-      <w:proofErr w:type="spellStart"/>
-      <w:r>
+          <w:sz w:val="22"/>
+          <w:szCs w:val="22"/>
+          <w:rtl/>
+          <w:lang w:bidi="fa-IR"/>
+        </w:rPr>
+        <w:t xml:space="preserve"> در این حالت هنگامی که بیت مود برابر صفر است ، شیفت به </w:t>
+      </w:r>
+      <w:r>
+        <w:rPr>
+          <w:rFonts w:cs="B Nazanin" w:hint="cs"/>
+          <w:sz w:val="22"/>
+          <w:szCs w:val="22"/>
+          <w:rtl/>
+          <w:lang w:bidi="fa-IR"/>
+        </w:rPr>
+        <w:t>راست</w:t>
+      </w:r>
+      <w:r>
+        <w:rPr>
+          <w:rFonts w:cs="B Nazanin" w:hint="cs"/>
+          <w:sz w:val="22"/>
+          <w:szCs w:val="22"/>
+          <w:rtl/>
+          <w:lang w:bidi="fa-IR"/>
+        </w:rPr>
+        <w:t xml:space="preserve"> اتفاق می افتد </w:t>
+      </w:r>
+      <w:r>
+        <w:rPr>
+          <w:rFonts w:cs="B Nazanin" w:hint="cs"/>
+          <w:sz w:val="22"/>
+          <w:szCs w:val="22"/>
+          <w:rtl/>
+          <w:lang w:bidi="fa-IR"/>
+        </w:rPr>
+        <w:t>و هنگامی که بیت مود برابر یک است شیفت به چپ.</w:t>
+      </w:r>
+      <w:r>
+        <w:rPr>
+          <w:rFonts w:cs="B Nazanin" w:hint="cs"/>
+          <w:sz w:val="22"/>
+          <w:szCs w:val="22"/>
+          <w:rtl/>
+          <w:lang w:bidi="fa-IR"/>
+        </w:rPr>
+        <w:t xml:space="preserve"> شکل کلی مدار در شکل 4-1 مشخص است .</w:t>
+      </w:r>
+    </w:p>
+    <w:p>
+      <w:pPr>
+        <w:spacing w:after="40"/>
+      </w:pPr>
+    </w:p>
+    <w:tbl>
+      <w:tblPr>
+        <w:tblW w:w="0" w:type="auto"/>
+        <w:jc w:val="center"/>
+        <w:tblBorders>
+          <w:top w:val="nil"/>
+          <w:left w:val="nil"/>
+          <w:bottom w:val="nil"/>
+          <w:right w:val="nil"/>
+          <w:insideH w:val="nil"/>
+          <w:insideV w:val="nil"/>
+        </w:tblBorders>
+        <w:tblLayout w:type="fixed"/>
+        <w:tblLook w:val="04A0" w:firstRow="1" w:lastRow="0" w:firstColumn="1" w:lastColumn="0" w:noHBand="0" w:noVBand="1"/>
+      </w:tblPr>
+      <w:tblGrid>
+        <w:gridCol w:w="4464"/>
+        <w:gridCol w:w="4536"/>
+      </w:tblGrid>
+      <w:tr>
+        <w:trPr>
+          <w:cantSplit/>
+          <w:jc w:val="center"/>
+        </w:trPr>
+        <w:tc>
+          <w:tcPr>
+            <w:tcW w:w="9000" w:type="dxa"/>
+            <w:gridSpan w:val="2"/>
+            <w:tcMar>
+              <w:top w:w="50" w:type="dxa"/>
+              <w:left w:w="60" w:type="dxa"/>
+              <w:bottom w:w="50" w:type="dxa"/>
+              <w:right w:w="60" w:type="dxa"/>
+            </w:tcMar>
+            <w:vAlign w:val="center"/>
+          </w:tcPr>
+          <w:p>
+            <w:pPr>
+              <w:spacing w:after="20"/>
+              <w:jc w:val="center"/>
+            </w:pPr>
+            <w:r>
+              <w:rPr>
+                <w:noProof/>
+              </w:rPr>
+              <w:drawing>
+                <wp:inline distT="0" distB="0" distL="0" distR="0" wp14:anchorId="188DA9D3" wp14:editId="0DB8AF6A">
+                  <wp:extent cx="4434840" cy="4200167"/>
+                  <wp:effectExtent l="0" t="0" r="0" b="0"/>
+                  <wp:docPr id="1059743673" name="Picture 1059743673"/>
+                  <wp:cNvGraphicFramePr>
+                    <a:graphicFrameLocks xmlns:a="http://schemas.openxmlformats.org/drawingml/2006/main" noChangeAspect="1"/>
+                  </wp:cNvGraphicFramePr>
+                  <a:graphic xmlns:a="http://schemas.openxmlformats.org/drawingml/2006/main">
+                    <a:graphicData uri="http://schemas.openxmlformats.org/drawingml/2006/picture">
+                      <pic:pic xmlns:pic="http://schemas.openxmlformats.org/drawingml/2006/picture">
+                        <pic:nvPicPr>
+                          <pic:cNvPr id="0" name="p68_0_rId16_926x877.png"/>
+                          <pic:cNvPicPr/>
+                        </pic:nvPicPr>
+                        <pic:blipFill>
+                          <a:blip r:embed="rId17"/>
+                          <a:stretch>
+                            <a:fillRect/>
+                          </a:stretch>
+                        </pic:blipFill>
+                        <pic:spPr>
+                          <a:xfrm>
+                            <a:off x="0" y="0"/>
+                            <a:ext cx="4434840" cy="4200167"/>
+                          </a:xfrm>
+                          <a:prstGeom prst="rect">
+                            <a:avLst/>
+                          </a:prstGeom>
+                        </pic:spPr>
+                      </pic:pic>
+                    </a:graphicData>
+                  </a:graphic>
+                </wp:inline>
+              </w:drawing>
+            </w:r>
+          </w:p>
+          <w:p>
+            <w:pPr>
+              <w:pStyle w:val="Caption"/>
+              <w:keepLines/>
+              <w:bidi/>
+              <w:spacing w:before="40" w:after="60"/>
+              <w:jc w:val="center"/>
+              <w:rPr>
+                <w:rFonts w:cs="B Nazanin"/>
+                <w:i w:val="0"/>
+                <w:iCs w:val="0"/>
+                <w:rtl/>
+                <w:lang w:bidi="fa-IR"/>
+              </w:rPr>
+            </w:pPr>
+            <w:r>
+              <w:rPr>
+                <w:rFonts w:ascii="Noto Naskh Arabic" w:hAnsi="Noto Naskh Arabic" w:cs="B Nazanin" w:hint="cs"/>
+                <w:i w:val="0"/>
+                <w:iCs w:val="0"/>
+                <w:sz w:val="17"/>
+                <w:rtl/>
+                <w:lang w:bidi="fa-IR"/>
+              </w:rPr>
+              <w:t>شکل مدار شیفت رجیستر با قابلیت شیفت به راست و چپ</w:t>
+            </w:r>
+          </w:p>
+        </w:tc>
+      </w:tr>
+      <w:tr>
+        <w:trPr>
+          <w:cantSplit/>
+          <w:jc w:val="center"/>
+        </w:trPr>
+        <w:tc>
+          <w:tcPr>
+            <w:tcW w:w="4464" w:type="dxa"/>
+            <w:tcMar>
+              <w:top w:w="50" w:type="dxa"/>
+              <w:left w:w="60" w:type="dxa"/>
+              <w:bottom w:w="50" w:type="dxa"/>
+              <w:right w:w="60" w:type="dxa"/>
+            </w:tcMar>
+            <w:vAlign w:val="center"/>
+          </w:tcPr>
+          <w:p>
+            <w:pPr>
+              <w:spacing w:after="20"/>
+              <w:jc w:val="center"/>
+            </w:pPr>
+            <w:r>
+              <w:rPr>
+                <w:noProof/>
+              </w:rPr>
+              <w:lastRenderedPageBreak/>
+              <w:drawing>
+                <wp:inline distT="0" distB="0" distL="0" distR="0" wp14:anchorId="012E2BFC" wp14:editId="635A180B">
+                  <wp:extent cx="2514600" cy="2399663"/>
+                  <wp:effectExtent l="0" t="0" r="0" b="0"/>
+                  <wp:docPr id="1059743675" name="Picture 1059743675"/>
+                  <wp:cNvGraphicFramePr>
+                    <a:graphicFrameLocks xmlns:a="http://schemas.openxmlformats.org/drawingml/2006/main" noChangeAspect="1"/>
+                  </wp:cNvGraphicFramePr>
+                  <a:graphic xmlns:a="http://schemas.openxmlformats.org/drawingml/2006/main">
+                    <a:graphicData uri="http://schemas.openxmlformats.org/drawingml/2006/picture">
+                      <pic:pic xmlns:pic="http://schemas.openxmlformats.org/drawingml/2006/picture">
+                        <pic:nvPicPr>
+                          <pic:cNvPr id="0" name="p69_1_rId18_897x856.png"/>
+                          <pic:cNvPicPr/>
+                        </pic:nvPicPr>
+                        <pic:blipFill>
+                          <a:blip r:embed="rId18"/>
+                          <a:stretch>
+                            <a:fillRect/>
+                          </a:stretch>
+                        </pic:blipFill>
+                        <pic:spPr>
+                          <a:xfrm>
+                            <a:off x="0" y="0"/>
+                            <a:ext cx="2514600" cy="2399663"/>
+                          </a:xfrm>
+                          <a:prstGeom prst="rect">
+                            <a:avLst/>
+                          </a:prstGeom>
+                        </pic:spPr>
+                      </pic:pic>
+                    </a:graphicData>
+                  </a:graphic>
+                </wp:inline>
+              </w:drawing>
+            </w:r>
+          </w:p>
+          <w:p>
+            <w:pPr>
+              <w:pStyle w:val="Caption"/>
+              <w:keepLines/>
+              <w:bidi/>
+              <w:spacing w:before="40" w:after="60"/>
+              <w:jc w:val="center"/>
+              <w:rPr>
+                <w:rFonts w:cs="B Nazanin"/>
+                <w:i w:val="0"/>
+                <w:iCs w:val="0"/>
+              </w:rPr>
+            </w:pPr>
+            <w:r>
+              <w:rPr>
+                <w:rFonts w:ascii="Noto Naskh Arabic" w:hAnsi="Noto Naskh Arabic" w:cs="Noto Naskh Arabic"/>
+                <w:sz w:val="16"/>
+              </w:rPr>
+              <w:t xml:space="preserve"> </w:t>
+            </w:r>
+            <w:r>
+              <w:rPr>
+                <w:rFonts w:ascii="Noto Naskh Arabic" w:hAnsi="Noto Naskh Arabic" w:cs="B Nazanin" w:hint="cs"/>
+                <w:i w:val="0"/>
+                <w:iCs w:val="0"/>
+                <w:sz w:val="16"/>
+                <w:rtl/>
+              </w:rPr>
+              <w:t xml:space="preserve">شکل مدار بعد از شیفت به </w:t>
+            </w:r>
+            <w:r>
+              <w:rPr>
+                <w:rFonts w:ascii="Noto Naskh Arabic" w:hAnsi="Noto Naskh Arabic" w:cs="B Nazanin" w:hint="cs"/>
+                <w:i w:val="0"/>
+                <w:iCs w:val="0"/>
+                <w:sz w:val="16"/>
+                <w:rtl/>
+                <w:lang w:bidi="fa-IR"/>
+              </w:rPr>
+              <w:t>چپ</w:t>
+            </w:r>
+            <w:r>
+              <w:rPr>
+                <w:rFonts w:ascii="Noto Naskh Arabic" w:hAnsi="Noto Naskh Arabic" w:cs="B Nazanin" w:hint="cs"/>
+                <w:i w:val="0"/>
+                <w:iCs w:val="0"/>
+                <w:sz w:val="16"/>
+                <w:rtl/>
+              </w:rPr>
+              <w:t xml:space="preserve"> با </w:t>
+            </w:r>
+            <m:oMath>
+              <m:sSub>
+                <m:sSubPr>
+                  <m:ctrlPr>
+                    <w:rPr>
+                      <w:rFonts w:ascii="Cambria Math" w:hAnsi="Cambria Math" w:cs="B Nazanin"/>
+                      <w:iCs w:val="0"/>
+                      <w:sz w:val="16"/>
+                    </w:rPr>
+                  </m:ctrlPr>
+                </m:sSubPr>
+                <m:e>
+                  <m:r>
+                    <w:rPr>
+                      <w:rFonts w:ascii="Cambria Math" w:hAnsi="Cambria Math" w:cs="B Nazanin"/>
+                      <w:sz w:val="16"/>
+                    </w:rPr>
+                    <m:t>S</m:t>
+                  </m:r>
+                </m:e>
+                <m:sub>
+                  <m:r>
+                    <w:rPr>
+                      <w:rFonts w:ascii="Cambria Math" w:hAnsi="Cambria Math" w:cs="B Nazanin"/>
+                      <w:sz w:val="16"/>
+                    </w:rPr>
+                    <m:t>in</m:t>
+                  </m:r>
+                </m:sub>
+              </m:sSub>
+              <m:r>
+                <w:rPr>
+                  <w:rFonts w:ascii="Cambria Math" w:hAnsi="Cambria Math" w:cs="B Nazanin"/>
+                  <w:sz w:val="16"/>
+                </w:rPr>
+                <m:t>=1</m:t>
+              </m:r>
+            </m:oMath>
+          </w:p>
+        </w:tc>
+        <w:tc>
+          <w:tcPr>
+            <w:tcW w:w="4464" w:type="dxa"/>
+            <w:tcMar>
+              <w:top w:w="50" w:type="dxa"/>
+              <w:left w:w="60" w:type="dxa"/>
+              <w:bottom w:w="50" w:type="dxa"/>
+              <w:right w:w="60" w:type="dxa"/>
+            </w:tcMar>
+            <w:vAlign w:val="center"/>
+          </w:tcPr>
+          <w:p>
+            <w:pPr>
+              <w:spacing w:after="20"/>
+              <w:jc w:val="center"/>
+            </w:pPr>
+            <w:r>
+              <w:rPr>
+                <w:noProof/>
+              </w:rPr>
+              <w:drawing>
+                <wp:inline distT="0" distB="0" distL="0" distR="0" wp14:anchorId="1259525D" wp14:editId="07B97C1A">
+                  <wp:extent cx="2514600" cy="2419180"/>
+                  <wp:effectExtent l="0" t="0" r="0" b="0"/>
+                  <wp:docPr id="1059743674" name="Picture 1059743674"/>
+                  <wp:cNvGraphicFramePr>
+                    <a:graphicFrameLocks xmlns:a="http://schemas.openxmlformats.org/drawingml/2006/main" noChangeAspect="1"/>
+                  </wp:cNvGraphicFramePr>
+                  <a:graphic xmlns:a="http://schemas.openxmlformats.org/drawingml/2006/main">
+                    <a:graphicData uri="http://schemas.openxmlformats.org/drawingml/2006/picture">
+                      <pic:pic xmlns:pic="http://schemas.openxmlformats.org/drawingml/2006/picture">
+                        <pic:nvPicPr>
+                          <pic:cNvPr id="0" name="p69_0_rId17_896x862.png"/>
+                          <pic:cNvPicPr/>
+                        </pic:nvPicPr>
+                        <pic:blipFill>
+                          <a:blip r:embed="rId19"/>
+                          <a:stretch>
+                            <a:fillRect/>
+                          </a:stretch>
+                        </pic:blipFill>
+                        <pic:spPr>
+                          <a:xfrm>
+                            <a:off x="0" y="0"/>
+                            <a:ext cx="2514600" cy="2419180"/>
+                          </a:xfrm>
+                          <a:prstGeom prst="rect">
+                            <a:avLst/>
+                          </a:prstGeom>
+                        </pic:spPr>
+                      </pic:pic>
+                    </a:graphicData>
+                  </a:graphic>
+                </wp:inline>
+              </w:drawing>
+            </w:r>
+          </w:p>
+          <w:p>
+            <w:pPr>
+              <w:pStyle w:val="Caption"/>
+              <w:keepLines/>
+              <w:bidi/>
+              <w:spacing w:before="40" w:after="60"/>
+              <w:jc w:val="center"/>
+              <w:rPr>
+                <w:rFonts w:cs="B Nazanin"/>
+                <w:i w:val="0"/>
+                <w:iCs w:val="0"/>
+              </w:rPr>
+            </w:pPr>
+            <w:r>
+              <w:rPr>
+                <w:rFonts w:cs="B Nazanin" w:hint="cs"/>
+                <w:i w:val="0"/>
+                <w:iCs w:val="0"/>
+                <w:rtl/>
+              </w:rPr>
+              <w:t xml:space="preserve">شکل مدار بعد از شیفت به راست با </w:t>
+            </w:r>
+            <m:oMath>
+              <m:sSub>
+                <m:sSubPr>
+                  <m:ctrlPr>
+                    <w:rPr>
+                      <w:rFonts w:ascii="Cambria Math" w:hAnsi="Cambria Math" w:cs="B Nazanin"/>
+                      <w:iCs w:val="0"/>
+                    </w:rPr>
+                  </m:ctrlPr>
+                </m:sSubPr>
+                <m:e>
+                  <m:r>
+                    <w:rPr>
+                      <w:rFonts w:ascii="Cambria Math" w:hAnsi="Cambria Math" w:cs="B Nazanin"/>
+                    </w:rPr>
+                    <m:t>S</m:t>
+                  </m:r>
+                </m:e>
+                <m:sub>
+                  <m:r>
+                    <w:rPr>
+                      <w:rFonts w:ascii="Cambria Math" w:hAnsi="Cambria Math" w:cs="B Nazanin"/>
+                    </w:rPr>
+                    <m:t>in</m:t>
+                  </m:r>
+                </m:sub>
+              </m:sSub>
+              <m:r>
+                <w:rPr>
+                  <w:rFonts w:ascii="Cambria Math" w:hAnsi="Cambria Math" w:cs="B Nazanin"/>
+                </w:rPr>
+                <m:t>=1</m:t>
+              </m:r>
+            </m:oMath>
+          </w:p>
+        </w:tc>
+      </w:tr>
+    </w:tbl>
+    <w:p>
+      <w:pPr>
+        <w:rPr>
+          <w:rtl/>
+        </w:rPr>
+      </w:pPr>
+    </w:p>
+    <w:p>
+      <w:pPr>
+        <w:rPr>
+          <w:rtl/>
+        </w:rPr>
+      </w:pPr>
+      <w:r>
+        <w:rPr>
+          <w:rtl/>
+        </w:rPr>
+        <w:br w:type="page"/>
+      </w:r>
+    </w:p>
+    <w:p>
+      <w:pPr>
+        <w:tabs>
+          <w:tab w:val="left" w:pos="2096"/>
+        </w:tabs>
+        <w:jc w:val="right"/>
+        <w:rPr>
+          <w:rFonts w:cs="B Yekan"/>
+          <w:b/>
+          <w:bCs/>
+          <w:rtl/>
+          <w:lang w:bidi="fa-IR"/>
+        </w:rPr>
+      </w:pPr>
+      <w:r>
+        <w:rPr>
+          <w:rFonts w:cs="B Yekan" w:hint="cs"/>
+          <w:b/>
+          <w:bCs/>
+          <w:rtl/>
+          <w:lang w:bidi="fa-IR"/>
+        </w:rPr>
+        <w:lastRenderedPageBreak/>
+        <w:t>آزمایش اول:</w:t>
+      </w:r>
+    </w:p>
+    <w:p>
+      <w:pPr>
+        <w:bidi/>
         <w:rPr>
           <w:rFonts w:cs="B Nazanin"/>
           <w:lang w:bidi="fa-IR"/>
         </w:rPr>
-        <w:t>S_in</w:t>
-      </w:r>
-      <w:proofErr w:type="spellEnd"/>
+      </w:pPr>
+    </w:p>
+    <w:p>
+      <w:pPr>
+        <w:bidi/>
+        <w:rPr>
+          <w:rFonts w:cs="B Yekan"/>
+          <w:rtl/>
+          <w:lang w:bidi="fa-IR"/>
+        </w:rPr>
+      </w:pPr>
+      <w:r>
+        <w:rPr>
+          <w:rFonts w:cs="B Yekan" w:hint="cs"/>
+          <w:sz w:val="28"/>
+          <w:szCs w:val="28"/>
+          <w:rtl/>
+          <w:lang w:bidi="fa-IR"/>
+        </w:rPr>
+        <w:t>مقدمه و هدف آزمایش:</w:t>
+      </w:r>
+    </w:p>
+    <w:p>
+      <w:pPr>
+        <w:bidi/>
+        <w:rPr>
+          <w:rFonts w:cs="B Nazanin"/>
+          <w:rtl/>
+          <w:lang w:bidi="fa-IR"/>
+        </w:rPr>
+      </w:pPr>
       <w:r>
         <w:rPr>
           <w:rFonts w:cs="B Nazanin" w:hint="cs"/>
           <w:rtl/>
           <w:lang w:bidi="fa-IR"/>
         </w:rPr>
-        <w:t xml:space="preserve"> </w:t>
-      </w:r>
+        <w:t>هدف از انجام این آزمایش آشنایی با تراشه 7495 است.</w:t>
+      </w:r>
+    </w:p>
+    <w:p>
+      <w:pPr>
+        <w:bidi/>
+        <w:rPr>
+          <w:rFonts w:cs="B Nazanin"/>
+          <w:rtl/>
+          <w:lang w:bidi="fa-IR"/>
+        </w:rPr>
+      </w:pPr>
+    </w:p>
+    <w:p>
+      <w:pPr>
+        <w:bidi/>
+        <w:rPr>
+          <w:rFonts w:cs="B Yekan"/>
+          <w:sz w:val="28"/>
+          <w:szCs w:val="28"/>
+          <w:rtl/>
+          <w:lang w:bidi="fa-IR"/>
+        </w:rPr>
+      </w:pPr>
+      <w:r>
+        <w:rPr>
+          <w:rFonts w:cs="B Yekan" w:hint="cs"/>
+          <w:sz w:val="28"/>
+          <w:szCs w:val="28"/>
+          <w:rtl/>
+          <w:lang w:bidi="fa-IR"/>
+        </w:rPr>
+        <w:t>بخش اول:</w:t>
+      </w:r>
+    </w:p>
+    <w:p>
+      <w:pPr>
+        <w:bidi/>
+        <w:rPr>
+          <w:rFonts w:cs="B Yekan"/>
+          <w:sz w:val="28"/>
+          <w:szCs w:val="28"/>
+          <w:rtl/>
+          <w:lang w:bidi="fa-IR"/>
+        </w:rPr>
+      </w:pPr>
+      <w:r>
+        <w:rPr>
+          <w:rFonts w:cs="B Yekan" w:hint="cs"/>
+          <w:sz w:val="28"/>
+          <w:szCs w:val="28"/>
+          <w:rtl/>
+          <w:lang w:bidi="fa-IR"/>
+        </w:rPr>
+        <w:t>ساخت شیفت رجیستر چهار بیتی با قابلیت بارگذاری موازی با استفاده از تراشه:</w:t>
+      </w:r>
+    </w:p>
+    <w:p>
+      <w:pPr>
+        <w:bidi/>
+        <w:rPr>
+          <w:rFonts w:eastAsiaTheme="minorEastAsia" w:cs="B Nazanin"/>
+          <w:i/>
+          <w:rtl/>
+          <w:lang w:bidi="fa-IR"/>
+        </w:rPr>
+      </w:pPr>
       <w:r>
         <w:rPr>
           <w:rFonts w:cs="B Nazanin" w:hint="cs"/>
           <w:rtl/>
           <w:lang w:bidi="fa-IR"/>
         </w:rPr>
-        <w:t>نیز وارد فلیپ فلاپ اول می شود و شیفت اتفاق می افتد. (شکل 1-1)</w:t>
-      </w:r>
-    </w:p>
-    <w:p>
-      <w:pPr>
-        <w:jc w:val="right"/>
+        <w:t>ورودی‌ها را به ورودی‌های</w:t>
+      </w:r>
+      <m:oMath>
+        <m:sSub>
+          <m:sSubPr>
+            <m:ctrlPr>
+              <w:rPr>
+                <w:rFonts w:ascii="Cambria Math" w:hAnsi="Cambria Math" w:cs="B Nazanin"/>
+                <w:i/>
+                <w:lang w:bidi="fa-IR"/>
+              </w:rPr>
+            </m:ctrlPr>
+          </m:sSubPr>
+          <m:e>
+            <m:r>
+              <w:rPr>
+                <w:rFonts w:ascii="Cambria Math" w:hAnsi="Cambria Math" w:cs="B Nazanin"/>
+                <w:lang w:bidi="fa-IR"/>
+              </w:rPr>
+              <m:t>D</m:t>
+            </m:r>
+          </m:e>
+          <m:sub>
+            <m:r>
+              <w:rPr>
+                <w:rFonts w:ascii="Cambria Math" w:hAnsi="Cambria Math" w:cs="B Nazanin"/>
+                <w:lang w:bidi="fa-IR"/>
+              </w:rPr>
+              <m:t>0</m:t>
+            </m:r>
+          </m:sub>
+        </m:sSub>
+        <m:r>
+          <w:rPr>
+            <w:rFonts w:ascii="Cambria Math" w:hAnsi="Cambria Math" w:cs="B Nazanin"/>
+            <w:lang w:bidi="fa-IR"/>
+          </w:rPr>
+          <m:t xml:space="preserve"> </m:t>
+        </m:r>
+      </m:oMath>
+      <w:r>
+        <w:rPr>
+          <w:rFonts w:eastAsiaTheme="minorEastAsia" w:cs="B Nazanin" w:hint="cs"/>
+          <w:rtl/>
+          <w:lang w:bidi="fa-IR"/>
+        </w:rPr>
+        <w:t xml:space="preserve"> تا</w:t>
+      </w:r>
+      <m:oMath>
+        <m:sSub>
+          <m:sSubPr>
+            <m:ctrlPr>
+              <w:rPr>
+                <w:rFonts w:ascii="Cambria Math" w:eastAsiaTheme="minorEastAsia" w:hAnsi="Cambria Math" w:cs="B Nazanin"/>
+                <w:i/>
+                <w:lang w:bidi="fa-IR"/>
+              </w:rPr>
+            </m:ctrlPr>
+          </m:sSubPr>
+          <m:e>
+            <m:r>
+              <w:rPr>
+                <w:rFonts w:ascii="Cambria Math" w:eastAsiaTheme="minorEastAsia" w:hAnsi="Cambria Math" w:cs="B Nazanin"/>
+                <w:lang w:bidi="fa-IR"/>
+              </w:rPr>
+              <m:t>D</m:t>
+            </m:r>
+          </m:e>
+          <m:sub>
+            <m:r>
+              <w:rPr>
+                <w:rFonts w:ascii="Cambria Math" w:eastAsiaTheme="minorEastAsia" w:hAnsi="Cambria Math" w:cs="B Nazanin"/>
+                <w:lang w:bidi="fa-IR"/>
+              </w:rPr>
+              <m:t>3</m:t>
+            </m:r>
+          </m:sub>
+        </m:sSub>
+        <m:r>
+          <w:rPr>
+            <w:rFonts w:ascii="Cambria Math" w:eastAsiaTheme="minorEastAsia" w:hAnsi="Cambria Math" w:cs="B Nazanin"/>
+            <w:lang w:bidi="fa-IR"/>
+          </w:rPr>
+          <m:t xml:space="preserve"> </m:t>
+        </m:r>
+      </m:oMath>
+      <w:r>
+        <w:rPr>
+          <w:rFonts w:eastAsiaTheme="minorEastAsia" w:cs="B Nazanin" w:hint="cs"/>
+          <w:rtl/>
+          <w:lang w:bidi="fa-IR"/>
+        </w:rPr>
+        <w:t xml:space="preserve"> تراشه می‌دهیم. با فشردن دکمه‌ای که به </w:t>
+      </w:r>
+      <w:r>
+        <w:rPr>
+          <w:rFonts w:eastAsiaTheme="minorEastAsia" w:cs="B Nazanin"/>
+          <w:lang w:bidi="fa-IR"/>
+        </w:rPr>
+        <w:t>SR</w:t>
+      </w:r>
+      <w:r>
+        <w:rPr>
+          <w:rFonts w:eastAsiaTheme="minorEastAsia" w:cs="B Nazanin" w:hint="cs"/>
+          <w:rtl/>
+          <w:lang w:bidi="fa-IR"/>
+        </w:rPr>
+        <w:t xml:space="preserve"> و </w:t>
+      </w:r>
+      <w:r>
+        <w:rPr>
+          <w:rFonts w:eastAsiaTheme="minorEastAsia" w:cs="B Nazanin"/>
+          <w:lang w:bidi="fa-IR"/>
+        </w:rPr>
+        <w:t>SL</w:t>
+      </w:r>
+      <w:r>
+        <w:rPr>
+          <w:rFonts w:eastAsiaTheme="minorEastAsia" w:cs="B Nazanin" w:hint="cs"/>
+          <w:rtl/>
+          <w:lang w:bidi="fa-IR"/>
+        </w:rPr>
+        <w:t xml:space="preserve"> متصل است اگر مود برابر</w:t>
+      </w:r>
+      <w:r>
+        <w:rPr>
+          <w:rFonts w:eastAsiaTheme="minorEastAsia" w:cs="B Nazanin" w:hint="cs"/>
+          <w:rtl/>
+          <w:lang w:bidi="fa-IR"/>
+        </w:rPr>
+        <w:t xml:space="preserve"> یک باشد ورودی ها به طور موازی لود می‌شوند و اگر مود برابر صفر باشد</w:t>
+      </w:r>
+      <w:r>
+        <w:rPr>
+          <w:rFonts w:eastAsiaTheme="minorEastAsia" w:cs="B Nazanin" w:hint="cs"/>
+          <w:rtl/>
+          <w:lang w:bidi="fa-IR"/>
+        </w:rPr>
+        <w:t xml:space="preserve"> ورودی </w:t>
+      </w:r>
+      <m:oMath>
+        <m:sSub>
+          <m:sSubPr>
+            <m:ctrlPr>
+              <w:rPr>
+                <w:rFonts w:ascii="Cambria Math" w:eastAsiaTheme="minorEastAsia" w:hAnsi="Cambria Math" w:cs="B Nazanin"/>
+                <w:i/>
+                <w:lang w:bidi="fa-IR"/>
+              </w:rPr>
+            </m:ctrlPr>
+          </m:sSubPr>
+          <m:e>
+            <m:r>
+              <w:rPr>
+                <w:rFonts w:ascii="Cambria Math" w:eastAsiaTheme="minorEastAsia" w:hAnsi="Cambria Math" w:cs="B Nazanin"/>
+                <w:lang w:bidi="fa-IR"/>
+              </w:rPr>
+              <m:t>S</m:t>
+            </m:r>
+          </m:e>
+          <m:sub>
+            <m:r>
+              <w:rPr>
+                <w:rFonts w:ascii="Cambria Math" w:eastAsiaTheme="minorEastAsia" w:hAnsi="Cambria Math" w:cs="B Nazanin"/>
+                <w:lang w:bidi="fa-IR"/>
+              </w:rPr>
+              <m:t>in</m:t>
+            </m:r>
+          </m:sub>
+        </m:sSub>
+      </m:oMath>
+      <w:r>
+        <w:rPr>
+          <w:rFonts w:eastAsiaTheme="minorEastAsia" w:cs="B Nazanin" w:hint="cs"/>
+          <w:rtl/>
+          <w:lang w:bidi="fa-IR"/>
+        </w:rPr>
+        <w:t xml:space="preserve"> وارد رجیس</w:t>
+      </w:r>
+      <w:r>
+        <w:rPr>
+          <w:rFonts w:eastAsiaTheme="minorEastAsia" w:cs="B Nazanin" w:hint="cs"/>
+          <w:rtl/>
+          <w:lang w:bidi="fa-IR"/>
+        </w:rPr>
+        <w:t>تر شده و بیت ها به راست شیفت می‌خورند.</w:t>
+      </w:r>
+    </w:p>
+    <w:p>
+      <w:pPr>
+        <w:bidi/>
+        <w:rPr>
+          <w:rFonts w:eastAsiaTheme="minorEastAsia" w:cs="B Nazanin"/>
+          <w:lang w:bidi="fa-IR"/>
+        </w:rPr>
+      </w:pPr>
+    </w:p>
+    <w:p>
+      <w:pPr>
+        <w:jc w:val="center"/>
         <w:rPr>
           <w:rFonts w:cs="B Nazanin"/>
-          <w:rtl/>
           <w:lang w:bidi="fa-IR"/>
         </w:rPr>
       </w:pPr>
       <w:r>
         <w:rPr>
           <w:rFonts w:cs="B Nazanin"/>
-          <w:rtl/>
-          <w:lang w:bidi="fa-IR"/>
-        </w:rPr>
-        <w:br w:type="page"/>
-      </w:r>
-    </w:p>
-    <w:p>
-      <w:pPr>
-        <w:bidi/>
-        <w:rPr>
-          <w:rFonts w:cs="B Nazanin" w:hint="cs"/>
-          <w:rtl/>
-          <w:lang w:bidi="fa-IR"/>
-        </w:rPr>
-      </w:pPr>
-      <w:r>
-        <w:rPr>
           <w:noProof/>
-        </w:rPr>
-        <w:lastRenderedPageBreak/>
-        <mc:AlternateContent>
-          <mc:Choice Requires="wps">
-            <w:drawing>
-              <wp:anchor distT="0" distB="0" distL="114300" distR="114300" simplePos="0" relativeHeight="251660288" behindDoc="0" locked="0" layoutInCell="1" allowOverlap="1" wp14:anchorId="5C73F68E" wp14:editId="4E0413CF">
-                <wp:simplePos x="0" y="0"/>
-                <wp:positionH relativeFrom="column">
-                  <wp:posOffset>828675</wp:posOffset>
-                </wp:positionH>
-                <wp:positionV relativeFrom="paragraph">
-                  <wp:posOffset>3267075</wp:posOffset>
-                </wp:positionV>
-                <wp:extent cx="4279900" cy="635"/>
-                <wp:effectExtent l="0" t="0" r="0" b="0"/>
-                <wp:wrapSquare wrapText="bothSides"/>
-                <wp:docPr id="354656472" name="Text Box 1"/>
-                <wp:cNvGraphicFramePr/>
-                <a:graphic xmlns:a="http://schemas.openxmlformats.org/drawingml/2006/main">
-                  <a:graphicData uri="http://schemas.microsoft.com/office/word/2010/wordprocessingShape">
-                    <wps:wsp>
-                      <wps:cNvSpPr txBox="1"/>
-                      <wps:spPr>
-                        <a:xfrm>
-                          <a:off x="0" y="0"/>
-                          <a:ext cx="4279900" cy="635"/>
-                        </a:xfrm>
-                        <a:prstGeom prst="rect">
-                          <a:avLst/>
-                        </a:prstGeom>
-                        <a:solidFill>
-                          <a:prstClr val="white"/>
-                        </a:solidFill>
-                        <a:ln>
-                          <a:noFill/>
-                        </a:ln>
-                      </wps:spPr>
-                      <wps:txbx>
-                        <w:txbxContent>
-                          <w:p>
-                            <w:pPr>
-                              <w:pStyle w:val="Caption"/>
-                              <w:bidi/>
-                              <w:jc w:val="center"/>
-                              <w:rPr>
-                                <w:noProof/>
-                              </w:rPr>
-                            </w:pPr>
-                            <w:r>
-                              <w:rPr>
-                                <w:rFonts w:hint="cs"/>
-                                <w:rtl/>
-                              </w:rPr>
-                              <w:t>شکل</w:t>
-                            </w:r>
-                            <w:r>
-                              <w:rPr>
-                                <w:rtl/>
-                              </w:rPr>
-                              <w:t xml:space="preserve"> 1-</w:t>
-                            </w:r>
-                            <w:r>
-                              <w:rPr>
-                                <w:rFonts w:hint="cs"/>
-                                <w:rtl/>
-                                <w:lang w:bidi="fa-IR"/>
-                              </w:rPr>
-                              <w:t xml:space="preserve">1 </w:t>
-                            </w:r>
-                            <w:r>
-                              <w:rPr>
-                                <w:rFonts w:hint="cs"/>
-                                <w:rtl/>
-                              </w:rPr>
-                              <w:t xml:space="preserve"> ساخت مدار شیفت رجیستر با نرم افزار </w:t>
-                            </w:r>
-                            <w:r>
-                              <w:t>Logisim</w:t>
-                            </w:r>
-                          </w:p>
-                        </w:txbxContent>
-                      </wps:txbx>
-                      <wps:bodyPr rot="0" spcFirstLastPara="0" vertOverflow="overflow" horzOverflow="overflow" vert="horz" wrap="square" lIns="0" tIns="0" rIns="0" bIns="0" numCol="1" spcCol="0" rtlCol="0" fromWordArt="0" anchor="t" anchorCtr="0" forceAA="0" compatLnSpc="1">
-                        <a:prstTxWarp prst="textNoShape">
-                          <a:avLst/>
-                        </a:prstTxWarp>
-                        <a:spAutoFit/>
-                      </wps:bodyPr>
-                    </wps:wsp>
-                  </a:graphicData>
-                </a:graphic>
-              </wp:anchor>
-            </w:drawing>
-          </mc:Choice>
-          <mc:Fallback>
-            <w:pict>
-              <v:shapetype w14:anchorId="5C73F68E" id="_x0000_t202" coordsize="21600,21600" o:spt="202" path="m,l,21600r21600,l21600,xe">
-                <v:stroke joinstyle="miter"/>
-                <v:path gradientshapeok="t" o:connecttype="rect"/>
-              </v:shapetype>
-              <v:shape id="Text Box 1" o:spid="_x0000_s1026" type="#_x0000_t202" style="position:absolute;left:0;text-align:left;margin-left:65.25pt;margin-top:257.25pt;width:337pt;height:.05pt;z-index:251660288;visibility:visible;mso-wrap-style:square;mso-wrap-distance-left:9pt;mso-wrap-distance-top:0;mso-wrap-distance-right:9pt;mso-wrap-distance-bottom:0;mso-position-horizontal:absolute;mso-position-horizontal-relative:text;mso-position-vertical:absolute;mso-position-vertical-relative:text;v-text-anchor:top" o:gfxdata="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" stroked="f">
-                <v:textbox style="mso-fit-shape-to-text:t" inset="0,0,0,0">
-                  <w:txbxContent>
-                    <w:p>
-                      <w:pPr>
-                        <w:pStyle w:val="Caption"/>
-                        <w:bidi/>
-                        <w:jc w:val="center"/>
-                        <w:rPr>
-                          <w:noProof/>
-                        </w:rPr>
-                      </w:pPr>
-                      <w:r>
-                        <w:rPr>
-                          <w:rFonts w:hint="cs"/>
-                          <w:rtl/>
-                        </w:rPr>
-                        <w:t>شکل</w:t>
-                      </w:r>
-                      <w:r>
-                        <w:rPr>
-                          <w:rtl/>
-                        </w:rPr>
-                        <w:t xml:space="preserve"> 1-</w:t>
-                      </w:r>
-                      <w:r>
-                        <w:rPr>
-                          <w:rFonts w:hint="cs"/>
-                          <w:rtl/>
-                          <w:lang w:bidi="fa-IR"/>
-                        </w:rPr>
-                        <w:t xml:space="preserve">1 </w:t>
-                      </w:r>
-                      <w:r>
-                        <w:rPr>
-                          <w:rFonts w:hint="cs"/>
-                          <w:rtl/>
-                        </w:rPr>
-                        <w:t xml:space="preserve"> ساخت مدار شیفت رجیستر با نرم افزار </w:t>
-                      </w:r>
-                      <w:r>
-                        <w:t>Logisim</w:t>
-                      </w:r>
-                    </w:p>
-                  </w:txbxContent>
-                </v:textbox>
-                <w10:wrap type="square"/>
-              </v:shape>
-            </w:pict>
-          </mc:Fallback>
-        </mc:AlternateContent>
-      </w:r>
-      <w:r>
-        <w:rPr>
-          <w:noProof/>
+          <w:lang w:bidi="fa-IR"/>
         </w:rPr>
         <w:drawing>
-          <wp:anchor distT="0" distB="0" distL="114300" distR="114300" simplePos="0" relativeHeight="251658240" behindDoc="0" locked="0" layoutInCell="1" allowOverlap="1" wp14:anchorId="6AFAD642" wp14:editId="6BA29886">
-            <wp:simplePos x="0" y="0"/>
-            <wp:positionH relativeFrom="margin">
-              <wp:align>center</wp:align>
-            </wp:positionH>
-            <wp:positionV relativeFrom="paragraph">
-              <wp:posOffset>0</wp:posOffset>
-            </wp:positionV>
-            <wp:extent cx="4279900" cy="3209925"/>
-            <wp:effectExtent l="0" t="0" r="6350" b="9525"/>
-            <wp:wrapSquare wrapText="bothSides"/>
-            <wp:docPr id="1578674269" name="Picture 1"/>
+          <wp:inline distT="0" distB="0" distL="0" distR="0" wp14:anchorId="7470F7BF" wp14:editId="3D38E560">
+            <wp:extent cx="3399367" cy="1990954"/>
+            <wp:effectExtent l="0" t="0" r="0" b="9525"/>
+            <wp:docPr id="1881029968" name="Picture 1"/>
             <wp:cNvGraphicFramePr>
               <a:graphicFrameLocks xmlns:a="http://schemas.openxmlformats.org/drawingml/2006/main" noChangeAspect="1"/>
             </wp:cNvGraphicFramePr>
@@ -1112,17 +2963,11 @@
               <a:graphicData uri="http://schemas.openxmlformats.org/drawingml/2006/picture">
                 <pic:pic xmlns:pic="http://schemas.openxmlformats.org/drawingml/2006/picture">
                   <pic:nvPicPr>
-                    <pic:cNvPr id="1578674269" name="Picture 1578674269"/>
+                    <pic:cNvPr id="1881029968" name=""/>
                     <pic:cNvPicPr/>
                   </pic:nvPicPr>
                   <pic:blipFill>
-                    <a:blip r:embed="rId8" cstate="print">
-                      <a:extLst>
-                        <a:ext uri="{28A0092B-C50C-407E-A947-70E740481C1C}">
-                          <a14:useLocalDpi xmlns:a14="http://schemas.microsoft.com/office/drawing/2010/main" val="0"/>
-                        </a:ext>
-                      </a:extLst>
-                    </a:blip>
+                    <a:blip r:embed="rId20"/>
                     <a:stretch>
                       <a:fillRect/>
                     </a:stretch>
@@ -1130,281 +2975,7 @@
                   <pic:spPr>
                     <a:xfrm>
                       <a:off x="0" y="0"/>
-                      <a:ext cx="4279900" cy="3209925"/>
-                    </a:xfrm>
-                    <a:prstGeom prst="rect">
-                      <a:avLst/>
-                    </a:prstGeom>
-                  </pic:spPr>
-                </pic:pic>
-              </a:graphicData>
-            </a:graphic>
-            <wp14:sizeRelH relativeFrom="margin">
-              <wp14:pctWidth>0</wp14:pctWidth>
-            </wp14:sizeRelH>
-            <wp14:sizeRelV relativeFrom="margin">
-              <wp14:pctHeight>0</wp14:pctHeight>
-            </wp14:sizeRelV>
-          </wp:anchor>
-        </w:drawing>
-      </w:r>
-    </w:p>
-    <w:p>
-      <w:pPr>
-        <w:rPr>
-          <w:lang w:bidi="fa-IR"/>
-        </w:rPr>
-      </w:pPr>
-    </w:p>
-    <w:p>
-      <w:pPr>
-        <w:rPr>
-          <w:lang w:bidi="fa-IR"/>
-        </w:rPr>
-      </w:pPr>
-    </w:p>
-    <w:p>
-      <w:pPr>
-        <w:rPr>
-          <w:lang w:bidi="fa-IR"/>
-        </w:rPr>
-      </w:pPr>
-    </w:p>
-    <w:p>
-      <w:pPr>
-        <w:rPr>
-          <w:lang w:bidi="fa-IR"/>
-        </w:rPr>
-      </w:pPr>
-    </w:p>
-    <w:p>
-      <w:pPr>
-        <w:rPr>
-          <w:lang w:bidi="fa-IR"/>
-        </w:rPr>
-      </w:pPr>
-    </w:p>
-    <w:p>
-      <w:pPr>
-        <w:rPr>
-          <w:lang w:bidi="fa-IR"/>
-        </w:rPr>
-      </w:pPr>
-    </w:p>
-    <w:p>
-      <w:pPr>
-        <w:rPr>
-          <w:lang w:bidi="fa-IR"/>
-        </w:rPr>
-      </w:pPr>
-    </w:p>
-    <w:p>
-      <w:pPr>
-        <w:rPr>
-          <w:lang w:bidi="fa-IR"/>
-        </w:rPr>
-      </w:pPr>
-    </w:p>
-    <w:p>
-      <w:pPr>
-        <w:rPr>
-          <w:lang w:bidi="fa-IR"/>
-        </w:rPr>
-      </w:pPr>
-    </w:p>
-    <w:p>
-      <w:pPr>
-        <w:rPr>
-          <w:lang w:bidi="fa-IR"/>
-        </w:rPr>
-      </w:pPr>
-    </w:p>
-    <w:p>
-      <w:pPr>
-        <w:rPr>
-          <w:lang w:bidi="fa-IR"/>
-        </w:rPr>
-      </w:pPr>
-    </w:p>
-    <w:p>
-      <w:pPr>
-        <w:bidi/>
-        <w:rPr>
-          <w:rFonts w:cs="B Yekan"/>
-          <w:sz w:val="28"/>
-          <w:szCs w:val="28"/>
-          <w:rtl/>
-          <w:lang w:bidi="fa-IR"/>
-        </w:rPr>
-      </w:pPr>
-      <w:r>
-        <w:rPr>
-          <w:rFonts w:cs="B Yekan" w:hint="cs"/>
-          <w:sz w:val="28"/>
-          <w:szCs w:val="28"/>
-          <w:rtl/>
-          <w:lang w:bidi="fa-IR"/>
-        </w:rPr>
-        <w:t xml:space="preserve">بخش </w:t>
-      </w:r>
-      <w:r>
-        <w:rPr>
-          <w:rFonts w:cs="B Yekan" w:hint="cs"/>
-          <w:sz w:val="28"/>
-          <w:szCs w:val="28"/>
-          <w:rtl/>
-          <w:lang w:bidi="fa-IR"/>
-        </w:rPr>
-        <w:t>دوم</w:t>
-      </w:r>
-      <w:r>
-        <w:rPr>
-          <w:rFonts w:cs="B Yekan" w:hint="cs"/>
-          <w:sz w:val="28"/>
-          <w:szCs w:val="28"/>
-          <w:rtl/>
-          <w:lang w:bidi="fa-IR"/>
-        </w:rPr>
-        <w:t>:</w:t>
-      </w:r>
-    </w:p>
-    <w:p>
-      <w:pPr>
-        <w:bidi/>
-        <w:rPr>
-          <w:rFonts w:cs="B Yekan"/>
-          <w:sz w:val="28"/>
-          <w:szCs w:val="28"/>
-          <w:rtl/>
-          <w:lang w:bidi="fa-IR"/>
-        </w:rPr>
-      </w:pPr>
-      <w:r>
-        <w:rPr>
-          <w:rFonts w:cs="B Yekan" w:hint="cs"/>
-          <w:sz w:val="28"/>
-          <w:szCs w:val="28"/>
-          <w:rtl/>
-          <w:lang w:bidi="fa-IR"/>
-        </w:rPr>
-        <w:t>ذخیره مقدار 1010 در شیفت رجیستر با ورودی های مناسب</w:t>
-      </w:r>
-      <w:r>
-        <w:rPr>
-          <w:rFonts w:cs="B Yekan" w:hint="cs"/>
-          <w:sz w:val="28"/>
-          <w:szCs w:val="28"/>
-          <w:rtl/>
-          <w:lang w:bidi="fa-IR"/>
-        </w:rPr>
-        <w:t>:</w:t>
-      </w:r>
-    </w:p>
-    <w:p>
-      <w:pPr>
-        <w:bidi/>
-        <w:rPr>
-          <w:rFonts w:cs="B Nazanin" w:hint="cs"/>
-          <w:rtl/>
-          <w:lang w:bidi="fa-IR"/>
-        </w:rPr>
-      </w:pPr>
-      <w:r>
-        <w:rPr>
-          <w:rFonts w:cs="B Nazanin" w:hint="cs"/>
-          <w:rtl/>
-          <w:lang w:bidi="fa-IR"/>
-        </w:rPr>
-        <w:t xml:space="preserve">برای ذخیره داده ها در شیفت رجیستر باید بیت کنترلی یک باشد و </w:t>
-      </w:r>
-      <w:r>
-        <w:rPr>
-          <w:rFonts w:cs="B Nazanin"/>
-          <w:lang w:bidi="fa-IR"/>
-        </w:rPr>
-        <w:t>ABCD</w:t>
-      </w:r>
-      <w:r>
-        <w:rPr>
-          <w:rFonts w:cs="B Nazanin" w:hint="cs"/>
-          <w:rtl/>
-          <w:lang w:bidi="fa-IR"/>
-        </w:rPr>
-        <w:t xml:space="preserve"> را به ترتیب برابر </w:t>
-      </w:r>
-      <w:r>
-        <w:rPr>
-          <w:rFonts w:cs="B Nazanin"/>
-          <w:lang w:bidi="fa-IR"/>
-        </w:rPr>
-        <w:t>1010</w:t>
-      </w:r>
-      <w:r>
-        <w:rPr>
-          <w:rFonts w:cs="B Nazanin" w:hint="cs"/>
-          <w:rtl/>
-          <w:lang w:bidi="fa-IR"/>
-        </w:rPr>
-        <w:t xml:space="preserve"> قرار می دهیم.</w:t>
-      </w:r>
-      <w:r>
-        <w:rPr>
-          <w:rFonts w:cs="B Nazanin" w:hint="cs"/>
-          <w:rtl/>
-          <w:lang w:bidi="fa-IR"/>
-        </w:rPr>
-        <w:t xml:space="preserve"> سپس با یکبار فشردن دکمه ساعت ، مقادیر در فلیپ فلاپ ها ذخیره می شوند.</w:t>
-      </w:r>
-      <w:r>
-        <w:rPr>
-          <w:rFonts w:cs="B Nazanin" w:hint="cs"/>
-          <w:rtl/>
-          <w:lang w:bidi="fa-IR"/>
-        </w:rPr>
-        <w:t>(شکل 2-1)</w:t>
-      </w:r>
-    </w:p>
-    <w:p>
-      <w:pPr>
-        <w:keepNext/>
-        <w:jc w:val="center"/>
-      </w:pPr>
-      <w:r>
-        <w:rPr>
-          <w:noProof/>
-          <w:lang w:bidi="fa-IR"/>
-        </w:rPr>
-        <w:drawing>
-          <wp:inline distT="0" distB="0" distL="0" distR="0" wp14:anchorId="086FC0CE" wp14:editId="71FEEA9E">
-            <wp:extent cx="2952750" cy="2349581"/>
-            <wp:effectExtent l="0" t="0" r="0" b="0"/>
-            <wp:docPr id="1815617865" name="Picture 2"/>
-            <wp:cNvGraphicFramePr>
-              <a:graphicFrameLocks xmlns:a="http://schemas.openxmlformats.org/drawingml/2006/main" noChangeAspect="1"/>
-            </wp:cNvGraphicFramePr>
-            <a:graphic xmlns:a="http://schemas.openxmlformats.org/drawingml/2006/main">
-              <a:graphicData uri="http://schemas.openxmlformats.org/drawingml/2006/picture">
-                <pic:pic xmlns:pic="http://schemas.openxmlformats.org/drawingml/2006/picture">
-                  <pic:nvPicPr>
-                    <pic:cNvPr id="1815617865" name="Picture 1815617865"/>
-                    <pic:cNvPicPr/>
-                  </pic:nvPicPr>
-                  <pic:blipFill>
-                    <a:blip r:embed="rId9" cstate="print">
-                      <a:extLst>
-                        <a:ext uri="{28A0092B-C50C-407E-A947-70E740481C1C}">
-                          <a14:useLocalDpi xmlns:a14="http://schemas.microsoft.com/office/drawing/2010/main" val="0"/>
-                        </a:ext>
-                      </a:extLst>
-                    </a:blip>
-                    <a:stretch>
-                      <a:fillRect/>
-                    </a:stretch>
-                  </pic:blipFill>
-                  <pic:spPr>
-                    <a:xfrm>
-                      <a:off x="0" y="0"/>
-                      <a:ext cx="2959022" cy="2354572"/>
+                      <a:ext cx="3414597" cy="1999874"/>
                     </a:xfrm>
                     <a:prstGeom prst="rect">
                       <a:avLst/>
@@ -1419,50 +2990,43 @@
     </w:p>
     <w:p>
       <w:pPr>
-        <w:pStyle w:val="Caption"/>
         <w:jc w:val="center"/>
         <w:rPr>
-          <w:lang w:bidi="fa-IR"/>
-        </w:rPr>
-      </w:pPr>
-      <w:r>
-        <w:rPr>
-          <w:rFonts w:hint="cs"/>
-          <w:rtl/>
-        </w:rPr>
-        <w:t>شکل</w:t>
-      </w:r>
-      <w:r>
-        <w:rPr>
-          <w:rtl/>
-        </w:rPr>
-        <w:t xml:space="preserve"> 1-2</w:t>
-      </w:r>
-      <w:r>
-        <w:t xml:space="preserve"> </w:t>
-      </w:r>
-      <w:r>
-        <w:rPr>
-          <w:rFonts w:hint="cs"/>
-          <w:rtl/>
-        </w:rPr>
-        <w:t>--</w:t>
-      </w:r>
-      <w:r>
-        <w:t xml:space="preserve"> </w:t>
-      </w:r>
-      <w:r>
-        <w:rPr>
-          <w:rFonts w:hint="cs"/>
-          <w:rtl/>
-          <w:lang w:bidi="fa-IR"/>
-        </w:rPr>
-        <w:t>قرار دادن 1010 در مدار</w:t>
-      </w:r>
-    </w:p>
-    <w:p>
-      <w:pPr>
-        <w:rPr>
+          <w:rFonts w:cs="B Nazanin"/>
+          <w:lang w:bidi="fa-IR"/>
+        </w:rPr>
+      </w:pPr>
+    </w:p>
+    <w:p>
+      <w:pPr>
+        <w:rPr>
+          <w:rFonts w:cs="B Nazanin"/>
+          <w:lang w:bidi="fa-IR"/>
+        </w:rPr>
+      </w:pPr>
+      <w:r>
+        <w:rPr>
+          <w:rFonts w:cs="B Nazanin"/>
+          <w:lang w:bidi="fa-IR"/>
+        </w:rPr>
+        <w:br w:type="page"/>
+      </w:r>
+    </w:p>
+    <w:p>
+      <w:pPr>
+        <w:jc w:val="center"/>
+        <w:rPr>
+          <w:rFonts w:cs="B Nazanin"/>
+          <w:lang w:bidi="fa-IR"/>
+        </w:rPr>
+      </w:pPr>
+    </w:p>
+    <w:p>
+      <w:pPr>
+        <w:jc w:val="center"/>
+        <w:rPr>
+          <w:rFonts w:cs="B Nazanin"/>
+          <w:rtl/>
           <w:lang w:bidi="fa-IR"/>
         </w:rPr>
       </w:pPr>
@@ -1486,9 +3050,20 @@
           <w:rtl/>
           <w:lang w:bidi="fa-IR"/>
         </w:rPr>
-        <w:lastRenderedPageBreak/>
-        <w:t xml:space="preserve">بخش </w:t>
-      </w:r>
+        <w:t>بخش دوم:</w:t>
+      </w:r>
+    </w:p>
+    <w:p>
+      <w:pPr>
+        <w:bidi/>
+        <w:rPr>
+          <w:rFonts w:cs="B Yekan"/>
+          <w:sz w:val="28"/>
+          <w:szCs w:val="28"/>
+          <w:rtl/>
+          <w:lang w:bidi="fa-IR"/>
+        </w:rPr>
+      </w:pPr>
       <w:r>
         <w:rPr>
           <w:rFonts w:cs="B Yekan" w:hint="cs"/>
@@ -1497,98 +3072,1674 @@
           <w:rtl/>
           <w:lang w:bidi="fa-IR"/>
         </w:rPr>
-        <w:t>سوم</w:t>
-      </w:r>
-      <w:r>
-        <w:rPr>
-          <w:rFonts w:cs="B Yekan" w:hint="cs"/>
-          <w:sz w:val="28"/>
-          <w:szCs w:val="28"/>
-          <w:rtl/>
-          <w:lang w:bidi="fa-IR"/>
-        </w:rPr>
-        <w:t>:</w:t>
+        <w:t>ساخت مداری که رشته‌های خاصی را تشخیص دهد:</w:t>
       </w:r>
     </w:p>
     <w:p>
       <w:pPr>
         <w:bidi/>
-        <w:rPr>
-          <w:rFonts w:cs="B Yekan"/>
-          <w:sz w:val="28"/>
-          <w:szCs w:val="28"/>
-          <w:rtl/>
-          <w:lang w:bidi="fa-IR"/>
-        </w:rPr>
-      </w:pPr>
-      <w:r>
-        <w:rPr>
-          <w:rFonts w:cs="B Yekan" w:hint="cs"/>
-          <w:sz w:val="28"/>
-          <w:szCs w:val="28"/>
-          <w:rtl/>
-          <w:lang w:bidi="fa-IR"/>
-        </w:rPr>
-        <w:t>ساخت مداری با قابلیت شیفت به راست</w:t>
-      </w:r>
-      <w:r>
-        <w:rPr>
-          <w:rFonts w:cs="B Yekan" w:hint="cs"/>
-          <w:sz w:val="28"/>
-          <w:szCs w:val="28"/>
-          <w:rtl/>
-          <w:lang w:bidi="fa-IR"/>
-        </w:rPr>
-        <w:t>:</w:t>
-      </w:r>
-    </w:p>
-    <w:p>
-      <w:pPr>
+        <w:ind w:left="1440" w:hanging="1440"/>
+        <w:rPr>
+          <w:rFonts w:cs="B Nazanin"/>
+          <w:rtl/>
+        </w:rPr>
+      </w:pPr>
+      <w:r>
+        <w:rPr>
+          <w:rFonts w:cs="B Nazanin" w:hint="cs"/>
+          <w:rtl/>
+          <w:lang w:bidi="fa-IR"/>
+        </w:rPr>
+        <w:t xml:space="preserve">می‌خواهیم مدار رشته‌های </w:t>
+      </w:r>
+      <w:r>
+        <w:rPr>
+          <w:rFonts w:cs="B Nazanin"/>
+          <w:lang w:bidi="fa-IR"/>
+        </w:rPr>
+        <w:t xml:space="preserve">001 </w:t>
+      </w:r>
+      <w:r>
+        <w:rPr>
+          <w:rFonts w:cs="B Nazanin" w:hint="cs"/>
+          <w:rtl/>
+        </w:rPr>
+        <w:t xml:space="preserve">0، </w:t>
+      </w:r>
+      <w:r>
+        <w:rPr>
+          <w:rFonts w:cs="B Nazanin"/>
+          <w:lang w:bidi="fa-IR"/>
+        </w:rPr>
+        <w:t>0010</w:t>
+      </w:r>
+      <w:r>
+        <w:rPr>
+          <w:rFonts w:cs="B Nazanin"/>
+          <w:rtl/>
+        </w:rPr>
+        <w:t>، 1110، 1101</w:t>
+      </w:r>
+      <w:r>
+        <w:rPr>
+          <w:rFonts w:cs="B Nazanin" w:hint="cs"/>
+          <w:rtl/>
+        </w:rPr>
+        <w:t xml:space="preserve"> را تشخیص دهد.</w:t>
+      </w:r>
+    </w:p>
+    <w:p>
+      <w:pPr>
+        <w:bidi/>
+        <w:ind w:left="1440" w:hanging="1440"/>
         <w:jc w:val="right"/>
         <w:rPr>
+          <w:rFonts w:eastAsiaTheme="minorEastAsia" w:cs="B Nazanin"/>
+          <w:lang w:bidi="fa-IR"/>
+        </w:rPr>
+      </w:pPr>
+      <m:oMathPara>
+        <m:oMathParaPr>
+          <m:jc m:val="left"/>
+        </m:oMathParaPr>
+        <m:oMath>
+          <m:r>
+            <w:rPr>
+              <w:rFonts w:ascii="Cambria Math" w:hAnsi="Cambria Math" w:cs="B Nazanin"/>
+              <w:lang w:bidi="fa-IR"/>
+            </w:rPr>
+            <m:t>0001→</m:t>
+          </m:r>
+          <m:acc>
+            <m:accPr>
+              <m:chr m:val="̅"/>
+              <m:ctrlPr>
+                <w:rPr>
+                  <w:rFonts w:ascii="Cambria Math" w:hAnsi="Cambria Math" w:cs="B Nazanin"/>
+                  <w:i/>
+                  <w:lang w:bidi="fa-IR"/>
+                </w:rPr>
+              </m:ctrlPr>
+            </m:accPr>
+            <m:e>
+              <m:sSub>
+                <m:sSubPr>
+                  <m:ctrlPr>
+                    <w:rPr>
+                      <w:rFonts w:ascii="Cambria Math" w:hAnsi="Cambria Math" w:cs="B Nazanin"/>
+                      <w:i/>
+                      <w:lang w:bidi="fa-IR"/>
+                    </w:rPr>
+                  </m:ctrlPr>
+                </m:sSubPr>
+                <m:e>
+                  <m:r>
+                    <w:rPr>
+                      <w:rFonts w:ascii="Cambria Math" w:hAnsi="Cambria Math" w:cs="B Nazanin"/>
+                      <w:lang w:bidi="fa-IR"/>
+                    </w:rPr>
+                    <m:t>Q</m:t>
+                  </m:r>
+                </m:e>
+                <m:sub>
+                  <m:r>
+                    <w:rPr>
+                      <w:rFonts w:ascii="Cambria Math" w:hAnsi="Cambria Math" w:cs="B Nazanin"/>
+                      <w:lang w:bidi="fa-IR"/>
+                    </w:rPr>
+                    <m:t>3</m:t>
+                  </m:r>
+                </m:sub>
+              </m:sSub>
+            </m:e>
+          </m:acc>
+          <m:r>
+            <w:rPr>
+              <w:rFonts w:ascii="Cambria Math" w:hAnsi="Cambria Math" w:cs="B Nazanin"/>
+              <w:lang w:bidi="fa-IR"/>
+            </w:rPr>
+            <m:t>.</m:t>
+          </m:r>
+          <m:acc>
+            <m:accPr>
+              <m:chr m:val="̅"/>
+              <m:ctrlPr>
+                <w:rPr>
+                  <w:rFonts w:ascii="Cambria Math" w:hAnsi="Cambria Math" w:cs="B Nazanin"/>
+                  <w:i/>
+                  <w:lang w:bidi="fa-IR"/>
+                </w:rPr>
+              </m:ctrlPr>
+            </m:accPr>
+            <m:e>
+              <m:sSub>
+                <m:sSubPr>
+                  <m:ctrlPr>
+                    <w:rPr>
+                      <w:rFonts w:ascii="Cambria Math" w:hAnsi="Cambria Math" w:cs="B Nazanin"/>
+                      <w:i/>
+                      <w:lang w:bidi="fa-IR"/>
+                    </w:rPr>
+                  </m:ctrlPr>
+                </m:sSubPr>
+                <m:e>
+                  <m:r>
+                    <w:rPr>
+                      <w:rFonts w:ascii="Cambria Math" w:hAnsi="Cambria Math" w:cs="B Nazanin"/>
+                      <w:lang w:bidi="fa-IR"/>
+                    </w:rPr>
+                    <m:t>Q</m:t>
+                  </m:r>
+                </m:e>
+                <m:sub>
+                  <m:r>
+                    <w:rPr>
+                      <w:rFonts w:ascii="Cambria Math" w:hAnsi="Cambria Math" w:cs="B Nazanin"/>
+                      <w:lang w:bidi="fa-IR"/>
+                    </w:rPr>
+                    <m:t>2</m:t>
+                  </m:r>
+                </m:sub>
+              </m:sSub>
+            </m:e>
+          </m:acc>
+          <m:r>
+            <w:rPr>
+              <w:rFonts w:ascii="Cambria Math" w:hAnsi="Cambria Math" w:cs="B Nazanin"/>
+              <w:lang w:bidi="fa-IR"/>
+            </w:rPr>
+            <m:t>.</m:t>
+          </m:r>
+          <m:acc>
+            <m:accPr>
+              <m:chr m:val="̅"/>
+              <m:ctrlPr>
+                <w:rPr>
+                  <w:rFonts w:ascii="Cambria Math" w:hAnsi="Cambria Math" w:cs="B Nazanin"/>
+                  <w:i/>
+                  <w:lang w:bidi="fa-IR"/>
+                </w:rPr>
+              </m:ctrlPr>
+            </m:accPr>
+            <m:e>
+              <m:sSub>
+                <m:sSubPr>
+                  <m:ctrlPr>
+                    <w:rPr>
+                      <w:rFonts w:ascii="Cambria Math" w:hAnsi="Cambria Math" w:cs="B Nazanin"/>
+                      <w:i/>
+                      <w:lang w:bidi="fa-IR"/>
+                    </w:rPr>
+                  </m:ctrlPr>
+                </m:sSubPr>
+                <m:e>
+                  <m:r>
+                    <w:rPr>
+                      <w:rFonts w:ascii="Cambria Math" w:hAnsi="Cambria Math" w:cs="B Nazanin"/>
+                      <w:lang w:bidi="fa-IR"/>
+                    </w:rPr>
+                    <m:t>Q</m:t>
+                  </m:r>
+                </m:e>
+                <m:sub>
+                  <m:r>
+                    <w:rPr>
+                      <w:rFonts w:ascii="Cambria Math" w:hAnsi="Cambria Math" w:cs="B Nazanin"/>
+                      <w:lang w:bidi="fa-IR"/>
+                    </w:rPr>
+                    <m:t>1</m:t>
+                  </m:r>
+                </m:sub>
+              </m:sSub>
+            </m:e>
+          </m:acc>
+          <m:r>
+            <w:rPr>
+              <w:rFonts w:ascii="Cambria Math" w:hAnsi="Cambria Math" w:cs="B Nazanin"/>
+              <w:lang w:bidi="fa-IR"/>
+            </w:rPr>
+            <m:t>.</m:t>
+          </m:r>
+          <m:sSub>
+            <m:sSubPr>
+              <m:ctrlPr>
+                <w:rPr>
+                  <w:rFonts w:ascii="Cambria Math" w:hAnsi="Cambria Math" w:cs="B Nazanin"/>
+                  <w:i/>
+                  <w:lang w:bidi="fa-IR"/>
+                </w:rPr>
+              </m:ctrlPr>
+            </m:sSubPr>
+            <m:e>
+              <m:r>
+                <w:rPr>
+                  <w:rFonts w:ascii="Cambria Math" w:hAnsi="Cambria Math" w:cs="B Nazanin"/>
+                  <w:lang w:bidi="fa-IR"/>
+                </w:rPr>
+                <m:t>Q</m:t>
+              </m:r>
+            </m:e>
+            <m:sub>
+              <m:r>
+                <w:rPr>
+                  <w:rFonts w:ascii="Cambria Math" w:hAnsi="Cambria Math" w:cs="B Nazanin"/>
+                  <w:lang w:bidi="fa-IR"/>
+                </w:rPr>
+                <m:t>0</m:t>
+              </m:r>
+            </m:sub>
+          </m:sSub>
+          <m:r>
+            <w:rPr>
+              <w:rFonts w:ascii="Cambria Math" w:hAnsi="Cambria Math" w:cs="B Nazanin"/>
+              <w:lang w:bidi="fa-IR"/>
+            </w:rPr>
+            <m:t xml:space="preserve">   0010→</m:t>
+          </m:r>
+          <m:acc>
+            <m:accPr>
+              <m:chr m:val="̅"/>
+              <m:ctrlPr>
+                <w:rPr>
+                  <w:rFonts w:ascii="Cambria Math" w:hAnsi="Cambria Math" w:cs="B Nazanin"/>
+                  <w:i/>
+                  <w:lang w:bidi="fa-IR"/>
+                </w:rPr>
+              </m:ctrlPr>
+            </m:accPr>
+            <m:e>
+              <m:sSub>
+                <m:sSubPr>
+                  <m:ctrlPr>
+                    <w:rPr>
+                      <w:rFonts w:ascii="Cambria Math" w:hAnsi="Cambria Math" w:cs="B Nazanin"/>
+                      <w:i/>
+                      <w:lang w:bidi="fa-IR"/>
+                    </w:rPr>
+                  </m:ctrlPr>
+                </m:sSubPr>
+                <m:e>
+                  <m:r>
+                    <w:rPr>
+                      <w:rFonts w:ascii="Cambria Math" w:hAnsi="Cambria Math" w:cs="B Nazanin"/>
+                      <w:lang w:bidi="fa-IR"/>
+                    </w:rPr>
+                    <m:t>Q</m:t>
+                  </m:r>
+                </m:e>
+                <m:sub>
+                  <m:r>
+                    <w:rPr>
+                      <w:rFonts w:ascii="Cambria Math" w:hAnsi="Cambria Math" w:cs="B Nazanin"/>
+                      <w:lang w:bidi="fa-IR"/>
+                    </w:rPr>
+                    <m:t>3</m:t>
+                  </m:r>
+                </m:sub>
+              </m:sSub>
+            </m:e>
+          </m:acc>
+          <m:r>
+            <w:rPr>
+              <w:rFonts w:ascii="Cambria Math" w:hAnsi="Cambria Math" w:cs="B Nazanin"/>
+              <w:lang w:bidi="fa-IR"/>
+            </w:rPr>
+            <m:t>.</m:t>
+          </m:r>
+          <m:acc>
+            <m:accPr>
+              <m:chr m:val="̅"/>
+              <m:ctrlPr>
+                <w:rPr>
+                  <w:rFonts w:ascii="Cambria Math" w:hAnsi="Cambria Math" w:cs="B Nazanin"/>
+                  <w:i/>
+                  <w:lang w:bidi="fa-IR"/>
+                </w:rPr>
+              </m:ctrlPr>
+            </m:accPr>
+            <m:e>
+              <m:sSub>
+                <m:sSubPr>
+                  <m:ctrlPr>
+                    <w:rPr>
+                      <w:rFonts w:ascii="Cambria Math" w:hAnsi="Cambria Math" w:cs="B Nazanin"/>
+                      <w:i/>
+                      <w:lang w:bidi="fa-IR"/>
+                    </w:rPr>
+                  </m:ctrlPr>
+                </m:sSubPr>
+                <m:e>
+                  <m:r>
+                    <w:rPr>
+                      <w:rFonts w:ascii="Cambria Math" w:hAnsi="Cambria Math" w:cs="B Nazanin"/>
+                      <w:lang w:bidi="fa-IR"/>
+                    </w:rPr>
+                    <m:t>Q</m:t>
+                  </m:r>
+                </m:e>
+                <m:sub>
+                  <m:r>
+                    <w:rPr>
+                      <w:rFonts w:ascii="Cambria Math" w:hAnsi="Cambria Math" w:cs="B Nazanin"/>
+                      <w:lang w:bidi="fa-IR"/>
+                    </w:rPr>
+                    <m:t>2</m:t>
+                  </m:r>
+                </m:sub>
+              </m:sSub>
+            </m:e>
+          </m:acc>
+          <m:sSub>
+            <m:sSubPr>
+              <m:ctrlPr>
+                <w:rPr>
+                  <w:rFonts w:ascii="Cambria Math" w:hAnsi="Cambria Math" w:cs="B Nazanin"/>
+                  <w:i/>
+                  <w:lang w:bidi="fa-IR"/>
+                </w:rPr>
+              </m:ctrlPr>
+            </m:sSubPr>
+            <m:e>
+              <m:r>
+                <w:rPr>
+                  <w:rFonts w:ascii="Cambria Math" w:hAnsi="Cambria Math" w:cs="B Nazanin"/>
+                  <w:lang w:bidi="fa-IR"/>
+                </w:rPr>
+                <m:t>.Q</m:t>
+              </m:r>
+            </m:e>
+            <m:sub>
+              <m:r>
+                <w:rPr>
+                  <w:rFonts w:ascii="Cambria Math" w:hAnsi="Cambria Math" w:cs="B Nazanin"/>
+                  <w:lang w:bidi="fa-IR"/>
+                </w:rPr>
+                <m:t>1</m:t>
+              </m:r>
+            </m:sub>
+          </m:sSub>
+          <m:r>
+            <w:rPr>
+              <w:rFonts w:ascii="Cambria Math" w:hAnsi="Cambria Math" w:cs="B Nazanin"/>
+              <w:lang w:bidi="fa-IR"/>
+            </w:rPr>
+            <m:t>.</m:t>
+          </m:r>
+          <m:acc>
+            <m:accPr>
+              <m:chr m:val="̅"/>
+              <m:ctrlPr>
+                <w:rPr>
+                  <w:rFonts w:ascii="Cambria Math" w:hAnsi="Cambria Math" w:cs="B Nazanin"/>
+                  <w:i/>
+                  <w:lang w:bidi="fa-IR"/>
+                </w:rPr>
+              </m:ctrlPr>
+            </m:accPr>
+            <m:e>
+              <m:sSub>
+                <m:sSubPr>
+                  <m:ctrlPr>
+                    <w:rPr>
+                      <w:rFonts w:ascii="Cambria Math" w:hAnsi="Cambria Math" w:cs="B Nazanin"/>
+                      <w:i/>
+                      <w:lang w:bidi="fa-IR"/>
+                    </w:rPr>
+                  </m:ctrlPr>
+                </m:sSubPr>
+                <m:e>
+                  <m:r>
+                    <w:rPr>
+                      <w:rFonts w:ascii="Cambria Math" w:hAnsi="Cambria Math" w:cs="B Nazanin"/>
+                      <w:lang w:bidi="fa-IR"/>
+                    </w:rPr>
+                    <m:t>Q</m:t>
+                  </m:r>
+                </m:e>
+                <m:sub>
+                  <m:r>
+                    <w:rPr>
+                      <w:rFonts w:ascii="Cambria Math" w:hAnsi="Cambria Math" w:cs="B Nazanin"/>
+                      <w:lang w:bidi="fa-IR"/>
+                    </w:rPr>
+                    <m:t>0</m:t>
+                  </m:r>
+                </m:sub>
+              </m:sSub>
+            </m:e>
+          </m:acc>
+          <m:r>
+            <w:rPr>
+              <w:rFonts w:ascii="Cambria Math" w:hAnsi="Cambria Math" w:cs="B Nazanin"/>
+              <w:lang w:bidi="fa-IR"/>
+            </w:rPr>
+            <m:t xml:space="preserve">   </m:t>
+          </m:r>
+        </m:oMath>
+      </m:oMathPara>
+    </w:p>
+    <w:p>
+      <w:pPr>
+        <w:bidi/>
+        <w:ind w:left="1440" w:hanging="1440"/>
+        <w:jc w:val="right"/>
+        <w:rPr>
+          <w:rFonts w:eastAsiaTheme="minorEastAsia" w:cs="B Nazanin"/>
+          <w:i/>
+          <w:lang w:bidi="fa-IR"/>
+        </w:rPr>
+      </w:pPr>
+      <m:oMathPara>
+        <m:oMathParaPr>
+          <m:jc m:val="left"/>
+        </m:oMathParaPr>
+        <m:oMath>
+          <m:r>
+            <w:rPr>
+              <w:rFonts w:ascii="Cambria Math" w:hAnsi="Cambria Math" w:cs="B Nazanin"/>
+              <w:lang w:bidi="fa-IR"/>
+            </w:rPr>
+            <m:t>1110→</m:t>
+          </m:r>
+          <m:sSub>
+            <m:sSubPr>
+              <m:ctrlPr>
+                <w:rPr>
+                  <w:rFonts w:ascii="Cambria Math" w:hAnsi="Cambria Math" w:cs="B Nazanin"/>
+                  <w:i/>
+                  <w:lang w:bidi="fa-IR"/>
+                </w:rPr>
+              </m:ctrlPr>
+            </m:sSubPr>
+            <m:e>
+              <m:r>
+                <w:rPr>
+                  <w:rFonts w:ascii="Cambria Math" w:hAnsi="Cambria Math" w:cs="B Nazanin"/>
+                  <w:lang w:bidi="fa-IR"/>
+                </w:rPr>
+                <m:t>Q</m:t>
+              </m:r>
+            </m:e>
+            <m:sub>
+              <m:r>
+                <w:rPr>
+                  <w:rFonts w:ascii="Cambria Math" w:hAnsi="Cambria Math" w:cs="B Nazanin"/>
+                  <w:lang w:bidi="fa-IR"/>
+                </w:rPr>
+                <m:t>3</m:t>
+              </m:r>
+            </m:sub>
+          </m:sSub>
+          <m:sSub>
+            <m:sSubPr>
+              <m:ctrlPr>
+                <w:rPr>
+                  <w:rFonts w:ascii="Cambria Math" w:hAnsi="Cambria Math" w:cs="B Nazanin"/>
+                  <w:i/>
+                  <w:lang w:bidi="fa-IR"/>
+                </w:rPr>
+              </m:ctrlPr>
+            </m:sSubPr>
+            <m:e>
+              <m:r>
+                <w:rPr>
+                  <w:rFonts w:ascii="Cambria Math" w:hAnsi="Cambria Math" w:cs="B Nazanin"/>
+                  <w:lang w:bidi="fa-IR"/>
+                </w:rPr>
+                <m:t>.Q</m:t>
+              </m:r>
+            </m:e>
+            <m:sub>
+              <m:r>
+                <w:rPr>
+                  <w:rFonts w:ascii="Cambria Math" w:hAnsi="Cambria Math" w:cs="B Nazanin"/>
+                  <w:lang w:bidi="fa-IR"/>
+                </w:rPr>
+                <m:t>2</m:t>
+              </m:r>
+            </m:sub>
+          </m:sSub>
+          <m:sSub>
+            <m:sSubPr>
+              <m:ctrlPr>
+                <w:rPr>
+                  <w:rFonts w:ascii="Cambria Math" w:hAnsi="Cambria Math" w:cs="B Nazanin"/>
+                  <w:i/>
+                  <w:lang w:bidi="fa-IR"/>
+                </w:rPr>
+              </m:ctrlPr>
+            </m:sSubPr>
+            <m:e>
+              <m:r>
+                <w:rPr>
+                  <w:rFonts w:ascii="Cambria Math" w:hAnsi="Cambria Math" w:cs="B Nazanin"/>
+                  <w:lang w:bidi="fa-IR"/>
+                </w:rPr>
+                <m:t>.Q</m:t>
+              </m:r>
+            </m:e>
+            <m:sub>
+              <m:r>
+                <w:rPr>
+                  <w:rFonts w:ascii="Cambria Math" w:hAnsi="Cambria Math" w:cs="B Nazanin"/>
+                  <w:lang w:bidi="fa-IR"/>
+                </w:rPr>
+                <m:t>1</m:t>
+              </m:r>
+            </m:sub>
+          </m:sSub>
+          <m:r>
+            <w:rPr>
+              <w:rFonts w:ascii="Cambria Math" w:hAnsi="Cambria Math" w:cs="B Nazanin"/>
+              <w:lang w:bidi="fa-IR"/>
+            </w:rPr>
+            <m:t>.</m:t>
+          </m:r>
+          <m:acc>
+            <m:accPr>
+              <m:chr m:val="̅"/>
+              <m:ctrlPr>
+                <w:rPr>
+                  <w:rFonts w:ascii="Cambria Math" w:hAnsi="Cambria Math" w:cs="B Nazanin"/>
+                  <w:i/>
+                  <w:lang w:bidi="fa-IR"/>
+                </w:rPr>
+              </m:ctrlPr>
+            </m:accPr>
+            <m:e>
+              <m:sSub>
+                <m:sSubPr>
+                  <m:ctrlPr>
+                    <w:rPr>
+                      <w:rFonts w:ascii="Cambria Math" w:hAnsi="Cambria Math" w:cs="B Nazanin"/>
+                      <w:i/>
+                      <w:lang w:bidi="fa-IR"/>
+                    </w:rPr>
+                  </m:ctrlPr>
+                </m:sSubPr>
+                <m:e>
+                  <m:r>
+                    <w:rPr>
+                      <w:rFonts w:ascii="Cambria Math" w:hAnsi="Cambria Math" w:cs="B Nazanin"/>
+                      <w:lang w:bidi="fa-IR"/>
+                    </w:rPr>
+                    <m:t>Q</m:t>
+                  </m:r>
+                </m:e>
+                <m:sub>
+                  <m:r>
+                    <w:rPr>
+                      <w:rFonts w:ascii="Cambria Math" w:hAnsi="Cambria Math" w:cs="B Nazanin"/>
+                      <w:lang w:bidi="fa-IR"/>
+                    </w:rPr>
+                    <m:t>0</m:t>
+                  </m:r>
+                </m:sub>
+              </m:sSub>
+            </m:e>
+          </m:acc>
+          <m:r>
+            <w:rPr>
+              <w:rFonts w:ascii="Cambria Math" w:hAnsi="Cambria Math" w:cs="B Nazanin"/>
+              <w:lang w:bidi="fa-IR"/>
+            </w:rPr>
+            <m:t xml:space="preserve">   1101→</m:t>
+          </m:r>
+          <m:sSub>
+            <m:sSubPr>
+              <m:ctrlPr>
+                <w:rPr>
+                  <w:rFonts w:ascii="Cambria Math" w:hAnsi="Cambria Math" w:cs="B Nazanin"/>
+                  <w:i/>
+                  <w:lang w:bidi="fa-IR"/>
+                </w:rPr>
+              </m:ctrlPr>
+            </m:sSubPr>
+            <m:e>
+              <m:r>
+                <w:rPr>
+                  <w:rFonts w:ascii="Cambria Math" w:hAnsi="Cambria Math" w:cs="B Nazanin"/>
+                  <w:lang w:bidi="fa-IR"/>
+                </w:rPr>
+                <m:t>Q</m:t>
+              </m:r>
+            </m:e>
+            <m:sub>
+              <m:r>
+                <w:rPr>
+                  <w:rFonts w:ascii="Cambria Math" w:hAnsi="Cambria Math" w:cs="B Nazanin"/>
+                  <w:lang w:bidi="fa-IR"/>
+                </w:rPr>
+                <m:t>3</m:t>
+              </m:r>
+            </m:sub>
+          </m:sSub>
+          <m:sSub>
+            <m:sSubPr>
+              <m:ctrlPr>
+                <w:rPr>
+                  <w:rFonts w:ascii="Cambria Math" w:hAnsi="Cambria Math" w:cs="B Nazanin"/>
+                  <w:i/>
+                  <w:lang w:bidi="fa-IR"/>
+                </w:rPr>
+              </m:ctrlPr>
+            </m:sSubPr>
+            <m:e>
+              <m:r>
+                <w:rPr>
+                  <w:rFonts w:ascii="Cambria Math" w:hAnsi="Cambria Math" w:cs="B Nazanin"/>
+                  <w:lang w:bidi="fa-IR"/>
+                </w:rPr>
+                <m:t>.Q</m:t>
+              </m:r>
+            </m:e>
+            <m:sub>
+              <m:r>
+                <w:rPr>
+                  <w:rFonts w:ascii="Cambria Math" w:hAnsi="Cambria Math" w:cs="B Nazanin"/>
+                  <w:lang w:bidi="fa-IR"/>
+                </w:rPr>
+                <m:t>2</m:t>
+              </m:r>
+            </m:sub>
+          </m:sSub>
+          <m:r>
+            <w:rPr>
+              <w:rFonts w:ascii="Cambria Math" w:hAnsi="Cambria Math" w:cs="B Nazanin"/>
+              <w:lang w:bidi="fa-IR"/>
+            </w:rPr>
+            <m:t>.</m:t>
+          </m:r>
+          <m:acc>
+            <m:accPr>
+              <m:chr m:val="̅"/>
+              <m:ctrlPr>
+                <w:rPr>
+                  <w:rFonts w:ascii="Cambria Math" w:hAnsi="Cambria Math" w:cs="B Nazanin"/>
+                  <w:i/>
+                  <w:lang w:bidi="fa-IR"/>
+                </w:rPr>
+              </m:ctrlPr>
+            </m:accPr>
+            <m:e>
+              <m:sSub>
+                <m:sSubPr>
+                  <m:ctrlPr>
+                    <w:rPr>
+                      <w:rFonts w:ascii="Cambria Math" w:hAnsi="Cambria Math" w:cs="B Nazanin"/>
+                      <w:i/>
+                      <w:lang w:bidi="fa-IR"/>
+                    </w:rPr>
+                  </m:ctrlPr>
+                </m:sSubPr>
+                <m:e>
+                  <m:r>
+                    <w:rPr>
+                      <w:rFonts w:ascii="Cambria Math" w:hAnsi="Cambria Math" w:cs="B Nazanin"/>
+                      <w:lang w:bidi="fa-IR"/>
+                    </w:rPr>
+                    <m:t>Q</m:t>
+                  </m:r>
+                </m:e>
+                <m:sub>
+                  <m:r>
+                    <w:rPr>
+                      <w:rFonts w:ascii="Cambria Math" w:hAnsi="Cambria Math" w:cs="B Nazanin"/>
+                      <w:lang w:bidi="fa-IR"/>
+                    </w:rPr>
+                    <m:t>1</m:t>
+                  </m:r>
+                </m:sub>
+              </m:sSub>
+            </m:e>
+          </m:acc>
+          <m:sSub>
+            <m:sSubPr>
+              <m:ctrlPr>
+                <w:rPr>
+                  <w:rFonts w:ascii="Cambria Math" w:hAnsi="Cambria Math" w:cs="B Nazanin"/>
+                  <w:i/>
+                  <w:lang w:bidi="fa-IR"/>
+                </w:rPr>
+              </m:ctrlPr>
+            </m:sSubPr>
+            <m:e>
+              <m:r>
+                <w:rPr>
+                  <w:rFonts w:ascii="Cambria Math" w:hAnsi="Cambria Math" w:cs="B Nazanin"/>
+                  <w:lang w:bidi="fa-IR"/>
+                </w:rPr>
+                <m:t>.Q</m:t>
+              </m:r>
+            </m:e>
+            <m:sub>
+              <m:r>
+                <w:rPr>
+                  <w:rFonts w:ascii="Cambria Math" w:hAnsi="Cambria Math" w:cs="B Nazanin"/>
+                  <w:lang w:bidi="fa-IR"/>
+                </w:rPr>
+                <m:t>0</m:t>
+              </m:r>
+            </m:sub>
+          </m:sSub>
+        </m:oMath>
+      </m:oMathPara>
+    </w:p>
+    <w:p>
+      <w:pPr>
+        <w:bidi/>
+        <w:ind w:left="1440" w:hanging="1440"/>
+        <w:rPr>
           <w:rFonts w:cs="B Nazanin"/>
-          <w:rtl/>
-          <w:lang w:bidi="fa-IR"/>
-        </w:rPr>
-      </w:pPr>
-      <w:r>
-        <w:rPr>
-          <w:rFonts w:cs="B Nazanin" w:hint="cs"/>
-          <w:rtl/>
-          <w:lang w:bidi="fa-IR"/>
-        </w:rPr>
-        <w:t xml:space="preserve">با برابر قرار دادن بیت مود با صفر مدار به مداری با قابلیت شیفت به سمت راست تبدیل می شود و با هر بار فشردن دکمه ساعت ورودی وارد بیت پر ارزش شده و بیت کم ارزش خارج می شود. برای امتحان کردن این موضوع ورودی </w:t>
-      </w:r>
-      <w:r>
-        <w:rPr>
-          <w:rFonts w:cs="B Nazanin" w:hint="cs"/>
-          <w:rtl/>
-          <w:lang w:bidi="fa-IR"/>
-        </w:rPr>
-        <w:t>1010 بخش قبل را با قرار دادن ورودی مدار با صفر یکی به راست شیفت می دهیم.(شکل 3-1)</w:t>
-      </w:r>
-    </w:p>
-    <w:p>
-      <w:pPr>
-        <w:jc w:val="right"/>
-        <w:rPr>
-          <w:rFonts w:cs="B Nazanin"/>
-          <w:rtl/>
-          <w:lang w:bidi="fa-IR"/>
-        </w:rPr>
-      </w:pPr>
-    </w:p>
-    <w:p>
-      <w:pPr>
-        <w:keepNext/>
-        <w:jc w:val="right"/>
-      </w:pPr>
-      <w:r>
+          <w:i/>
+          <w:lang w:bidi="fa-IR"/>
+        </w:rPr>
+      </w:pPr>
+    </w:p>
+    <w:p>
+      <w:pPr>
+        <w:jc w:val="center"/>
+        <w:rPr>
+          <w:rFonts w:eastAsiaTheme="minorEastAsia" w:cs="B Nazanin"/>
+          <w:i/>
+          <w:lang w:bidi="fa-IR"/>
+        </w:rPr>
+      </w:pPr>
+      <m:oMathPara>
+        <m:oMathParaPr>
+          <m:jc m:val="left"/>
+        </m:oMathParaPr>
+        <m:oMath>
+          <m:r>
+            <w:rPr>
+              <w:rFonts w:ascii="Cambria Math" w:hAnsi="Cambria Math" w:cs="B Nazanin"/>
+              <w:lang w:bidi="fa-IR"/>
+            </w:rPr>
+            <m:t>S=</m:t>
+          </m:r>
+          <m:acc>
+            <m:accPr>
+              <m:chr m:val="̅"/>
+              <m:ctrlPr>
+                <w:rPr>
+                  <w:rFonts w:ascii="Cambria Math" w:hAnsi="Cambria Math" w:cs="B Nazanin"/>
+                  <w:i/>
+                  <w:lang w:bidi="fa-IR"/>
+                </w:rPr>
+              </m:ctrlPr>
+            </m:accPr>
+            <m:e>
+              <m:sSub>
+                <m:sSubPr>
+                  <m:ctrlPr>
+                    <w:rPr>
+                      <w:rFonts w:ascii="Cambria Math" w:hAnsi="Cambria Math" w:cs="B Nazanin"/>
+                      <w:i/>
+                      <w:lang w:bidi="fa-IR"/>
+                    </w:rPr>
+                  </m:ctrlPr>
+                </m:sSubPr>
+                <m:e>
+                  <m:r>
+                    <w:rPr>
+                      <w:rFonts w:ascii="Cambria Math" w:hAnsi="Cambria Math" w:cs="B Nazanin"/>
+                      <w:lang w:bidi="fa-IR"/>
+                    </w:rPr>
+                    <m:t>Q</m:t>
+                  </m:r>
+                </m:e>
+                <m:sub>
+                  <m:r>
+                    <w:rPr>
+                      <w:rFonts w:ascii="Cambria Math" w:hAnsi="Cambria Math" w:cs="B Nazanin"/>
+                      <w:lang w:bidi="fa-IR"/>
+                    </w:rPr>
+                    <m:t>3</m:t>
+                  </m:r>
+                </m:sub>
+              </m:sSub>
+            </m:e>
+          </m:acc>
+          <m:r>
+            <w:rPr>
+              <w:rFonts w:ascii="Cambria Math" w:hAnsi="Cambria Math" w:cs="B Nazanin"/>
+              <w:lang w:bidi="fa-IR"/>
+            </w:rPr>
+            <m:t>.</m:t>
+          </m:r>
+          <m:acc>
+            <m:accPr>
+              <m:chr m:val="̅"/>
+              <m:ctrlPr>
+                <w:rPr>
+                  <w:rFonts w:ascii="Cambria Math" w:hAnsi="Cambria Math" w:cs="B Nazanin"/>
+                  <w:i/>
+                  <w:lang w:bidi="fa-IR"/>
+                </w:rPr>
+              </m:ctrlPr>
+            </m:accPr>
+            <m:e>
+              <m:sSub>
+                <m:sSubPr>
+                  <m:ctrlPr>
+                    <w:rPr>
+                      <w:rFonts w:ascii="Cambria Math" w:hAnsi="Cambria Math" w:cs="B Nazanin"/>
+                      <w:i/>
+                      <w:lang w:bidi="fa-IR"/>
+                    </w:rPr>
+                  </m:ctrlPr>
+                </m:sSubPr>
+                <m:e>
+                  <m:r>
+                    <w:rPr>
+                      <w:rFonts w:ascii="Cambria Math" w:hAnsi="Cambria Math" w:cs="B Nazanin"/>
+                      <w:lang w:bidi="fa-IR"/>
+                    </w:rPr>
+                    <m:t>Q</m:t>
+                  </m:r>
+                </m:e>
+                <m:sub>
+                  <m:r>
+                    <w:rPr>
+                      <w:rFonts w:ascii="Cambria Math" w:hAnsi="Cambria Math" w:cs="B Nazanin"/>
+                      <w:lang w:bidi="fa-IR"/>
+                    </w:rPr>
+                    <m:t>2</m:t>
+                  </m:r>
+                </m:sub>
+              </m:sSub>
+            </m:e>
+          </m:acc>
+          <m:r>
+            <w:rPr>
+              <w:rFonts w:ascii="Cambria Math" w:hAnsi="Cambria Math" w:cs="B Nazanin"/>
+              <w:lang w:bidi="fa-IR"/>
+            </w:rPr>
+            <m:t>.</m:t>
+          </m:r>
+          <m:acc>
+            <m:accPr>
+              <m:chr m:val="̅"/>
+              <m:ctrlPr>
+                <w:rPr>
+                  <w:rFonts w:ascii="Cambria Math" w:hAnsi="Cambria Math" w:cs="B Nazanin"/>
+                  <w:i/>
+                  <w:lang w:bidi="fa-IR"/>
+                </w:rPr>
+              </m:ctrlPr>
+            </m:accPr>
+            <m:e>
+              <m:sSub>
+                <m:sSubPr>
+                  <m:ctrlPr>
+                    <w:rPr>
+                      <w:rFonts w:ascii="Cambria Math" w:hAnsi="Cambria Math" w:cs="B Nazanin"/>
+                      <w:i/>
+                      <w:lang w:bidi="fa-IR"/>
+                    </w:rPr>
+                  </m:ctrlPr>
+                </m:sSubPr>
+                <m:e>
+                  <m:r>
+                    <w:rPr>
+                      <w:rFonts w:ascii="Cambria Math" w:hAnsi="Cambria Math" w:cs="B Nazanin"/>
+                      <w:lang w:bidi="fa-IR"/>
+                    </w:rPr>
+                    <m:t>Q</m:t>
+                  </m:r>
+                </m:e>
+                <m:sub>
+                  <m:r>
+                    <w:rPr>
+                      <w:rFonts w:ascii="Cambria Math" w:hAnsi="Cambria Math" w:cs="B Nazanin"/>
+                      <w:lang w:bidi="fa-IR"/>
+                    </w:rPr>
+                    <m:t>1</m:t>
+                  </m:r>
+                </m:sub>
+              </m:sSub>
+            </m:e>
+          </m:acc>
+          <m:r>
+            <w:rPr>
+              <w:rFonts w:ascii="Cambria Math" w:hAnsi="Cambria Math" w:cs="B Nazanin"/>
+              <w:lang w:bidi="fa-IR"/>
+            </w:rPr>
+            <m:t>.</m:t>
+          </m:r>
+          <m:sSub>
+            <m:sSubPr>
+              <m:ctrlPr>
+                <w:rPr>
+                  <w:rFonts w:ascii="Cambria Math" w:hAnsi="Cambria Math" w:cs="B Nazanin"/>
+                  <w:i/>
+                  <w:lang w:bidi="fa-IR"/>
+                </w:rPr>
+              </m:ctrlPr>
+            </m:sSubPr>
+            <m:e>
+              <m:r>
+                <w:rPr>
+                  <w:rFonts w:ascii="Cambria Math" w:hAnsi="Cambria Math" w:cs="B Nazanin"/>
+                  <w:lang w:bidi="fa-IR"/>
+                </w:rPr>
+                <m:t>Q</m:t>
+              </m:r>
+            </m:e>
+            <m:sub>
+              <m:r>
+                <w:rPr>
+                  <w:rFonts w:ascii="Cambria Math" w:hAnsi="Cambria Math" w:cs="B Nazanin"/>
+                  <w:lang w:bidi="fa-IR"/>
+                </w:rPr>
+                <m:t>0</m:t>
+              </m:r>
+            </m:sub>
+          </m:sSub>
+          <m:r>
+            <w:rPr>
+              <w:rFonts w:ascii="Cambria Math" w:hAnsi="Cambria Math" w:cs="B Nazanin"/>
+              <w:lang w:bidi="fa-IR"/>
+            </w:rPr>
+            <m:t>+</m:t>
+          </m:r>
+          <m:acc>
+            <m:accPr>
+              <m:chr m:val="̅"/>
+              <m:ctrlPr>
+                <w:rPr>
+                  <w:rFonts w:ascii="Cambria Math" w:hAnsi="Cambria Math" w:cs="B Nazanin"/>
+                  <w:i/>
+                  <w:lang w:bidi="fa-IR"/>
+                </w:rPr>
+              </m:ctrlPr>
+            </m:accPr>
+            <m:e>
+              <m:sSub>
+                <m:sSubPr>
+                  <m:ctrlPr>
+                    <w:rPr>
+                      <w:rFonts w:ascii="Cambria Math" w:hAnsi="Cambria Math" w:cs="B Nazanin"/>
+                      <w:i/>
+                      <w:lang w:bidi="fa-IR"/>
+                    </w:rPr>
+                  </m:ctrlPr>
+                </m:sSubPr>
+                <m:e>
+                  <m:r>
+                    <w:rPr>
+                      <w:rFonts w:ascii="Cambria Math" w:hAnsi="Cambria Math" w:cs="B Nazanin"/>
+                      <w:lang w:bidi="fa-IR"/>
+                    </w:rPr>
+                    <m:t>Q</m:t>
+                  </m:r>
+                </m:e>
+                <m:sub>
+                  <m:r>
+                    <w:rPr>
+                      <w:rFonts w:ascii="Cambria Math" w:hAnsi="Cambria Math" w:cs="B Nazanin"/>
+                      <w:lang w:bidi="fa-IR"/>
+                    </w:rPr>
+                    <m:t>3</m:t>
+                  </m:r>
+                </m:sub>
+              </m:sSub>
+            </m:e>
+          </m:acc>
+          <m:r>
+            <w:rPr>
+              <w:rFonts w:ascii="Cambria Math" w:hAnsi="Cambria Math" w:cs="B Nazanin"/>
+              <w:lang w:bidi="fa-IR"/>
+            </w:rPr>
+            <m:t>.</m:t>
+          </m:r>
+          <m:acc>
+            <m:accPr>
+              <m:chr m:val="̅"/>
+              <m:ctrlPr>
+                <w:rPr>
+                  <w:rFonts w:ascii="Cambria Math" w:hAnsi="Cambria Math" w:cs="B Nazanin"/>
+                  <w:i/>
+                  <w:lang w:bidi="fa-IR"/>
+                </w:rPr>
+              </m:ctrlPr>
+            </m:accPr>
+            <m:e>
+              <m:sSub>
+                <m:sSubPr>
+                  <m:ctrlPr>
+                    <w:rPr>
+                      <w:rFonts w:ascii="Cambria Math" w:hAnsi="Cambria Math" w:cs="B Nazanin"/>
+                      <w:i/>
+                      <w:lang w:bidi="fa-IR"/>
+                    </w:rPr>
+                  </m:ctrlPr>
+                </m:sSubPr>
+                <m:e>
+                  <m:r>
+                    <w:rPr>
+                      <w:rFonts w:ascii="Cambria Math" w:hAnsi="Cambria Math" w:cs="B Nazanin"/>
+                      <w:lang w:bidi="fa-IR"/>
+                    </w:rPr>
+                    <m:t>Q</m:t>
+                  </m:r>
+                </m:e>
+                <m:sub>
+                  <m:r>
+                    <w:rPr>
+                      <w:rFonts w:ascii="Cambria Math" w:hAnsi="Cambria Math" w:cs="B Nazanin"/>
+                      <w:lang w:bidi="fa-IR"/>
+                    </w:rPr>
+                    <m:t>2</m:t>
+                  </m:r>
+                </m:sub>
+              </m:sSub>
+            </m:e>
+          </m:acc>
+          <m:sSub>
+            <m:sSubPr>
+              <m:ctrlPr>
+                <w:rPr>
+                  <w:rFonts w:ascii="Cambria Math" w:hAnsi="Cambria Math" w:cs="B Nazanin"/>
+                  <w:i/>
+                  <w:lang w:bidi="fa-IR"/>
+                </w:rPr>
+              </m:ctrlPr>
+            </m:sSubPr>
+            <m:e>
+              <m:r>
+                <w:rPr>
+                  <w:rFonts w:ascii="Cambria Math" w:hAnsi="Cambria Math" w:cs="B Nazanin"/>
+                  <w:lang w:bidi="fa-IR"/>
+                </w:rPr>
+                <m:t>.Q</m:t>
+              </m:r>
+            </m:e>
+            <m:sub>
+              <m:r>
+                <w:rPr>
+                  <w:rFonts w:ascii="Cambria Math" w:hAnsi="Cambria Math" w:cs="B Nazanin"/>
+                  <w:lang w:bidi="fa-IR"/>
+                </w:rPr>
+                <m:t>1</m:t>
+              </m:r>
+            </m:sub>
+          </m:sSub>
+          <m:r>
+            <w:rPr>
+              <w:rFonts w:ascii="Cambria Math" w:hAnsi="Cambria Math" w:cs="B Nazanin"/>
+              <w:lang w:bidi="fa-IR"/>
+            </w:rPr>
+            <m:t>.</m:t>
+          </m:r>
+          <m:acc>
+            <m:accPr>
+              <m:chr m:val="̅"/>
+              <m:ctrlPr>
+                <w:rPr>
+                  <w:rFonts w:ascii="Cambria Math" w:hAnsi="Cambria Math" w:cs="B Nazanin"/>
+                  <w:i/>
+                  <w:lang w:bidi="fa-IR"/>
+                </w:rPr>
+              </m:ctrlPr>
+            </m:accPr>
+            <m:e>
+              <m:sSub>
+                <m:sSubPr>
+                  <m:ctrlPr>
+                    <w:rPr>
+                      <w:rFonts w:ascii="Cambria Math" w:hAnsi="Cambria Math" w:cs="B Nazanin"/>
+                      <w:i/>
+                      <w:lang w:bidi="fa-IR"/>
+                    </w:rPr>
+                  </m:ctrlPr>
+                </m:sSubPr>
+                <m:e>
+                  <m:r>
+                    <w:rPr>
+                      <w:rFonts w:ascii="Cambria Math" w:hAnsi="Cambria Math" w:cs="B Nazanin"/>
+                      <w:lang w:bidi="fa-IR"/>
+                    </w:rPr>
+                    <m:t>Q</m:t>
+                  </m:r>
+                </m:e>
+                <m:sub>
+                  <m:r>
+                    <w:rPr>
+                      <w:rFonts w:ascii="Cambria Math" w:hAnsi="Cambria Math" w:cs="B Nazanin"/>
+                      <w:lang w:bidi="fa-IR"/>
+                    </w:rPr>
+                    <m:t>0</m:t>
+                  </m:r>
+                </m:sub>
+              </m:sSub>
+            </m:e>
+          </m:acc>
+          <m:r>
+            <w:rPr>
+              <w:rFonts w:ascii="Cambria Math" w:hAnsi="Cambria Math" w:cs="B Nazanin"/>
+              <w:lang w:bidi="fa-IR"/>
+            </w:rPr>
+            <m:t>+</m:t>
+          </m:r>
+          <m:sSub>
+            <m:sSubPr>
+              <m:ctrlPr>
+                <w:rPr>
+                  <w:rFonts w:ascii="Cambria Math" w:hAnsi="Cambria Math" w:cs="B Nazanin"/>
+                  <w:i/>
+                  <w:lang w:bidi="fa-IR"/>
+                </w:rPr>
+              </m:ctrlPr>
+            </m:sSubPr>
+            <m:e>
+              <m:r>
+                <w:rPr>
+                  <w:rFonts w:ascii="Cambria Math" w:hAnsi="Cambria Math" w:cs="B Nazanin"/>
+                  <w:lang w:bidi="fa-IR"/>
+                </w:rPr>
+                <m:t>Q</m:t>
+              </m:r>
+            </m:e>
+            <m:sub>
+              <m:r>
+                <w:rPr>
+                  <w:rFonts w:ascii="Cambria Math" w:hAnsi="Cambria Math" w:cs="B Nazanin"/>
+                  <w:lang w:bidi="fa-IR"/>
+                </w:rPr>
+                <m:t>3</m:t>
+              </m:r>
+            </m:sub>
+          </m:sSub>
+          <m:sSub>
+            <m:sSubPr>
+              <m:ctrlPr>
+                <w:rPr>
+                  <w:rFonts w:ascii="Cambria Math" w:hAnsi="Cambria Math" w:cs="B Nazanin"/>
+                  <w:i/>
+                  <w:lang w:bidi="fa-IR"/>
+                </w:rPr>
+              </m:ctrlPr>
+            </m:sSubPr>
+            <m:e>
+              <m:r>
+                <w:rPr>
+                  <w:rFonts w:ascii="Cambria Math" w:hAnsi="Cambria Math" w:cs="B Nazanin"/>
+                  <w:lang w:bidi="fa-IR"/>
+                </w:rPr>
+                <m:t>.Q</m:t>
+              </m:r>
+            </m:e>
+            <m:sub>
+              <m:r>
+                <w:rPr>
+                  <w:rFonts w:ascii="Cambria Math" w:hAnsi="Cambria Math" w:cs="B Nazanin"/>
+                  <w:lang w:bidi="fa-IR"/>
+                </w:rPr>
+                <m:t>2</m:t>
+              </m:r>
+            </m:sub>
+          </m:sSub>
+          <m:sSub>
+            <m:sSubPr>
+              <m:ctrlPr>
+                <w:rPr>
+                  <w:rFonts w:ascii="Cambria Math" w:hAnsi="Cambria Math" w:cs="B Nazanin"/>
+                  <w:i/>
+                  <w:lang w:bidi="fa-IR"/>
+                </w:rPr>
+              </m:ctrlPr>
+            </m:sSubPr>
+            <m:e>
+              <m:r>
+                <w:rPr>
+                  <w:rFonts w:ascii="Cambria Math" w:hAnsi="Cambria Math" w:cs="B Nazanin"/>
+                  <w:lang w:bidi="fa-IR"/>
+                </w:rPr>
+                <m:t>.Q</m:t>
+              </m:r>
+            </m:e>
+            <m:sub>
+              <m:r>
+                <w:rPr>
+                  <w:rFonts w:ascii="Cambria Math" w:hAnsi="Cambria Math" w:cs="B Nazanin"/>
+                  <w:lang w:bidi="fa-IR"/>
+                </w:rPr>
+                <m:t>1</m:t>
+              </m:r>
+            </m:sub>
+          </m:sSub>
+          <m:r>
+            <w:rPr>
+              <w:rFonts w:ascii="Cambria Math" w:hAnsi="Cambria Math" w:cs="B Nazanin"/>
+              <w:lang w:bidi="fa-IR"/>
+            </w:rPr>
+            <m:t>.</m:t>
+          </m:r>
+          <m:acc>
+            <m:accPr>
+              <m:chr m:val="̅"/>
+              <m:ctrlPr>
+                <w:rPr>
+                  <w:rFonts w:ascii="Cambria Math" w:hAnsi="Cambria Math" w:cs="B Nazanin"/>
+                  <w:i/>
+                  <w:lang w:bidi="fa-IR"/>
+                </w:rPr>
+              </m:ctrlPr>
+            </m:accPr>
+            <m:e>
+              <m:sSub>
+                <m:sSubPr>
+                  <m:ctrlPr>
+                    <w:rPr>
+                      <w:rFonts w:ascii="Cambria Math" w:hAnsi="Cambria Math" w:cs="B Nazanin"/>
+                      <w:i/>
+                      <w:lang w:bidi="fa-IR"/>
+                    </w:rPr>
+                  </m:ctrlPr>
+                </m:sSubPr>
+                <m:e>
+                  <m:r>
+                    <w:rPr>
+                      <w:rFonts w:ascii="Cambria Math" w:hAnsi="Cambria Math" w:cs="B Nazanin"/>
+                      <w:lang w:bidi="fa-IR"/>
+                    </w:rPr>
+                    <m:t>Q</m:t>
+                  </m:r>
+                </m:e>
+                <m:sub>
+                  <m:r>
+                    <w:rPr>
+                      <w:rFonts w:ascii="Cambria Math" w:hAnsi="Cambria Math" w:cs="B Nazanin"/>
+                      <w:lang w:bidi="fa-IR"/>
+                    </w:rPr>
+                    <m:t>0</m:t>
+                  </m:r>
+                </m:sub>
+              </m:sSub>
+            </m:e>
+          </m:acc>
+          <m:r>
+            <w:rPr>
+              <w:rFonts w:ascii="Cambria Math" w:hAnsi="Cambria Math" w:cs="B Nazanin"/>
+              <w:lang w:bidi="fa-IR"/>
+            </w:rPr>
+            <m:t xml:space="preserve">  +</m:t>
+          </m:r>
+          <m:sSub>
+            <m:sSubPr>
+              <m:ctrlPr>
+                <w:rPr>
+                  <w:rFonts w:ascii="Cambria Math" w:hAnsi="Cambria Math" w:cs="B Nazanin"/>
+                  <w:i/>
+                  <w:lang w:bidi="fa-IR"/>
+                </w:rPr>
+              </m:ctrlPr>
+            </m:sSubPr>
+            <m:e>
+              <m:r>
+                <w:rPr>
+                  <w:rFonts w:ascii="Cambria Math" w:hAnsi="Cambria Math" w:cs="B Nazanin"/>
+                  <w:lang w:bidi="fa-IR"/>
+                </w:rPr>
+                <m:t>Q</m:t>
+              </m:r>
+            </m:e>
+            <m:sub>
+              <m:r>
+                <w:rPr>
+                  <w:rFonts w:ascii="Cambria Math" w:hAnsi="Cambria Math" w:cs="B Nazanin"/>
+                  <w:lang w:bidi="fa-IR"/>
+                </w:rPr>
+                <m:t>3</m:t>
+              </m:r>
+            </m:sub>
+          </m:sSub>
+          <m:sSub>
+            <m:sSubPr>
+              <m:ctrlPr>
+                <w:rPr>
+                  <w:rFonts w:ascii="Cambria Math" w:hAnsi="Cambria Math" w:cs="B Nazanin"/>
+                  <w:i/>
+                  <w:lang w:bidi="fa-IR"/>
+                </w:rPr>
+              </m:ctrlPr>
+            </m:sSubPr>
+            <m:e>
+              <m:r>
+                <w:rPr>
+                  <w:rFonts w:ascii="Cambria Math" w:hAnsi="Cambria Math" w:cs="B Nazanin"/>
+                  <w:lang w:bidi="fa-IR"/>
+                </w:rPr>
+                <m:t>.Q</m:t>
+              </m:r>
+            </m:e>
+            <m:sub>
+              <m:r>
+                <w:rPr>
+                  <w:rFonts w:ascii="Cambria Math" w:hAnsi="Cambria Math" w:cs="B Nazanin"/>
+                  <w:lang w:bidi="fa-IR"/>
+                </w:rPr>
+                <m:t>2</m:t>
+              </m:r>
+            </m:sub>
+          </m:sSub>
+          <m:r>
+            <w:rPr>
+              <w:rFonts w:ascii="Cambria Math" w:hAnsi="Cambria Math" w:cs="B Nazanin"/>
+              <w:lang w:bidi="fa-IR"/>
+            </w:rPr>
+            <m:t>.</m:t>
+          </m:r>
+          <m:acc>
+            <m:accPr>
+              <m:chr m:val="̅"/>
+              <m:ctrlPr>
+                <w:rPr>
+                  <w:rFonts w:ascii="Cambria Math" w:hAnsi="Cambria Math" w:cs="B Nazanin"/>
+                  <w:i/>
+                  <w:lang w:bidi="fa-IR"/>
+                </w:rPr>
+              </m:ctrlPr>
+            </m:accPr>
+            <m:e>
+              <m:sSub>
+                <m:sSubPr>
+                  <m:ctrlPr>
+                    <w:rPr>
+                      <w:rFonts w:ascii="Cambria Math" w:hAnsi="Cambria Math" w:cs="B Nazanin"/>
+                      <w:i/>
+                      <w:lang w:bidi="fa-IR"/>
+                    </w:rPr>
+                  </m:ctrlPr>
+                </m:sSubPr>
+                <m:e>
+                  <m:r>
+                    <w:rPr>
+                      <w:rFonts w:ascii="Cambria Math" w:hAnsi="Cambria Math" w:cs="B Nazanin"/>
+                      <w:lang w:bidi="fa-IR"/>
+                    </w:rPr>
+                    <m:t>Q</m:t>
+                  </m:r>
+                </m:e>
+                <m:sub>
+                  <m:r>
+                    <w:rPr>
+                      <w:rFonts w:ascii="Cambria Math" w:hAnsi="Cambria Math" w:cs="B Nazanin"/>
+                      <w:lang w:bidi="fa-IR"/>
+                    </w:rPr>
+                    <m:t>1</m:t>
+                  </m:r>
+                </m:sub>
+              </m:sSub>
+            </m:e>
+          </m:acc>
+          <m:sSub>
+            <m:sSubPr>
+              <m:ctrlPr>
+                <w:rPr>
+                  <w:rFonts w:ascii="Cambria Math" w:hAnsi="Cambria Math" w:cs="B Nazanin"/>
+                  <w:i/>
+                  <w:lang w:bidi="fa-IR"/>
+                </w:rPr>
+              </m:ctrlPr>
+            </m:sSubPr>
+            <m:e>
+              <m:r>
+                <w:rPr>
+                  <w:rFonts w:ascii="Cambria Math" w:hAnsi="Cambria Math" w:cs="B Nazanin"/>
+                  <w:lang w:bidi="fa-IR"/>
+                </w:rPr>
+                <m:t>.Q</m:t>
+              </m:r>
+            </m:e>
+            <m:sub>
+              <m:r>
+                <w:rPr>
+                  <w:rFonts w:ascii="Cambria Math" w:hAnsi="Cambria Math" w:cs="B Nazanin"/>
+                  <w:lang w:bidi="fa-IR"/>
+                </w:rPr>
+                <m:t>0</m:t>
+              </m:r>
+            </m:sub>
+          </m:sSub>
+        </m:oMath>
+      </m:oMathPara>
+    </w:p>
+    <w:p>
+      <w:pPr>
+        <w:jc w:val="center"/>
+        <w:rPr>
+          <w:rFonts w:eastAsiaTheme="minorEastAsia" w:cs="B Nazanin"/>
+          <w:i/>
+          <w:lang w:bidi="fa-IR"/>
+        </w:rPr>
+      </w:pPr>
+      <m:oMathPara>
+        <m:oMathParaPr>
+          <m:jc m:val="left"/>
+        </m:oMathParaPr>
+        <m:oMath>
+          <m:r>
+            <w:rPr>
+              <w:rFonts w:ascii="Cambria Math" w:eastAsiaTheme="minorEastAsia" w:hAnsi="Cambria Math" w:cs="B Nazanin"/>
+              <w:lang w:bidi="fa-IR"/>
+            </w:rPr>
+            <m:t>=(</m:t>
+          </m:r>
+          <m:sSub>
+            <m:sSubPr>
+              <m:ctrlPr>
+                <w:rPr>
+                  <w:rFonts w:ascii="Cambria Math" w:hAnsi="Cambria Math" w:cs="B Nazanin"/>
+                  <w:i/>
+                  <w:lang w:bidi="fa-IR"/>
+                </w:rPr>
+              </m:ctrlPr>
+            </m:sSubPr>
+            <m:e>
+              <m:r>
+                <w:rPr>
+                  <w:rFonts w:ascii="Cambria Math" w:hAnsi="Cambria Math" w:cs="B Nazanin"/>
+                  <w:lang w:bidi="fa-IR"/>
+                </w:rPr>
+                <m:t>Q</m:t>
+              </m:r>
+            </m:e>
+            <m:sub>
+              <m:r>
+                <w:rPr>
+                  <w:rFonts w:ascii="Cambria Math" w:hAnsi="Cambria Math" w:cs="B Nazanin"/>
+                  <w:lang w:bidi="fa-IR"/>
+                </w:rPr>
+                <m:t>3</m:t>
+              </m:r>
+            </m:sub>
+          </m:sSub>
+          <m:r>
+            <w:rPr>
+              <w:rFonts w:ascii="Cambria Math" w:eastAsiaTheme="minorEastAsia" w:hAnsi="Cambria Math" w:cs="B Nazanin"/>
+              <w:lang w:bidi="fa-IR"/>
+            </w:rPr>
+            <m:t>⊙</m:t>
+          </m:r>
+          <m:sSub>
+            <m:sSubPr>
+              <m:ctrlPr>
+                <w:rPr>
+                  <w:rFonts w:ascii="Cambria Math" w:hAnsi="Cambria Math" w:cs="B Nazanin"/>
+                  <w:i/>
+                  <w:lang w:bidi="fa-IR"/>
+                </w:rPr>
+              </m:ctrlPr>
+            </m:sSubPr>
+            <m:e>
+              <m:r>
+                <w:rPr>
+                  <w:rFonts w:ascii="Cambria Math" w:hAnsi="Cambria Math" w:cs="B Nazanin"/>
+                  <w:lang w:bidi="fa-IR"/>
+                </w:rPr>
+                <m:t>Q</m:t>
+              </m:r>
+            </m:e>
+            <m:sub>
+              <m:r>
+                <w:rPr>
+                  <w:rFonts w:ascii="Cambria Math" w:hAnsi="Cambria Math" w:cs="B Nazanin"/>
+                  <w:lang w:bidi="fa-IR"/>
+                </w:rPr>
+                <m:t>2</m:t>
+              </m:r>
+            </m:sub>
+          </m:sSub>
+          <m:r>
+            <w:rPr>
+              <w:rFonts w:ascii="Cambria Math" w:eastAsiaTheme="minorEastAsia" w:hAnsi="Cambria Math" w:cs="B Nazanin"/>
+              <w:lang w:bidi="fa-IR"/>
+            </w:rPr>
+            <m:t>).(</m:t>
+          </m:r>
+          <m:sSub>
+            <m:sSubPr>
+              <m:ctrlPr>
+                <w:rPr>
+                  <w:rFonts w:ascii="Cambria Math" w:hAnsi="Cambria Math" w:cs="B Nazanin"/>
+                  <w:i/>
+                  <w:lang w:bidi="fa-IR"/>
+                </w:rPr>
+              </m:ctrlPr>
+            </m:sSubPr>
+            <m:e>
+              <m:r>
+                <w:rPr>
+                  <w:rFonts w:ascii="Cambria Math" w:hAnsi="Cambria Math" w:cs="B Nazanin"/>
+                  <w:lang w:bidi="fa-IR"/>
+                </w:rPr>
+                <m:t>Q</m:t>
+              </m:r>
+            </m:e>
+            <m:sub>
+              <m:r>
+                <w:rPr>
+                  <w:rFonts w:ascii="Cambria Math" w:hAnsi="Cambria Math" w:cs="B Nazanin"/>
+                  <w:lang w:bidi="fa-IR"/>
+                </w:rPr>
+                <m:t>1</m:t>
+              </m:r>
+            </m:sub>
+          </m:sSub>
+          <m:r>
+            <w:rPr>
+              <w:rFonts w:ascii="Cambria Math" w:eastAsiaTheme="minorEastAsia" w:hAnsi="Cambria Math" w:cs="B Nazanin"/>
+              <w:lang w:bidi="fa-IR"/>
+            </w:rPr>
+            <m:t>⊕</m:t>
+          </m:r>
+          <m:sSub>
+            <m:sSubPr>
+              <m:ctrlPr>
+                <w:rPr>
+                  <w:rFonts w:ascii="Cambria Math" w:hAnsi="Cambria Math" w:cs="B Nazanin"/>
+                  <w:i/>
+                  <w:lang w:bidi="fa-IR"/>
+                </w:rPr>
+              </m:ctrlPr>
+            </m:sSubPr>
+            <m:e>
+              <m:r>
+                <w:rPr>
+                  <w:rFonts w:ascii="Cambria Math" w:hAnsi="Cambria Math" w:cs="B Nazanin"/>
+                  <w:lang w:bidi="fa-IR"/>
+                </w:rPr>
+                <m:t>Q</m:t>
+              </m:r>
+            </m:e>
+            <m:sub>
+              <m:r>
+                <w:rPr>
+                  <w:rFonts w:ascii="Cambria Math" w:hAnsi="Cambria Math" w:cs="B Nazanin"/>
+                  <w:lang w:bidi="fa-IR"/>
+                </w:rPr>
+                <m:t>0</m:t>
+              </m:r>
+            </m:sub>
+          </m:sSub>
+          <m:r>
+            <w:rPr>
+              <w:rFonts w:ascii="Cambria Math" w:eastAsiaTheme="minorEastAsia" w:hAnsi="Cambria Math" w:cs="B Nazanin"/>
+              <w:lang w:bidi="fa-IR"/>
+            </w:rPr>
+            <m:t>)</m:t>
+          </m:r>
+        </m:oMath>
+      </m:oMathPara>
+    </w:p>
+    <w:p>
+      <w:pPr>
+        <w:bidi/>
+        <w:rPr>
+          <w:rFonts w:eastAsiaTheme="minorEastAsia" w:cs="B Nazanin" w:hint="cs"/>
+          <w:i/>
+          <w:rtl/>
+          <w:lang w:bidi="fa-IR"/>
+        </w:rPr>
+      </w:pPr>
+      <w:r>
+        <w:rPr>
+          <w:rFonts w:eastAsiaTheme="minorEastAsia" w:cs="B Nazanin" w:hint="cs"/>
+          <w:i/>
+          <w:rtl/>
+          <w:lang w:bidi="fa-IR"/>
+        </w:rPr>
+        <w:t xml:space="preserve">هرگاه </w:t>
+      </w:r>
+      <w:r>
+        <w:rPr>
+          <w:rFonts w:eastAsiaTheme="minorEastAsia" w:cs="B Nazanin"/>
+          <w:iCs/>
+          <w:lang w:bidi="fa-IR"/>
+        </w:rPr>
+        <w:t>S</w:t>
+      </w:r>
+      <w:r>
+        <w:rPr>
+          <w:rFonts w:eastAsiaTheme="minorEastAsia" w:cs="B Nazanin" w:hint="cs"/>
+          <w:iCs/>
+          <w:rtl/>
+          <w:lang w:bidi="fa-IR"/>
+        </w:rPr>
+        <w:t xml:space="preserve"> </w:t>
+      </w:r>
+      <w:r>
+        <w:rPr>
+          <w:rFonts w:eastAsiaTheme="minorEastAsia" w:cs="B Nazanin" w:hint="cs"/>
+          <w:i/>
+          <w:rtl/>
+          <w:lang w:bidi="fa-IR"/>
+        </w:rPr>
+        <w:t>برابر یک بود یعنی یکی از رشته‌های مد نظر در مدار دیده شده.</w:t>
+      </w:r>
+    </w:p>
+    <w:p>
+      <w:pPr>
+        <w:jc w:val="center"/>
+        <w:rPr>
+          <w:rFonts w:eastAsiaTheme="minorEastAsia" w:cs="B Nazanin"/>
+          <w:i/>
+          <w:lang w:bidi="fa-IR"/>
+        </w:rPr>
+      </w:pPr>
+      <w:r>
+        <w:rPr>
+          <w:rFonts w:eastAsiaTheme="minorEastAsia" w:cs="B Nazanin"/>
+          <w:i/>
+          <w:lang w:bidi="fa-IR"/>
+        </w:rPr>
         <w:drawing>
-          <wp:inline distT="0" distB="0" distL="0" distR="0" wp14:anchorId="52DC3494" wp14:editId="64DA02FB">
-            <wp:extent cx="5943600" cy="4984750"/>
-            <wp:effectExtent l="0" t="0" r="0" b="6350"/>
-            <wp:docPr id="1700406640" name="Picture 1"/>
+          <wp:inline distT="0" distB="0" distL="0" distR="0" wp14:anchorId="04B07E23" wp14:editId="00A2EBFA">
+            <wp:extent cx="4511040" cy="1683929"/>
+            <wp:effectExtent l="0" t="0" r="3810" b="0"/>
+            <wp:docPr id="176831411" name="Picture 1"/>
             <wp:cNvGraphicFramePr>
               <a:graphicFrameLocks xmlns:a="http://schemas.openxmlformats.org/drawingml/2006/main" noChangeAspect="1"/>
             </wp:cNvGraphicFramePr>
@@ -1596,11 +4747,11 @@
               <a:graphicData uri="http://schemas.openxmlformats.org/drawingml/2006/picture">
                 <pic:pic xmlns:pic="http://schemas.openxmlformats.org/drawingml/2006/picture">
                   <pic:nvPicPr>
-                    <pic:cNvPr id="1700406640" name=""/>
+                    <pic:cNvPr id="176831411" name=""/>
                     <pic:cNvPicPr/>
                   </pic:nvPicPr>
                   <pic:blipFill>
-                    <a:blip r:embed="rId10"/>
+                    <a:blip r:embed="rId21"/>
                     <a:stretch>
                       <a:fillRect/>
                     </a:stretch>
@@ -1608,7 +4759,7 @@
                   <pic:spPr>
                     <a:xfrm>
                       <a:off x="0" y="0"/>
-                      <a:ext cx="5943600" cy="4984750"/>
+                      <a:ext cx="4528641" cy="1690499"/>
                     </a:xfrm>
                     <a:prstGeom prst="rect">
                       <a:avLst/>
@@ -1623,363 +4774,19 @@
     </w:p>
     <w:p>
       <w:pPr>
-        <w:pStyle w:val="Caption"/>
         <w:jc w:val="center"/>
-      </w:pPr>
-      <w:r>
-        <w:rPr>
-          <w:rFonts w:hint="cs"/>
-          <w:rtl/>
-          <w:lang w:bidi="fa-IR"/>
-        </w:rPr>
-        <w:t>شکل 3-1 شیفت دادن مدار به راست</w:t>
-      </w:r>
-    </w:p>
-    <w:p>
-      <w:pPr>
-        <w:jc w:val="right"/>
-      </w:pPr>
-      <w:r>
-        <w:t xml:space="preserve"> </w:t>
-      </w:r>
-      <w:r>
-        <w:br w:type="page"/>
-      </w:r>
-    </w:p>
-    <w:p>
-      <w:pPr>
-        <w:bidi/>
-        <w:rPr>
-          <w:rFonts w:cs="B Yekan"/>
-          <w:sz w:val="28"/>
-          <w:szCs w:val="28"/>
-          <w:rtl/>
-          <w:lang w:bidi="fa-IR"/>
-        </w:rPr>
-      </w:pPr>
-      <w:r>
-        <w:rPr>
-          <w:rFonts w:cs="B Yekan" w:hint="cs"/>
-          <w:sz w:val="28"/>
-          <w:szCs w:val="28"/>
-          <w:rtl/>
-          <w:lang w:bidi="fa-IR"/>
-        </w:rPr>
-        <w:lastRenderedPageBreak/>
-        <w:t xml:space="preserve">بخش </w:t>
-      </w:r>
-      <w:r>
-        <w:rPr>
-          <w:rFonts w:cs="B Yekan" w:hint="cs"/>
-          <w:sz w:val="28"/>
-          <w:szCs w:val="28"/>
-          <w:rtl/>
-          <w:lang w:bidi="fa-IR"/>
-        </w:rPr>
-        <w:t>چهارم</w:t>
-      </w:r>
-      <w:r>
-        <w:rPr>
-          <w:rFonts w:cs="B Yekan" w:hint="cs"/>
-          <w:sz w:val="28"/>
-          <w:szCs w:val="28"/>
-          <w:rtl/>
-          <w:lang w:bidi="fa-IR"/>
-        </w:rPr>
-        <w:t>:</w:t>
-      </w:r>
-    </w:p>
-    <w:p>
-      <w:pPr>
-        <w:bidi/>
-        <w:rPr>
-          <w:rFonts w:cs="B Yekan"/>
-          <w:sz w:val="28"/>
-          <w:szCs w:val="28"/>
-          <w:rtl/>
-          <w:lang w:bidi="fa-IR"/>
-        </w:rPr>
-      </w:pPr>
-      <w:r>
-        <w:rPr>
-          <w:rFonts w:cs="B Yekan" w:hint="cs"/>
-          <w:sz w:val="28"/>
-          <w:szCs w:val="28"/>
-          <w:rtl/>
-          <w:lang w:bidi="fa-IR"/>
-        </w:rPr>
-        <w:t>تبدیل مدار به شیفت رجیستر دو طرفه</w:t>
-      </w:r>
-      <w:r>
-        <w:rPr>
-          <w:rFonts w:cs="B Yekan" w:hint="cs"/>
-          <w:sz w:val="28"/>
-          <w:szCs w:val="28"/>
-          <w:rtl/>
-          <w:lang w:bidi="fa-IR"/>
-        </w:rPr>
-        <w:t>:</w:t>
-      </w:r>
-    </w:p>
-    <w:p>
-      <w:pPr>
-        <w:bidi/>
-        <w:rPr>
-          <w:rtl/>
-          <w:lang w:bidi="fa-IR"/>
-        </w:rPr>
-      </w:pPr>
-      <w:r>
-        <w:rPr>
-          <w:rFonts w:cs="B Nazanin" w:hint="cs"/>
-          <w:rtl/>
-          <w:lang w:bidi="fa-IR"/>
-        </w:rPr>
-        <w:t xml:space="preserve">به دلیل اینکه دیگر مدار قابلیت بارگذاری موازی را ندارد پس ورودی های </w:t>
-      </w:r>
-      <w:r>
-        <w:rPr>
-          <w:rFonts w:cs="B Nazanin"/>
-          <w:lang w:bidi="fa-IR"/>
-        </w:rPr>
-        <w:t>A</w:t>
-      </w:r>
-      <w:r>
-        <w:rPr>
-          <w:rFonts w:cs="B Nazanin" w:hint="cs"/>
-          <w:rtl/>
-          <w:lang w:bidi="fa-IR"/>
-        </w:rPr>
-        <w:t xml:space="preserve"> تا</w:t>
-      </w:r>
-      <w:r>
-        <w:rPr>
-          <w:rFonts w:cs="B Nazanin"/>
-          <w:lang w:bidi="fa-IR"/>
-        </w:rPr>
-        <w:t xml:space="preserve">D </w:t>
-      </w:r>
-      <w:r>
-        <w:rPr>
-          <w:rFonts w:hint="cs"/>
-          <w:rtl/>
-          <w:lang w:bidi="fa-IR"/>
-        </w:rPr>
-        <w:t xml:space="preserve"> را از مدار جدا می کنیم.</w:t>
-      </w:r>
-      <w:r>
-        <w:rPr>
-          <w:rFonts w:hint="cs"/>
-          <w:rtl/>
-          <w:lang w:bidi="fa-IR"/>
-        </w:rPr>
-        <w:t xml:space="preserve"> می دانیم وقتی بیت مود برابر صفر باشد گیت های </w:t>
-      </w:r>
-      <w:r>
-        <w:rPr>
-          <w:lang w:bidi="fa-IR"/>
-        </w:rPr>
-        <w:t xml:space="preserve">AND </w:t>
-      </w:r>
-      <w:r>
-        <w:rPr>
-          <w:rFonts w:hint="cs"/>
-          <w:rtl/>
-          <w:lang w:bidi="fa-IR"/>
-        </w:rPr>
-        <w:t xml:space="preserve"> پایین فعال هستند پس به هر کدام از این گیت ها خروجی فلیپ فلاپ بالایی را متصل می کنیم ،چون بیت کم ارزش فلیپ فلاپی قبل از خود ندارد ، در این مورد از ورودی </w:t>
-      </w:r>
-      <w:proofErr w:type="spellStart"/>
-      <w:r>
-        <w:rPr>
-          <w:lang w:bidi="fa-IR"/>
-        </w:rPr>
-        <w:t>s_in</w:t>
-      </w:r>
-      <w:proofErr w:type="spellEnd"/>
-      <w:r>
-        <w:rPr>
-          <w:rFonts w:hint="cs"/>
-          <w:rtl/>
-          <w:lang w:bidi="fa-IR"/>
-        </w:rPr>
-        <w:t xml:space="preserve"> استفاده می کنیم.</w:t>
-      </w:r>
-    </w:p>
-    <w:p>
-      <w:pPr>
-        <w:bidi/>
-        <w:rPr>
-          <w:rFonts w:hint="cs"/>
-          <w:rtl/>
-          <w:lang w:bidi="fa-IR"/>
-        </w:rPr>
-      </w:pPr>
-      <w:r>
-        <w:rPr>
-          <w:rFonts w:hint="cs"/>
-          <w:rtl/>
-          <w:lang w:bidi="fa-IR"/>
-        </w:rPr>
-        <w:t xml:space="preserve"> در این حالت هنگامی که بیت مود برابر صفر است ، شیفت به چپ اتفاق می افتد که شکل کلی مدار در شکل 4-1 مشخص است .</w:t>
-      </w:r>
-    </w:p>
-    <w:p/>
-    <w:p/>
-    <w:p>
-      <w:r>
-        <w:br w:type="page"/>
-      </w:r>
-    </w:p>
-    <w:p/>
-    <w:p>
-      <w:r>
-        <w:br w:type="page"/>
-      </w:r>
-    </w:p>
-    <w:p/>
-    <w:p>
-      <w:r>
-        <w:br w:type="page"/>
-      </w:r>
-    </w:p>
-    <w:p/>
-    <w:p>
-      <w:r>
-        <w:br w:type="page"/>
-      </w:r>
-    </w:p>
-    <w:p/>
-    <w:p>
-      <w:pPr>
-        <w:rPr>
-          <w:rtl/>
-        </w:rPr>
-      </w:pPr>
-    </w:p>
-    <w:p>
-      <w:pPr>
-        <w:rPr>
-          <w:rtl/>
-        </w:rPr>
-      </w:pPr>
-    </w:p>
-    <w:p>
-      <w:pPr>
-        <w:rPr>
-          <w:rtl/>
-        </w:rPr>
-      </w:pPr>
-    </w:p>
-    <w:p/>
-    <w:p>
-      <w:r>
-        <w:br w:type="page"/>
-      </w:r>
-    </w:p>
-    <w:p/>
-    <w:p>
-      <w:r>
-        <w:br w:type="page"/>
-      </w:r>
-    </w:p>
-    <w:p>
-      <w:pPr>
-        <w:rPr>
-          <w:rtl/>
-        </w:rPr>
-      </w:pPr>
-    </w:p>
-    <w:p>
-      <w:pPr>
-        <w:rPr>
-          <w:rtl/>
-        </w:rPr>
-      </w:pPr>
-    </w:p>
-    <w:p>
-      <w:pPr>
-        <w:rPr>
-          <w:rtl/>
-        </w:rPr>
-      </w:pPr>
-    </w:p>
-    <w:p>
-      <w:pPr>
-        <w:rPr>
-          <w:rtl/>
-        </w:rPr>
-      </w:pPr>
-    </w:p>
-    <w:p/>
-    <w:p>
-      <w:pPr>
-        <w:tabs>
-          <w:tab w:val="left" w:pos="2096"/>
-        </w:tabs>
-        <w:jc w:val="center"/>
-        <w:rPr>
-          <w:rtl/>
-          <w:lang w:bidi="fa-IR"/>
-        </w:rPr>
-      </w:pPr>
-    </w:p>
-    <w:p>
-      <w:pPr>
-        <w:bidi/>
-        <w:rPr>
-          <w:rFonts w:cs="B Yekan"/>
-          <w:rtl/>
-          <w:lang w:bidi="fa-IR"/>
-        </w:rPr>
-      </w:pPr>
-      <w:r>
-        <w:br w:type="page"/>
-      </w:r>
-    </w:p>
-    <w:p>
-      <w:pPr>
-        <w:jc w:val="right"/>
-        <w:rPr>
-          <w:lang w:bidi="fa-IR"/>
-        </w:rPr>
-      </w:pPr>
-    </w:p>
-    <w:p>
-      <w:pPr>
-        <w:pStyle w:val="Caption"/>
-        <w:keepNext/>
-        <w:rPr>
-          <w:lang w:bidi="fa-IR"/>
-        </w:rPr>
-      </w:pPr>
-    </w:p>
-    <w:p>
-      <w:pPr>
-        <w:bidi/>
-        <w:spacing w:after="60" w:line="240" w:lineRule="auto"/>
-        <w:rPr>
-          <w:rFonts w:eastAsiaTheme="minorEastAsia" w:cs="B Yekan"/>
-          <w:lang w:bidi="fa-IR"/>
-        </w:rPr>
-      </w:pPr>
-    </w:p>
-    <w:p>
-      <w:pPr>
-        <w:bidi/>
-        <w:spacing w:after="60" w:line="240" w:lineRule="auto"/>
-        <w:jc w:val="center"/>
-        <w:rPr>
-          <w:rFonts w:cs="B Yekan"/>
+        <w:rPr>
+          <w:rFonts w:eastAsiaTheme="minorEastAsia" w:cs="B Nazanin" w:hint="cs"/>
+          <w:i/>
           <w:rtl/>
           <w:lang w:bidi="fa-IR"/>
         </w:rPr>
       </w:pPr>
     </w:p>
     <w:sectPr>
-      <w:headerReference w:type="even" r:id="rId11"/>
-      <w:headerReference w:type="default" r:id="rId12"/>
-      <w:headerReference w:type="first" r:id="rId13"/>
+      <w:headerReference w:type="even" r:id="rId22"/>
+      <w:headerReference w:type="default" r:id="rId23"/>
+      <w:headerReference w:type="first" r:id="rId24"/>
       <w:pgSz w:w="12240" w:h="15840"/>
       <w:pgMar w:top="1440" w:right="1440" w:bottom="1440" w:left="1440" w:header="720" w:footer="720" w:gutter="0"/>
       <w:pgBorders w:offsetFrom="page">
@@ -3127,7 +5934,7 @@
   <w:style w:type="paragraph" w:default="1" w:styleId="Normal">
     <w:name w:val="Normal"/>
     <w:qFormat/>
-    <w:rsid w:val="00F53678"/>
+    <w:rsid w:val="00E12C9A"/>
   </w:style>
   <w:style w:type="paragraph" w:styleId="Heading1">
     <w:name w:val="heading 1"/>
@@ -4053,4 +6860,16 @@
     </a:ext>
   </a:extLst>
 </a:theme>
+</file>
+
+<file path=customXml/item1.xml><?xml version="1.0" encoding="utf-8"?>
+<b:Sources xmlns:b="http://schemas.openxmlformats.org/officeDocument/2006/bibliography" xmlns="http://schemas.openxmlformats.org/officeDocument/2006/bibliography" SelectedStyle="\APASixthEditionOfficeOnline.xsl" StyleName="APA" Version="6"/>
+</file>
+
+<file path=customXml/itemProps1.xml><?xml version="1.0" encoding="utf-8"?>
+<ds:datastoreItem xmlns:ds="http://schemas.openxmlformats.org/officeDocument/2006/customXml" ds:itemID="{F139C92F-248C-40DA-9FFD-C80408C86C68}">
+  <ds:schemaRefs>
+    <ds:schemaRef ds:uri="http://schemas.openxmlformats.org/officeDocument/2006/bibliography"/>
+  </ds:schemaRefs>
+</ds:datastoreItem>
 </file>
</xml_diff>